<commit_message>
vault backup: 2026-10-13 13:51:35
</commit_message>
<xml_diff>
--- a/ПРЕДМЕТЫ/Архитектура предприятий и корпоративных информационных систем/Лабы/Лаба 1/Поповкин. Лабораторная работа 1.docx
+++ b/ПРЕДМЕТЫ/Архитектура предприятий и корпоративных информационных систем/Лабы/Лаба 1/Поповкин. Лабораторная работа 1.docx
@@ -7787,7 +7787,7 @@
     </w:p>
     <w:p>
       <w:r>
-        <w:t>Процесс «Ремонт» был декомпозирован на три последовательных этапа (Таблицы 9 и 10):</w:t>
+        <w:t>Процесс «Ремонт» был декомпозирован на три последовательных этапа:</w:t>
       </w:r>
     </w:p>
     <w:p>
@@ -7833,298 +7833,2288 @@
       </w:r>
     </w:p>
     <w:p>
-      <w:r>
-        <w:t>Управляющими воздействиями выступают внутренние регламенты диагностики, проведения ремонта в мастерской и оценки качества.</w:t>
+      <w:pPr>
+        <w:rPr>
+          <w:szCs w:val="28"/>
+          <w:lang w:val="en-US"/>
+        </w:rPr>
+      </w:pPr>
+      <w:r>
+        <w:t>Управляющими воздействиями выступают внутренние регламенты д</w:t>
+      </w:r>
+      <w:r>
+        <w:rPr>
+          <w:szCs w:val="28"/>
+        </w:rPr>
+        <w:t>иагностики, проведения ремонта в мастерской и оценки качества.</w:t>
       </w:r>
     </w:p>
     <w:p>
       <w:pPr>
-        <w:pStyle w:val="21"/>
+        <w:pStyle w:val="ae"/>
+        <w:rPr>
+          <w:rFonts w:eastAsia="MS Mincho"/>
+        </w:rPr>
       </w:pPr>
       <w:r>
-        <w:t>5.4. Декомпозиция диагностирования проблемы (</w:t>
-      </w:r>
-      <w:r>
+        <w:t>Таблица 9 – Процессы диаграммы A3 «Ремонт компьютерной техники»</w:t>
+      </w:r>
+    </w:p>
+    <w:tbl>
+      <w:tblPr>
+        <w:tblStyle w:val="22"/>
+        <w:tblW w:w="0" w:type="auto"/>
+        <w:jc w:val="center"/>
+        <w:tblInd w:w="0" w:type="dxa"/>
+        <w:tblLook w:val="04A0" w:firstRow="1" w:lastRow="0" w:firstColumn="1" w:lastColumn="0" w:noHBand="0" w:noVBand="1"/>
+      </w:tblPr>
+      <w:tblGrid>
+        <w:gridCol w:w="3213"/>
+        <w:gridCol w:w="3213"/>
+        <w:gridCol w:w="3213"/>
+      </w:tblGrid>
+      <w:tr>
+        <w:trPr>
+          <w:jc w:val="center"/>
+        </w:trPr>
+        <w:tc>
+          <w:tcPr>
+            <w:tcW w:w="3213" w:type="dxa"/>
+            <w:tcBorders>
+              <w:top w:val="single" w:sz="4" w:space="0" w:color="auto"/>
+              <w:left w:val="single" w:sz="4" w:space="0" w:color="auto"/>
+              <w:bottom w:val="single" w:sz="4" w:space="0" w:color="auto"/>
+              <w:right w:val="single" w:sz="4" w:space="0" w:color="auto"/>
+            </w:tcBorders>
+            <w:vAlign w:val="center"/>
+            <w:hideMark/>
+          </w:tcPr>
+          <w:p>
+            <w:pPr>
+              <w:spacing w:after="160" w:line="256" w:lineRule="auto"/>
+              <w:ind w:firstLine="0"/>
+              <w:contextualSpacing w:val="0"/>
+              <w:rPr>
+                <w:rFonts w:ascii="Times New Roman" w:hAnsi="Times New Roman" w:cs="Times New Roman"/>
+                <w:szCs w:val="28"/>
+              </w:rPr>
+            </w:pPr>
+            <w:r>
+              <w:rPr>
+                <w:rFonts w:ascii="Times New Roman" w:hAnsi="Times New Roman" w:cs="Times New Roman"/>
+                <w:b/>
+                <w:szCs w:val="28"/>
+              </w:rPr>
+              <w:t>№</w:t>
+            </w:r>
+          </w:p>
+        </w:tc>
+        <w:tc>
+          <w:tcPr>
+            <w:tcW w:w="3213" w:type="dxa"/>
+            <w:tcBorders>
+              <w:top w:val="single" w:sz="4" w:space="0" w:color="auto"/>
+              <w:left w:val="single" w:sz="4" w:space="0" w:color="auto"/>
+              <w:bottom w:val="single" w:sz="4" w:space="0" w:color="auto"/>
+              <w:right w:val="single" w:sz="4" w:space="0" w:color="auto"/>
+            </w:tcBorders>
+            <w:vAlign w:val="center"/>
+            <w:hideMark/>
+          </w:tcPr>
+          <w:p>
+            <w:pPr>
+              <w:spacing w:after="160" w:line="256" w:lineRule="auto"/>
+              <w:ind w:firstLine="0"/>
+              <w:contextualSpacing w:val="0"/>
+              <w:rPr>
+                <w:rFonts w:ascii="Times New Roman" w:hAnsi="Times New Roman" w:cs="Times New Roman"/>
+                <w:szCs w:val="28"/>
+              </w:rPr>
+            </w:pPr>
+            <w:r>
+              <w:rPr>
+                <w:rFonts w:ascii="Times New Roman" w:hAnsi="Times New Roman" w:cs="Times New Roman"/>
+                <w:b/>
+                <w:szCs w:val="28"/>
+              </w:rPr>
+              <w:t>Наименование</w:t>
+            </w:r>
+          </w:p>
+        </w:tc>
+        <w:tc>
+          <w:tcPr>
+            <w:tcW w:w="3213" w:type="dxa"/>
+            <w:tcBorders>
+              <w:top w:val="single" w:sz="4" w:space="0" w:color="auto"/>
+              <w:left w:val="single" w:sz="4" w:space="0" w:color="auto"/>
+              <w:bottom w:val="single" w:sz="4" w:space="0" w:color="auto"/>
+              <w:right w:val="single" w:sz="4" w:space="0" w:color="auto"/>
+            </w:tcBorders>
+            <w:vAlign w:val="center"/>
+            <w:hideMark/>
+          </w:tcPr>
+          <w:p>
+            <w:pPr>
+              <w:spacing w:after="160" w:line="256" w:lineRule="auto"/>
+              <w:ind w:firstLine="0"/>
+              <w:contextualSpacing w:val="0"/>
+              <w:rPr>
+                <w:rFonts w:ascii="Times New Roman" w:hAnsi="Times New Roman" w:cs="Times New Roman"/>
+                <w:szCs w:val="28"/>
+              </w:rPr>
+            </w:pPr>
+            <w:r>
+              <w:rPr>
+                <w:rFonts w:ascii="Times New Roman" w:hAnsi="Times New Roman" w:cs="Times New Roman"/>
+                <w:b/>
+                <w:szCs w:val="28"/>
+              </w:rPr>
+              <w:t>Описание (назначение)</w:t>
+            </w:r>
+          </w:p>
+        </w:tc>
+      </w:tr>
+      <w:tr>
+        <w:trPr>
+          <w:jc w:val="center"/>
+        </w:trPr>
+        <w:tc>
+          <w:tcPr>
+            <w:tcW w:w="3207" w:type="dxa"/>
+            <w:tcBorders>
+              <w:top w:val="single" w:sz="4" w:space="0" w:color="auto"/>
+              <w:left w:val="single" w:sz="4" w:space="0" w:color="auto"/>
+              <w:bottom w:val="single" w:sz="4" w:space="0" w:color="auto"/>
+              <w:right w:val="single" w:sz="4" w:space="0" w:color="auto"/>
+            </w:tcBorders>
+            <w:hideMark/>
+          </w:tcPr>
+          <w:p>
+            <w:pPr>
+              <w:spacing w:after="160" w:line="256" w:lineRule="auto"/>
+              <w:ind w:firstLine="0"/>
+              <w:contextualSpacing w:val="0"/>
+              <w:rPr>
+                <w:rFonts w:ascii="Times New Roman" w:hAnsi="Times New Roman" w:cs="Times New Roman"/>
+                <w:szCs w:val="28"/>
+              </w:rPr>
+            </w:pPr>
+            <w:r>
+              <w:rPr>
+                <w:rFonts w:ascii="Times New Roman" w:hAnsi="Times New Roman" w:cs="Times New Roman"/>
+                <w:szCs w:val="28"/>
+              </w:rPr>
+              <w:t>A3.1</w:t>
+            </w:r>
+          </w:p>
+        </w:tc>
+        <w:tc>
+          <w:tcPr>
+            <w:tcW w:w="3211" w:type="dxa"/>
+            <w:tcBorders>
+              <w:top w:val="single" w:sz="4" w:space="0" w:color="auto"/>
+              <w:left w:val="single" w:sz="4" w:space="0" w:color="auto"/>
+              <w:bottom w:val="single" w:sz="4" w:space="0" w:color="auto"/>
+              <w:right w:val="single" w:sz="4" w:space="0" w:color="auto"/>
+            </w:tcBorders>
+            <w:hideMark/>
+          </w:tcPr>
+          <w:p>
+            <w:pPr>
+              <w:spacing w:after="160" w:line="256" w:lineRule="auto"/>
+              <w:ind w:firstLine="0"/>
+              <w:contextualSpacing w:val="0"/>
+              <w:rPr>
+                <w:rFonts w:ascii="Times New Roman" w:hAnsi="Times New Roman" w:cs="Times New Roman"/>
+                <w:szCs w:val="28"/>
+              </w:rPr>
+            </w:pPr>
+            <w:r>
+              <w:rPr>
+                <w:rFonts w:ascii="Times New Roman" w:hAnsi="Times New Roman" w:cs="Times New Roman"/>
+                <w:szCs w:val="28"/>
+              </w:rPr>
+              <w:t>Диагностирование проблемы</w:t>
+            </w:r>
+          </w:p>
+        </w:tc>
+        <w:tc>
+          <w:tcPr>
+            <w:tcW w:w="3211" w:type="dxa"/>
+            <w:tcBorders>
+              <w:top w:val="single" w:sz="4" w:space="0" w:color="auto"/>
+              <w:left w:val="single" w:sz="4" w:space="0" w:color="auto"/>
+              <w:bottom w:val="single" w:sz="4" w:space="0" w:color="auto"/>
+              <w:right w:val="single" w:sz="4" w:space="0" w:color="auto"/>
+            </w:tcBorders>
+            <w:hideMark/>
+          </w:tcPr>
+          <w:p>
+            <w:pPr>
+              <w:spacing w:after="160" w:line="256" w:lineRule="auto"/>
+              <w:ind w:firstLine="0"/>
+              <w:contextualSpacing w:val="0"/>
+              <w:rPr>
+                <w:rFonts w:ascii="Times New Roman" w:hAnsi="Times New Roman" w:cs="Times New Roman"/>
+                <w:szCs w:val="28"/>
+              </w:rPr>
+            </w:pPr>
+            <w:r>
+              <w:rPr>
+                <w:rFonts w:ascii="Times New Roman" w:hAnsi="Times New Roman" w:cs="Times New Roman"/>
+                <w:szCs w:val="28"/>
+              </w:rPr>
+              <w:t>Определить неисправность и способ дальнейшего обслуживания.</w:t>
+            </w:r>
+          </w:p>
+        </w:tc>
+      </w:tr>
+      <w:tr>
+        <w:trPr>
+          <w:jc w:val="center"/>
+        </w:trPr>
+        <w:tc>
+          <w:tcPr>
+            <w:tcW w:w="3207" w:type="dxa"/>
+            <w:tcBorders>
+              <w:top w:val="single" w:sz="4" w:space="0" w:color="auto"/>
+              <w:left w:val="single" w:sz="4" w:space="0" w:color="auto"/>
+              <w:bottom w:val="single" w:sz="4" w:space="0" w:color="auto"/>
+              <w:right w:val="single" w:sz="4" w:space="0" w:color="auto"/>
+            </w:tcBorders>
+            <w:hideMark/>
+          </w:tcPr>
+          <w:p>
+            <w:pPr>
+              <w:spacing w:after="160" w:line="256" w:lineRule="auto"/>
+              <w:ind w:firstLine="0"/>
+              <w:contextualSpacing w:val="0"/>
+              <w:rPr>
+                <w:rFonts w:ascii="Times New Roman" w:hAnsi="Times New Roman" w:cs="Times New Roman"/>
+                <w:szCs w:val="28"/>
+              </w:rPr>
+            </w:pPr>
+            <w:r>
+              <w:rPr>
+                <w:rFonts w:ascii="Times New Roman" w:hAnsi="Times New Roman" w:cs="Times New Roman"/>
+                <w:szCs w:val="28"/>
+              </w:rPr>
+              <w:lastRenderedPageBreak/>
+              <w:t>A3.2</w:t>
+            </w:r>
+          </w:p>
+        </w:tc>
+        <w:tc>
+          <w:tcPr>
+            <w:tcW w:w="3211" w:type="dxa"/>
+            <w:tcBorders>
+              <w:top w:val="single" w:sz="4" w:space="0" w:color="auto"/>
+              <w:left w:val="single" w:sz="4" w:space="0" w:color="auto"/>
+              <w:bottom w:val="single" w:sz="4" w:space="0" w:color="auto"/>
+              <w:right w:val="single" w:sz="4" w:space="0" w:color="auto"/>
+            </w:tcBorders>
+            <w:hideMark/>
+          </w:tcPr>
+          <w:p>
+            <w:pPr>
+              <w:spacing w:after="160" w:line="256" w:lineRule="auto"/>
+              <w:ind w:firstLine="0"/>
+              <w:contextualSpacing w:val="0"/>
+              <w:rPr>
+                <w:rFonts w:ascii="Times New Roman" w:hAnsi="Times New Roman" w:cs="Times New Roman"/>
+                <w:szCs w:val="28"/>
+              </w:rPr>
+            </w:pPr>
+            <w:r>
+              <w:rPr>
+                <w:rFonts w:ascii="Times New Roman" w:hAnsi="Times New Roman" w:cs="Times New Roman"/>
+                <w:szCs w:val="28"/>
+              </w:rPr>
+              <w:t>Починка устройства</w:t>
+            </w:r>
+          </w:p>
+        </w:tc>
+        <w:tc>
+          <w:tcPr>
+            <w:tcW w:w="3211" w:type="dxa"/>
+            <w:tcBorders>
+              <w:top w:val="single" w:sz="4" w:space="0" w:color="auto"/>
+              <w:left w:val="single" w:sz="4" w:space="0" w:color="auto"/>
+              <w:bottom w:val="single" w:sz="4" w:space="0" w:color="auto"/>
+              <w:right w:val="single" w:sz="4" w:space="0" w:color="auto"/>
+            </w:tcBorders>
+            <w:hideMark/>
+          </w:tcPr>
+          <w:p>
+            <w:pPr>
+              <w:spacing w:after="160" w:line="256" w:lineRule="auto"/>
+              <w:ind w:firstLine="0"/>
+              <w:contextualSpacing w:val="0"/>
+              <w:rPr>
+                <w:rFonts w:ascii="Times New Roman" w:hAnsi="Times New Roman" w:cs="Times New Roman"/>
+                <w:szCs w:val="28"/>
+              </w:rPr>
+            </w:pPr>
+            <w:r>
+              <w:rPr>
+                <w:rFonts w:ascii="Times New Roman" w:hAnsi="Times New Roman" w:cs="Times New Roman"/>
+                <w:szCs w:val="28"/>
+              </w:rPr>
+              <w:t>Устранить выявленную неисправность.</w:t>
+            </w:r>
+          </w:p>
+        </w:tc>
+      </w:tr>
+      <w:tr>
+        <w:trPr>
+          <w:jc w:val="center"/>
+        </w:trPr>
+        <w:tc>
+          <w:tcPr>
+            <w:tcW w:w="3207" w:type="dxa"/>
+            <w:tcBorders>
+              <w:top w:val="single" w:sz="4" w:space="0" w:color="auto"/>
+              <w:left w:val="single" w:sz="4" w:space="0" w:color="auto"/>
+              <w:bottom w:val="single" w:sz="4" w:space="0" w:color="auto"/>
+              <w:right w:val="single" w:sz="4" w:space="0" w:color="auto"/>
+            </w:tcBorders>
+            <w:hideMark/>
+          </w:tcPr>
+          <w:p>
+            <w:pPr>
+              <w:spacing w:after="160" w:line="256" w:lineRule="auto"/>
+              <w:ind w:firstLine="0"/>
+              <w:contextualSpacing w:val="0"/>
+              <w:rPr>
+                <w:rFonts w:ascii="Times New Roman" w:hAnsi="Times New Roman" w:cs="Times New Roman"/>
+                <w:szCs w:val="28"/>
+              </w:rPr>
+            </w:pPr>
+            <w:r>
+              <w:rPr>
+                <w:rFonts w:ascii="Times New Roman" w:hAnsi="Times New Roman" w:cs="Times New Roman"/>
+                <w:szCs w:val="28"/>
+              </w:rPr>
+              <w:t>A3.3</w:t>
+            </w:r>
+          </w:p>
+        </w:tc>
+        <w:tc>
+          <w:tcPr>
+            <w:tcW w:w="3211" w:type="dxa"/>
+            <w:tcBorders>
+              <w:top w:val="single" w:sz="4" w:space="0" w:color="auto"/>
+              <w:left w:val="single" w:sz="4" w:space="0" w:color="auto"/>
+              <w:bottom w:val="single" w:sz="4" w:space="0" w:color="auto"/>
+              <w:right w:val="single" w:sz="4" w:space="0" w:color="auto"/>
+            </w:tcBorders>
+            <w:hideMark/>
+          </w:tcPr>
+          <w:p>
+            <w:pPr>
+              <w:spacing w:after="160" w:line="256" w:lineRule="auto"/>
+              <w:ind w:firstLine="0"/>
+              <w:contextualSpacing w:val="0"/>
+              <w:rPr>
+                <w:rFonts w:ascii="Times New Roman" w:hAnsi="Times New Roman" w:cs="Times New Roman"/>
+                <w:szCs w:val="28"/>
+              </w:rPr>
+            </w:pPr>
+            <w:r>
+              <w:rPr>
+                <w:rFonts w:ascii="Times New Roman" w:hAnsi="Times New Roman" w:cs="Times New Roman"/>
+                <w:szCs w:val="28"/>
+              </w:rPr>
+              <w:t>Выходное тестирование</w:t>
+            </w:r>
+          </w:p>
+        </w:tc>
+        <w:tc>
+          <w:tcPr>
+            <w:tcW w:w="3211" w:type="dxa"/>
+            <w:tcBorders>
+              <w:top w:val="single" w:sz="4" w:space="0" w:color="auto"/>
+              <w:left w:val="single" w:sz="4" w:space="0" w:color="auto"/>
+              <w:bottom w:val="single" w:sz="4" w:space="0" w:color="auto"/>
+              <w:right w:val="single" w:sz="4" w:space="0" w:color="auto"/>
+            </w:tcBorders>
+            <w:hideMark/>
+          </w:tcPr>
+          <w:p>
+            <w:pPr>
+              <w:spacing w:after="160" w:line="256" w:lineRule="auto"/>
+              <w:ind w:firstLine="0"/>
+              <w:contextualSpacing w:val="0"/>
+              <w:rPr>
+                <w:rFonts w:ascii="Times New Roman" w:hAnsi="Times New Roman" w:cs="Times New Roman"/>
+                <w:szCs w:val="28"/>
+              </w:rPr>
+            </w:pPr>
+            <w:r>
+              <w:rPr>
+                <w:rFonts w:ascii="Times New Roman" w:hAnsi="Times New Roman" w:cs="Times New Roman"/>
+                <w:szCs w:val="28"/>
+              </w:rPr>
+              <w:t>Проверить устройство после ремонта.</w:t>
+            </w:r>
+          </w:p>
+        </w:tc>
+      </w:tr>
+    </w:tbl>
+    <w:p>
+      <w:pPr>
+        <w:suppressAutoHyphens/>
+        <w:spacing w:after="160" w:line="256" w:lineRule="auto"/>
+        <w:ind w:firstLine="0"/>
+        <w:contextualSpacing w:val="0"/>
         <w:rPr>
-          <w:lang w:val="en-US"/>
+          <w:rFonts w:eastAsia="MS Mincho"/>
+          <w:szCs w:val="28"/>
+          <w:lang w:eastAsia="en-US"/>
         </w:rPr>
-        <w:t>A</w:t>
-      </w:r>
-      <w:r>
-        <w:t>3.1)</w:t>
-      </w:r>
-    </w:p>
-    <w:p>
-      <w:r>
-        <w:t>Процесс диагностики разделен на три блока (Таблицы 11 и 12):</w:t>
-      </w:r>
-    </w:p>
-    <w:p>
-      <w:r>
-        <w:t>Определение запроса клиента (</w:t>
-      </w:r>
-      <w:r>
-        <w:rPr>
-          <w:lang w:val="en-US"/>
-        </w:rPr>
-        <w:t>A</w:t>
-      </w:r>
-      <w:r>
-        <w:t>3.1.1) – анализ необходимого формата диагностики (выездная или локальная).</w:t>
-      </w:r>
-    </w:p>
-    <w:p>
-      <w:r>
-        <w:t>Диагностика на дом клиента (</w:t>
-      </w:r>
-      <w:r>
-        <w:rPr>
-          <w:lang w:val="en-US"/>
-        </w:rPr>
-        <w:t>A</w:t>
-      </w:r>
-      <w:r>
-        <w:t>3.1.2) – проведение выездных работ.</w:t>
-      </w:r>
-    </w:p>
-    <w:p>
-      <w:r>
-        <w:lastRenderedPageBreak/>
-        <w:t>Диагностика внутри центра (</w:t>
-      </w:r>
-      <w:r>
-        <w:rPr>
-          <w:lang w:val="en-US"/>
-        </w:rPr>
-        <w:t>A</w:t>
-      </w:r>
-      <w:r>
-        <w:t>3.1.3) – проведение работ в условиях сервисного центра.</w:t>
-      </w:r>
+      </w:pPr>
     </w:p>
     <w:p>
       <w:pPr>
-        <w:pStyle w:val="21"/>
+        <w:pStyle w:val="ae"/>
+        <w:rPr>
+          <w:rFonts w:eastAsia="MS Mincho"/>
+        </w:rPr>
       </w:pPr>
       <w:r>
-        <w:t>5.5. Моделирование выездной диагностики (</w:t>
-      </w:r>
-      <w:r>
-        <w:rPr>
-          <w:lang w:val="en-US"/>
-        </w:rPr>
-        <w:t>A</w:t>
-      </w:r>
-      <w:r>
-        <w:t>3.1.2)</w:t>
+        <w:t>Таблица 10 – Стрелки диаграммы A3 «Ремонт компьютерной техники»</w:t>
       </w:r>
     </w:p>
-    <w:p>
-      <w:r>
-        <w:t>Детализация процесса диагностики на дому (Таблицы 13 и 14) включает следующие шаги:</w:t>
-      </w:r>
-    </w:p>
-    <w:p>
-      <w:r>
-        <w:t>Выезд к клиенту (</w:t>
-      </w:r>
-      <w:r>
-        <w:rPr>
-          <w:lang w:val="en-US"/>
-        </w:rPr>
-        <w:t>A</w:t>
-      </w:r>
-      <w:r>
-        <w:t>3.1.1.1) – прибытие специалиста.</w:t>
-      </w:r>
-    </w:p>
-    <w:p>
-      <w:r>
-        <w:t>Первичное тестирование (</w:t>
-      </w:r>
-      <w:r>
-        <w:rPr>
-          <w:lang w:val="en-US"/>
-        </w:rPr>
-        <w:t>A</w:t>
-      </w:r>
-      <w:r>
-        <w:t>3.1.1.2) – оценка возможности ремонта на месте.</w:t>
-      </w:r>
-    </w:p>
-    <w:p>
-      <w:r>
-        <w:t>Ремонт на месте (</w:t>
-      </w:r>
-      <w:r>
-        <w:rPr>
-          <w:lang w:val="en-US"/>
-        </w:rPr>
-        <w:t>A</w:t>
-      </w:r>
-      <w:r>
-        <w:t>3.1.1.3) – устранение неисправности у клиента.</w:t>
-      </w:r>
-    </w:p>
-    <w:p>
-      <w:r>
-        <w:t>Транспортировка устройства (</w:t>
-      </w:r>
-      <w:r>
-        <w:rPr>
-          <w:lang w:val="en-US"/>
-        </w:rPr>
-        <w:t>A</w:t>
-      </w:r>
-      <w:r>
-        <w:t>3.1.1.4) – доставка в сервис, если ремонт на месте невозможен или не удался.</w:t>
-      </w:r>
-    </w:p>
-    <w:p>
-      <w:r>
-        <w:t>Данный уровень учитывает правила оповещения клиента, ограничения выездного ремонта и требования к упаковке устройств при транспортировке.</w:t>
-      </w:r>
-    </w:p>
+    <w:tbl>
+      <w:tblPr>
+        <w:tblStyle w:val="22"/>
+        <w:tblW w:w="0" w:type="auto"/>
+        <w:jc w:val="center"/>
+        <w:tblInd w:w="0" w:type="dxa"/>
+        <w:tblLook w:val="04A0" w:firstRow="1" w:lastRow="0" w:firstColumn="1" w:lastColumn="0" w:noHBand="0" w:noVBand="1"/>
+      </w:tblPr>
+      <w:tblGrid>
+        <w:gridCol w:w="2410"/>
+        <w:gridCol w:w="2410"/>
+        <w:gridCol w:w="2410"/>
+        <w:gridCol w:w="2410"/>
+      </w:tblGrid>
+      <w:tr>
+        <w:trPr>
+          <w:jc w:val="center"/>
+        </w:trPr>
+        <w:tc>
+          <w:tcPr>
+            <w:tcW w:w="2410" w:type="dxa"/>
+            <w:tcBorders>
+              <w:top w:val="single" w:sz="4" w:space="0" w:color="auto"/>
+              <w:left w:val="single" w:sz="4" w:space="0" w:color="auto"/>
+              <w:bottom w:val="single" w:sz="4" w:space="0" w:color="auto"/>
+              <w:right w:val="single" w:sz="4" w:space="0" w:color="auto"/>
+            </w:tcBorders>
+            <w:vAlign w:val="center"/>
+            <w:hideMark/>
+          </w:tcPr>
+          <w:p>
+            <w:pPr>
+              <w:spacing w:after="160" w:line="256" w:lineRule="auto"/>
+              <w:ind w:firstLine="0"/>
+              <w:contextualSpacing w:val="0"/>
+              <w:rPr>
+                <w:rFonts w:ascii="Times New Roman" w:hAnsi="Times New Roman" w:cs="Times New Roman"/>
+                <w:szCs w:val="28"/>
+              </w:rPr>
+            </w:pPr>
+            <w:r>
+              <w:rPr>
+                <w:rFonts w:ascii="Times New Roman" w:hAnsi="Times New Roman" w:cs="Times New Roman"/>
+                <w:b/>
+                <w:szCs w:val="28"/>
+              </w:rPr>
+              <w:t>№</w:t>
+            </w:r>
+          </w:p>
+        </w:tc>
+        <w:tc>
+          <w:tcPr>
+            <w:tcW w:w="2410" w:type="dxa"/>
+            <w:tcBorders>
+              <w:top w:val="single" w:sz="4" w:space="0" w:color="auto"/>
+              <w:left w:val="single" w:sz="4" w:space="0" w:color="auto"/>
+              <w:bottom w:val="single" w:sz="4" w:space="0" w:color="auto"/>
+              <w:right w:val="single" w:sz="4" w:space="0" w:color="auto"/>
+            </w:tcBorders>
+            <w:vAlign w:val="center"/>
+            <w:hideMark/>
+          </w:tcPr>
+          <w:p>
+            <w:pPr>
+              <w:spacing w:after="160" w:line="256" w:lineRule="auto"/>
+              <w:ind w:firstLine="0"/>
+              <w:contextualSpacing w:val="0"/>
+              <w:rPr>
+                <w:rFonts w:ascii="Times New Roman" w:hAnsi="Times New Roman" w:cs="Times New Roman"/>
+                <w:szCs w:val="28"/>
+              </w:rPr>
+            </w:pPr>
+            <w:r>
+              <w:rPr>
+                <w:rFonts w:ascii="Times New Roman" w:hAnsi="Times New Roman" w:cs="Times New Roman"/>
+                <w:b/>
+                <w:szCs w:val="28"/>
+              </w:rPr>
+              <w:t>Наименование</w:t>
+            </w:r>
+          </w:p>
+        </w:tc>
+        <w:tc>
+          <w:tcPr>
+            <w:tcW w:w="2410" w:type="dxa"/>
+            <w:tcBorders>
+              <w:top w:val="single" w:sz="4" w:space="0" w:color="auto"/>
+              <w:left w:val="single" w:sz="4" w:space="0" w:color="auto"/>
+              <w:bottom w:val="single" w:sz="4" w:space="0" w:color="auto"/>
+              <w:right w:val="single" w:sz="4" w:space="0" w:color="auto"/>
+            </w:tcBorders>
+            <w:vAlign w:val="center"/>
+            <w:hideMark/>
+          </w:tcPr>
+          <w:p>
+            <w:pPr>
+              <w:spacing w:after="160" w:line="256" w:lineRule="auto"/>
+              <w:ind w:firstLine="0"/>
+              <w:contextualSpacing w:val="0"/>
+              <w:rPr>
+                <w:rFonts w:ascii="Times New Roman" w:hAnsi="Times New Roman" w:cs="Times New Roman"/>
+                <w:szCs w:val="28"/>
+              </w:rPr>
+            </w:pPr>
+            <w:r>
+              <w:rPr>
+                <w:rFonts w:ascii="Times New Roman" w:hAnsi="Times New Roman" w:cs="Times New Roman"/>
+                <w:b/>
+                <w:szCs w:val="28"/>
+              </w:rPr>
+              <w:t>Описание</w:t>
+            </w:r>
+          </w:p>
+        </w:tc>
+        <w:tc>
+          <w:tcPr>
+            <w:tcW w:w="2410" w:type="dxa"/>
+            <w:tcBorders>
+              <w:top w:val="single" w:sz="4" w:space="0" w:color="auto"/>
+              <w:left w:val="single" w:sz="4" w:space="0" w:color="auto"/>
+              <w:bottom w:val="single" w:sz="4" w:space="0" w:color="auto"/>
+              <w:right w:val="single" w:sz="4" w:space="0" w:color="auto"/>
+            </w:tcBorders>
+            <w:vAlign w:val="center"/>
+            <w:hideMark/>
+          </w:tcPr>
+          <w:p>
+            <w:pPr>
+              <w:spacing w:after="160" w:line="256" w:lineRule="auto"/>
+              <w:ind w:firstLine="0"/>
+              <w:contextualSpacing w:val="0"/>
+              <w:rPr>
+                <w:rFonts w:ascii="Times New Roman" w:hAnsi="Times New Roman" w:cs="Times New Roman"/>
+                <w:szCs w:val="28"/>
+              </w:rPr>
+            </w:pPr>
+            <w:r>
+              <w:rPr>
+                <w:rFonts w:ascii="Times New Roman" w:hAnsi="Times New Roman" w:cs="Times New Roman"/>
+                <w:b/>
+                <w:szCs w:val="28"/>
+              </w:rPr>
+              <w:t>Тип</w:t>
+            </w:r>
+          </w:p>
+        </w:tc>
+      </w:tr>
+      <w:tr>
+        <w:trPr>
+          <w:jc w:val="center"/>
+        </w:trPr>
+        <w:tc>
+          <w:tcPr>
+            <w:tcW w:w="2405" w:type="dxa"/>
+            <w:tcBorders>
+              <w:top w:val="single" w:sz="4" w:space="0" w:color="auto"/>
+              <w:left w:val="single" w:sz="4" w:space="0" w:color="auto"/>
+              <w:bottom w:val="single" w:sz="4" w:space="0" w:color="auto"/>
+              <w:right w:val="single" w:sz="4" w:space="0" w:color="auto"/>
+            </w:tcBorders>
+            <w:hideMark/>
+          </w:tcPr>
+          <w:p>
+            <w:pPr>
+              <w:spacing w:after="160" w:line="256" w:lineRule="auto"/>
+              <w:ind w:firstLine="0"/>
+              <w:contextualSpacing w:val="0"/>
+              <w:rPr>
+                <w:rFonts w:ascii="Times New Roman" w:hAnsi="Times New Roman" w:cs="Times New Roman"/>
+                <w:szCs w:val="28"/>
+              </w:rPr>
+            </w:pPr>
+            <w:r>
+              <w:rPr>
+                <w:rFonts w:ascii="Times New Roman" w:hAnsi="Times New Roman" w:cs="Times New Roman"/>
+                <w:szCs w:val="28"/>
+              </w:rPr>
+              <w:t>A3.1</w:t>
+            </w:r>
+          </w:p>
+        </w:tc>
+        <w:tc>
+          <w:tcPr>
+            <w:tcW w:w="2408" w:type="dxa"/>
+            <w:tcBorders>
+              <w:top w:val="single" w:sz="4" w:space="0" w:color="auto"/>
+              <w:left w:val="single" w:sz="4" w:space="0" w:color="auto"/>
+              <w:bottom w:val="single" w:sz="4" w:space="0" w:color="auto"/>
+              <w:right w:val="single" w:sz="4" w:space="0" w:color="auto"/>
+            </w:tcBorders>
+            <w:hideMark/>
+          </w:tcPr>
+          <w:p>
+            <w:pPr>
+              <w:spacing w:after="160" w:line="256" w:lineRule="auto"/>
+              <w:ind w:firstLine="0"/>
+              <w:contextualSpacing w:val="0"/>
+              <w:rPr>
+                <w:rFonts w:ascii="Times New Roman" w:hAnsi="Times New Roman" w:cs="Times New Roman"/>
+                <w:szCs w:val="28"/>
+              </w:rPr>
+            </w:pPr>
+            <w:r>
+              <w:rPr>
+                <w:rFonts w:ascii="Times New Roman" w:hAnsi="Times New Roman" w:cs="Times New Roman"/>
+                <w:szCs w:val="28"/>
+              </w:rPr>
+              <w:t>Запрос клиента</w:t>
+            </w:r>
+          </w:p>
+        </w:tc>
+        <w:tc>
+          <w:tcPr>
+            <w:tcW w:w="2409" w:type="dxa"/>
+            <w:tcBorders>
+              <w:top w:val="single" w:sz="4" w:space="0" w:color="auto"/>
+              <w:left w:val="single" w:sz="4" w:space="0" w:color="auto"/>
+              <w:bottom w:val="single" w:sz="4" w:space="0" w:color="auto"/>
+              <w:right w:val="single" w:sz="4" w:space="0" w:color="auto"/>
+            </w:tcBorders>
+            <w:hideMark/>
+          </w:tcPr>
+          <w:p>
+            <w:pPr>
+              <w:spacing w:after="160" w:line="256" w:lineRule="auto"/>
+              <w:ind w:firstLine="0"/>
+              <w:contextualSpacing w:val="0"/>
+              <w:rPr>
+                <w:rFonts w:ascii="Times New Roman" w:hAnsi="Times New Roman" w:cs="Times New Roman"/>
+                <w:szCs w:val="28"/>
+              </w:rPr>
+            </w:pPr>
+            <w:r>
+              <w:rPr>
+                <w:rFonts w:ascii="Times New Roman" w:hAnsi="Times New Roman" w:cs="Times New Roman"/>
+                <w:szCs w:val="28"/>
+              </w:rPr>
+              <w:t>Обращение по поводу неисправности.</w:t>
+            </w:r>
+          </w:p>
+        </w:tc>
+        <w:tc>
+          <w:tcPr>
+            <w:tcW w:w="2407" w:type="dxa"/>
+            <w:tcBorders>
+              <w:top w:val="single" w:sz="4" w:space="0" w:color="auto"/>
+              <w:left w:val="single" w:sz="4" w:space="0" w:color="auto"/>
+              <w:bottom w:val="single" w:sz="4" w:space="0" w:color="auto"/>
+              <w:right w:val="single" w:sz="4" w:space="0" w:color="auto"/>
+            </w:tcBorders>
+            <w:hideMark/>
+          </w:tcPr>
+          <w:p>
+            <w:pPr>
+              <w:spacing w:after="160" w:line="256" w:lineRule="auto"/>
+              <w:ind w:firstLine="0"/>
+              <w:contextualSpacing w:val="0"/>
+              <w:rPr>
+                <w:rFonts w:ascii="Times New Roman" w:hAnsi="Times New Roman" w:cs="Times New Roman"/>
+                <w:szCs w:val="28"/>
+              </w:rPr>
+            </w:pPr>
+            <w:proofErr w:type="spellStart"/>
+            <w:r>
+              <w:rPr>
+                <w:rFonts w:ascii="Times New Roman" w:hAnsi="Times New Roman" w:cs="Times New Roman"/>
+                <w:szCs w:val="28"/>
+              </w:rPr>
+              <w:t>Input</w:t>
+            </w:r>
+            <w:proofErr w:type="spellEnd"/>
+          </w:p>
+        </w:tc>
+      </w:tr>
+      <w:tr>
+        <w:trPr>
+          <w:jc w:val="center"/>
+        </w:trPr>
+        <w:tc>
+          <w:tcPr>
+            <w:tcW w:w="2405" w:type="dxa"/>
+            <w:tcBorders>
+              <w:top w:val="single" w:sz="4" w:space="0" w:color="auto"/>
+              <w:left w:val="single" w:sz="4" w:space="0" w:color="auto"/>
+              <w:bottom w:val="single" w:sz="4" w:space="0" w:color="auto"/>
+              <w:right w:val="single" w:sz="4" w:space="0" w:color="auto"/>
+            </w:tcBorders>
+            <w:hideMark/>
+          </w:tcPr>
+          <w:p>
+            <w:pPr>
+              <w:spacing w:after="160" w:line="256" w:lineRule="auto"/>
+              <w:ind w:firstLine="0"/>
+              <w:contextualSpacing w:val="0"/>
+              <w:rPr>
+                <w:rFonts w:ascii="Times New Roman" w:hAnsi="Times New Roman" w:cs="Times New Roman"/>
+                <w:szCs w:val="28"/>
+              </w:rPr>
+            </w:pPr>
+            <w:r>
+              <w:rPr>
+                <w:rFonts w:ascii="Times New Roman" w:hAnsi="Times New Roman" w:cs="Times New Roman"/>
+                <w:szCs w:val="28"/>
+              </w:rPr>
+              <w:t>A3.2</w:t>
+            </w:r>
+          </w:p>
+        </w:tc>
+        <w:tc>
+          <w:tcPr>
+            <w:tcW w:w="2408" w:type="dxa"/>
+            <w:tcBorders>
+              <w:top w:val="single" w:sz="4" w:space="0" w:color="auto"/>
+              <w:left w:val="single" w:sz="4" w:space="0" w:color="auto"/>
+              <w:bottom w:val="single" w:sz="4" w:space="0" w:color="auto"/>
+              <w:right w:val="single" w:sz="4" w:space="0" w:color="auto"/>
+            </w:tcBorders>
+            <w:hideMark/>
+          </w:tcPr>
+          <w:p>
+            <w:pPr>
+              <w:spacing w:after="160" w:line="256" w:lineRule="auto"/>
+              <w:ind w:firstLine="0"/>
+              <w:contextualSpacing w:val="0"/>
+              <w:rPr>
+                <w:rFonts w:ascii="Times New Roman" w:hAnsi="Times New Roman" w:cs="Times New Roman"/>
+                <w:szCs w:val="28"/>
+              </w:rPr>
+            </w:pPr>
+            <w:r>
+              <w:rPr>
+                <w:rFonts w:ascii="Times New Roman" w:hAnsi="Times New Roman" w:cs="Times New Roman"/>
+                <w:szCs w:val="28"/>
+              </w:rPr>
+              <w:t>Оплата клиента</w:t>
+            </w:r>
+          </w:p>
+        </w:tc>
+        <w:tc>
+          <w:tcPr>
+            <w:tcW w:w="2409" w:type="dxa"/>
+            <w:tcBorders>
+              <w:top w:val="single" w:sz="4" w:space="0" w:color="auto"/>
+              <w:left w:val="single" w:sz="4" w:space="0" w:color="auto"/>
+              <w:bottom w:val="single" w:sz="4" w:space="0" w:color="auto"/>
+              <w:right w:val="single" w:sz="4" w:space="0" w:color="auto"/>
+            </w:tcBorders>
+            <w:hideMark/>
+          </w:tcPr>
+          <w:p>
+            <w:pPr>
+              <w:spacing w:after="160" w:line="256" w:lineRule="auto"/>
+              <w:ind w:firstLine="0"/>
+              <w:contextualSpacing w:val="0"/>
+              <w:rPr>
+                <w:rFonts w:ascii="Times New Roman" w:hAnsi="Times New Roman" w:cs="Times New Roman"/>
+                <w:szCs w:val="28"/>
+              </w:rPr>
+            </w:pPr>
+            <w:r>
+              <w:rPr>
+                <w:rFonts w:ascii="Times New Roman" w:hAnsi="Times New Roman" w:cs="Times New Roman"/>
+                <w:szCs w:val="28"/>
+              </w:rPr>
+              <w:t>Оплата ремонтных работ.</w:t>
+            </w:r>
+          </w:p>
+        </w:tc>
+        <w:tc>
+          <w:tcPr>
+            <w:tcW w:w="2407" w:type="dxa"/>
+            <w:tcBorders>
+              <w:top w:val="single" w:sz="4" w:space="0" w:color="auto"/>
+              <w:left w:val="single" w:sz="4" w:space="0" w:color="auto"/>
+              <w:bottom w:val="single" w:sz="4" w:space="0" w:color="auto"/>
+              <w:right w:val="single" w:sz="4" w:space="0" w:color="auto"/>
+            </w:tcBorders>
+            <w:hideMark/>
+          </w:tcPr>
+          <w:p>
+            <w:pPr>
+              <w:spacing w:after="160" w:line="256" w:lineRule="auto"/>
+              <w:ind w:firstLine="0"/>
+              <w:contextualSpacing w:val="0"/>
+              <w:rPr>
+                <w:rFonts w:ascii="Times New Roman" w:hAnsi="Times New Roman" w:cs="Times New Roman"/>
+                <w:szCs w:val="28"/>
+              </w:rPr>
+            </w:pPr>
+            <w:proofErr w:type="spellStart"/>
+            <w:r>
+              <w:rPr>
+                <w:rFonts w:ascii="Times New Roman" w:hAnsi="Times New Roman" w:cs="Times New Roman"/>
+                <w:szCs w:val="28"/>
+              </w:rPr>
+              <w:t>Input</w:t>
+            </w:r>
+            <w:proofErr w:type="spellEnd"/>
+          </w:p>
+        </w:tc>
+      </w:tr>
+      <w:tr>
+        <w:trPr>
+          <w:jc w:val="center"/>
+        </w:trPr>
+        <w:tc>
+          <w:tcPr>
+            <w:tcW w:w="2405" w:type="dxa"/>
+            <w:tcBorders>
+              <w:top w:val="single" w:sz="4" w:space="0" w:color="auto"/>
+              <w:left w:val="single" w:sz="4" w:space="0" w:color="auto"/>
+              <w:bottom w:val="single" w:sz="4" w:space="0" w:color="auto"/>
+              <w:right w:val="single" w:sz="4" w:space="0" w:color="auto"/>
+            </w:tcBorders>
+            <w:hideMark/>
+          </w:tcPr>
+          <w:p>
+            <w:pPr>
+              <w:spacing w:after="160" w:line="256" w:lineRule="auto"/>
+              <w:ind w:firstLine="0"/>
+              <w:contextualSpacing w:val="0"/>
+              <w:rPr>
+                <w:rFonts w:ascii="Times New Roman" w:hAnsi="Times New Roman" w:cs="Times New Roman"/>
+                <w:szCs w:val="28"/>
+              </w:rPr>
+            </w:pPr>
+            <w:r>
+              <w:rPr>
+                <w:rFonts w:ascii="Times New Roman" w:hAnsi="Times New Roman" w:cs="Times New Roman"/>
+                <w:szCs w:val="28"/>
+              </w:rPr>
+              <w:t>A3.3</w:t>
+            </w:r>
+          </w:p>
+        </w:tc>
+        <w:tc>
+          <w:tcPr>
+            <w:tcW w:w="2408" w:type="dxa"/>
+            <w:tcBorders>
+              <w:top w:val="single" w:sz="4" w:space="0" w:color="auto"/>
+              <w:left w:val="single" w:sz="4" w:space="0" w:color="auto"/>
+              <w:bottom w:val="single" w:sz="4" w:space="0" w:color="auto"/>
+              <w:right w:val="single" w:sz="4" w:space="0" w:color="auto"/>
+            </w:tcBorders>
+            <w:hideMark/>
+          </w:tcPr>
+          <w:p>
+            <w:pPr>
+              <w:spacing w:after="160" w:line="256" w:lineRule="auto"/>
+              <w:ind w:firstLine="0"/>
+              <w:contextualSpacing w:val="0"/>
+              <w:rPr>
+                <w:rFonts w:ascii="Times New Roman" w:hAnsi="Times New Roman" w:cs="Times New Roman"/>
+                <w:szCs w:val="28"/>
+              </w:rPr>
+            </w:pPr>
+            <w:r>
+              <w:rPr>
+                <w:rFonts w:ascii="Times New Roman" w:hAnsi="Times New Roman" w:cs="Times New Roman"/>
+                <w:szCs w:val="28"/>
+              </w:rPr>
+              <w:t>Товары и комплектующие от поставщиков</w:t>
+            </w:r>
+          </w:p>
+        </w:tc>
+        <w:tc>
+          <w:tcPr>
+            <w:tcW w:w="2409" w:type="dxa"/>
+            <w:tcBorders>
+              <w:top w:val="single" w:sz="4" w:space="0" w:color="auto"/>
+              <w:left w:val="single" w:sz="4" w:space="0" w:color="auto"/>
+              <w:bottom w:val="single" w:sz="4" w:space="0" w:color="auto"/>
+              <w:right w:val="single" w:sz="4" w:space="0" w:color="auto"/>
+            </w:tcBorders>
+            <w:hideMark/>
+          </w:tcPr>
+          <w:p>
+            <w:pPr>
+              <w:spacing w:after="160" w:line="256" w:lineRule="auto"/>
+              <w:ind w:firstLine="0"/>
+              <w:contextualSpacing w:val="0"/>
+              <w:rPr>
+                <w:rFonts w:ascii="Times New Roman" w:hAnsi="Times New Roman" w:cs="Times New Roman"/>
+                <w:szCs w:val="28"/>
+              </w:rPr>
+            </w:pPr>
+            <w:r>
+              <w:rPr>
+                <w:rFonts w:ascii="Times New Roman" w:hAnsi="Times New Roman" w:cs="Times New Roman"/>
+                <w:szCs w:val="28"/>
+              </w:rPr>
+              <w:t>Запчасти и комплектующие для ремонта.</w:t>
+            </w:r>
+          </w:p>
+        </w:tc>
+        <w:tc>
+          <w:tcPr>
+            <w:tcW w:w="2407" w:type="dxa"/>
+            <w:tcBorders>
+              <w:top w:val="single" w:sz="4" w:space="0" w:color="auto"/>
+              <w:left w:val="single" w:sz="4" w:space="0" w:color="auto"/>
+              <w:bottom w:val="single" w:sz="4" w:space="0" w:color="auto"/>
+              <w:right w:val="single" w:sz="4" w:space="0" w:color="auto"/>
+            </w:tcBorders>
+            <w:hideMark/>
+          </w:tcPr>
+          <w:p>
+            <w:pPr>
+              <w:spacing w:after="160" w:line="256" w:lineRule="auto"/>
+              <w:ind w:firstLine="0"/>
+              <w:contextualSpacing w:val="0"/>
+              <w:rPr>
+                <w:rFonts w:ascii="Times New Roman" w:hAnsi="Times New Roman" w:cs="Times New Roman"/>
+                <w:szCs w:val="28"/>
+              </w:rPr>
+            </w:pPr>
+            <w:proofErr w:type="spellStart"/>
+            <w:r>
+              <w:rPr>
+                <w:rFonts w:ascii="Times New Roman" w:hAnsi="Times New Roman" w:cs="Times New Roman"/>
+                <w:szCs w:val="28"/>
+              </w:rPr>
+              <w:t>Input</w:t>
+            </w:r>
+            <w:proofErr w:type="spellEnd"/>
+          </w:p>
+        </w:tc>
+      </w:tr>
+      <w:tr>
+        <w:trPr>
+          <w:jc w:val="center"/>
+        </w:trPr>
+        <w:tc>
+          <w:tcPr>
+            <w:tcW w:w="2405" w:type="dxa"/>
+            <w:tcBorders>
+              <w:top w:val="single" w:sz="4" w:space="0" w:color="auto"/>
+              <w:left w:val="single" w:sz="4" w:space="0" w:color="auto"/>
+              <w:bottom w:val="single" w:sz="4" w:space="0" w:color="auto"/>
+              <w:right w:val="single" w:sz="4" w:space="0" w:color="auto"/>
+            </w:tcBorders>
+            <w:hideMark/>
+          </w:tcPr>
+          <w:p>
+            <w:pPr>
+              <w:spacing w:after="160" w:line="256" w:lineRule="auto"/>
+              <w:ind w:firstLine="0"/>
+              <w:contextualSpacing w:val="0"/>
+              <w:rPr>
+                <w:rFonts w:ascii="Times New Roman" w:hAnsi="Times New Roman" w:cs="Times New Roman"/>
+                <w:szCs w:val="28"/>
+              </w:rPr>
+            </w:pPr>
+            <w:r>
+              <w:rPr>
+                <w:rFonts w:ascii="Times New Roman" w:hAnsi="Times New Roman" w:cs="Times New Roman"/>
+                <w:szCs w:val="28"/>
+              </w:rPr>
+              <w:t>A3.4</w:t>
+            </w:r>
+          </w:p>
+        </w:tc>
+        <w:tc>
+          <w:tcPr>
+            <w:tcW w:w="2408" w:type="dxa"/>
+            <w:tcBorders>
+              <w:top w:val="single" w:sz="4" w:space="0" w:color="auto"/>
+              <w:left w:val="single" w:sz="4" w:space="0" w:color="auto"/>
+              <w:bottom w:val="single" w:sz="4" w:space="0" w:color="auto"/>
+              <w:right w:val="single" w:sz="4" w:space="0" w:color="auto"/>
+            </w:tcBorders>
+            <w:hideMark/>
+          </w:tcPr>
+          <w:p>
+            <w:pPr>
+              <w:spacing w:after="160" w:line="256" w:lineRule="auto"/>
+              <w:ind w:firstLine="0"/>
+              <w:contextualSpacing w:val="0"/>
+              <w:rPr>
+                <w:rFonts w:ascii="Times New Roman" w:hAnsi="Times New Roman" w:cs="Times New Roman"/>
+                <w:szCs w:val="28"/>
+              </w:rPr>
+            </w:pPr>
+            <w:r>
+              <w:rPr>
+                <w:rFonts w:ascii="Times New Roman" w:hAnsi="Times New Roman" w:cs="Times New Roman"/>
+                <w:szCs w:val="28"/>
+              </w:rPr>
+              <w:t>Регламент диагностики</w:t>
+            </w:r>
+          </w:p>
+        </w:tc>
+        <w:tc>
+          <w:tcPr>
+            <w:tcW w:w="2409" w:type="dxa"/>
+            <w:tcBorders>
+              <w:top w:val="single" w:sz="4" w:space="0" w:color="auto"/>
+              <w:left w:val="single" w:sz="4" w:space="0" w:color="auto"/>
+              <w:bottom w:val="single" w:sz="4" w:space="0" w:color="auto"/>
+              <w:right w:val="single" w:sz="4" w:space="0" w:color="auto"/>
+            </w:tcBorders>
+            <w:hideMark/>
+          </w:tcPr>
+          <w:p>
+            <w:pPr>
+              <w:spacing w:after="160" w:line="256" w:lineRule="auto"/>
+              <w:ind w:firstLine="0"/>
+              <w:contextualSpacing w:val="0"/>
+              <w:rPr>
+                <w:rFonts w:ascii="Times New Roman" w:hAnsi="Times New Roman" w:cs="Times New Roman"/>
+                <w:szCs w:val="28"/>
+              </w:rPr>
+            </w:pPr>
+            <w:r>
+              <w:rPr>
+                <w:rFonts w:ascii="Times New Roman" w:hAnsi="Times New Roman" w:cs="Times New Roman"/>
+                <w:szCs w:val="28"/>
+              </w:rPr>
+              <w:t>Правила диагностики.</w:t>
+            </w:r>
+          </w:p>
+        </w:tc>
+        <w:tc>
+          <w:tcPr>
+            <w:tcW w:w="2407" w:type="dxa"/>
+            <w:tcBorders>
+              <w:top w:val="single" w:sz="4" w:space="0" w:color="auto"/>
+              <w:left w:val="single" w:sz="4" w:space="0" w:color="auto"/>
+              <w:bottom w:val="single" w:sz="4" w:space="0" w:color="auto"/>
+              <w:right w:val="single" w:sz="4" w:space="0" w:color="auto"/>
+            </w:tcBorders>
+            <w:hideMark/>
+          </w:tcPr>
+          <w:p>
+            <w:pPr>
+              <w:spacing w:after="160" w:line="256" w:lineRule="auto"/>
+              <w:ind w:firstLine="0"/>
+              <w:contextualSpacing w:val="0"/>
+              <w:rPr>
+                <w:rFonts w:ascii="Times New Roman" w:hAnsi="Times New Roman" w:cs="Times New Roman"/>
+                <w:szCs w:val="28"/>
+              </w:rPr>
+            </w:pPr>
+            <w:r>
+              <w:rPr>
+                <w:rFonts w:ascii="Times New Roman" w:hAnsi="Times New Roman" w:cs="Times New Roman"/>
+                <w:szCs w:val="28"/>
+              </w:rPr>
+              <w:t>Control</w:t>
+            </w:r>
+          </w:p>
+        </w:tc>
+      </w:tr>
+      <w:tr>
+        <w:trPr>
+          <w:jc w:val="center"/>
+        </w:trPr>
+        <w:tc>
+          <w:tcPr>
+            <w:tcW w:w="2405" w:type="dxa"/>
+            <w:tcBorders>
+              <w:top w:val="single" w:sz="4" w:space="0" w:color="auto"/>
+              <w:left w:val="single" w:sz="4" w:space="0" w:color="auto"/>
+              <w:bottom w:val="single" w:sz="4" w:space="0" w:color="auto"/>
+              <w:right w:val="single" w:sz="4" w:space="0" w:color="auto"/>
+            </w:tcBorders>
+            <w:hideMark/>
+          </w:tcPr>
+          <w:p>
+            <w:pPr>
+              <w:spacing w:after="160" w:line="256" w:lineRule="auto"/>
+              <w:ind w:firstLine="0"/>
+              <w:contextualSpacing w:val="0"/>
+              <w:rPr>
+                <w:rFonts w:ascii="Times New Roman" w:hAnsi="Times New Roman" w:cs="Times New Roman"/>
+                <w:szCs w:val="28"/>
+              </w:rPr>
+            </w:pPr>
+            <w:r>
+              <w:rPr>
+                <w:rFonts w:ascii="Times New Roman" w:hAnsi="Times New Roman" w:cs="Times New Roman"/>
+                <w:szCs w:val="28"/>
+              </w:rPr>
+              <w:t>A3.5</w:t>
+            </w:r>
+          </w:p>
+        </w:tc>
+        <w:tc>
+          <w:tcPr>
+            <w:tcW w:w="2408" w:type="dxa"/>
+            <w:tcBorders>
+              <w:top w:val="single" w:sz="4" w:space="0" w:color="auto"/>
+              <w:left w:val="single" w:sz="4" w:space="0" w:color="auto"/>
+              <w:bottom w:val="single" w:sz="4" w:space="0" w:color="auto"/>
+              <w:right w:val="single" w:sz="4" w:space="0" w:color="auto"/>
+            </w:tcBorders>
+            <w:hideMark/>
+          </w:tcPr>
+          <w:p>
+            <w:pPr>
+              <w:spacing w:after="160" w:line="256" w:lineRule="auto"/>
+              <w:ind w:firstLine="0"/>
+              <w:contextualSpacing w:val="0"/>
+              <w:rPr>
+                <w:rFonts w:ascii="Times New Roman" w:hAnsi="Times New Roman" w:cs="Times New Roman"/>
+                <w:szCs w:val="28"/>
+              </w:rPr>
+            </w:pPr>
+            <w:r>
+              <w:rPr>
+                <w:rFonts w:ascii="Times New Roman" w:hAnsi="Times New Roman" w:cs="Times New Roman"/>
+                <w:szCs w:val="28"/>
+              </w:rPr>
+              <w:t>Регламент проведения ремонта в мастерской</w:t>
+            </w:r>
+          </w:p>
+        </w:tc>
+        <w:tc>
+          <w:tcPr>
+            <w:tcW w:w="2409" w:type="dxa"/>
+            <w:tcBorders>
+              <w:top w:val="single" w:sz="4" w:space="0" w:color="auto"/>
+              <w:left w:val="single" w:sz="4" w:space="0" w:color="auto"/>
+              <w:bottom w:val="single" w:sz="4" w:space="0" w:color="auto"/>
+              <w:right w:val="single" w:sz="4" w:space="0" w:color="auto"/>
+            </w:tcBorders>
+            <w:hideMark/>
+          </w:tcPr>
+          <w:p>
+            <w:pPr>
+              <w:spacing w:after="160" w:line="256" w:lineRule="auto"/>
+              <w:ind w:firstLine="0"/>
+              <w:contextualSpacing w:val="0"/>
+              <w:rPr>
+                <w:rFonts w:ascii="Times New Roman" w:hAnsi="Times New Roman" w:cs="Times New Roman"/>
+                <w:szCs w:val="28"/>
+              </w:rPr>
+            </w:pPr>
+            <w:r>
+              <w:rPr>
+                <w:rFonts w:ascii="Times New Roman" w:hAnsi="Times New Roman" w:cs="Times New Roman"/>
+                <w:szCs w:val="28"/>
+              </w:rPr>
+              <w:t>Правила ремонта.</w:t>
+            </w:r>
+          </w:p>
+        </w:tc>
+        <w:tc>
+          <w:tcPr>
+            <w:tcW w:w="2407" w:type="dxa"/>
+            <w:tcBorders>
+              <w:top w:val="single" w:sz="4" w:space="0" w:color="auto"/>
+              <w:left w:val="single" w:sz="4" w:space="0" w:color="auto"/>
+              <w:bottom w:val="single" w:sz="4" w:space="0" w:color="auto"/>
+              <w:right w:val="single" w:sz="4" w:space="0" w:color="auto"/>
+            </w:tcBorders>
+            <w:hideMark/>
+          </w:tcPr>
+          <w:p>
+            <w:pPr>
+              <w:spacing w:after="160" w:line="256" w:lineRule="auto"/>
+              <w:ind w:firstLine="0"/>
+              <w:contextualSpacing w:val="0"/>
+              <w:rPr>
+                <w:rFonts w:ascii="Times New Roman" w:hAnsi="Times New Roman" w:cs="Times New Roman"/>
+                <w:szCs w:val="28"/>
+              </w:rPr>
+            </w:pPr>
+            <w:r>
+              <w:rPr>
+                <w:rFonts w:ascii="Times New Roman" w:hAnsi="Times New Roman" w:cs="Times New Roman"/>
+                <w:szCs w:val="28"/>
+              </w:rPr>
+              <w:t>Control</w:t>
+            </w:r>
+          </w:p>
+        </w:tc>
+      </w:tr>
+      <w:tr>
+        <w:trPr>
+          <w:jc w:val="center"/>
+        </w:trPr>
+        <w:tc>
+          <w:tcPr>
+            <w:tcW w:w="2405" w:type="dxa"/>
+            <w:tcBorders>
+              <w:top w:val="single" w:sz="4" w:space="0" w:color="auto"/>
+              <w:left w:val="single" w:sz="4" w:space="0" w:color="auto"/>
+              <w:bottom w:val="single" w:sz="4" w:space="0" w:color="auto"/>
+              <w:right w:val="single" w:sz="4" w:space="0" w:color="auto"/>
+            </w:tcBorders>
+            <w:hideMark/>
+          </w:tcPr>
+          <w:p>
+            <w:pPr>
+              <w:spacing w:after="160" w:line="256" w:lineRule="auto"/>
+              <w:ind w:firstLine="0"/>
+              <w:contextualSpacing w:val="0"/>
+              <w:rPr>
+                <w:rFonts w:ascii="Times New Roman" w:hAnsi="Times New Roman" w:cs="Times New Roman"/>
+                <w:szCs w:val="28"/>
+              </w:rPr>
+            </w:pPr>
+            <w:r>
+              <w:rPr>
+                <w:rFonts w:ascii="Times New Roman" w:hAnsi="Times New Roman" w:cs="Times New Roman"/>
+                <w:szCs w:val="28"/>
+              </w:rPr>
+              <w:t>A3.6</w:t>
+            </w:r>
+          </w:p>
+        </w:tc>
+        <w:tc>
+          <w:tcPr>
+            <w:tcW w:w="2408" w:type="dxa"/>
+            <w:tcBorders>
+              <w:top w:val="single" w:sz="4" w:space="0" w:color="auto"/>
+              <w:left w:val="single" w:sz="4" w:space="0" w:color="auto"/>
+              <w:bottom w:val="single" w:sz="4" w:space="0" w:color="auto"/>
+              <w:right w:val="single" w:sz="4" w:space="0" w:color="auto"/>
+            </w:tcBorders>
+            <w:hideMark/>
+          </w:tcPr>
+          <w:p>
+            <w:pPr>
+              <w:spacing w:after="160" w:line="256" w:lineRule="auto"/>
+              <w:ind w:firstLine="0"/>
+              <w:contextualSpacing w:val="0"/>
+              <w:rPr>
+                <w:rFonts w:ascii="Times New Roman" w:hAnsi="Times New Roman" w:cs="Times New Roman"/>
+                <w:szCs w:val="28"/>
+              </w:rPr>
+            </w:pPr>
+            <w:r>
+              <w:rPr>
+                <w:rFonts w:ascii="Times New Roman" w:hAnsi="Times New Roman" w:cs="Times New Roman"/>
+                <w:szCs w:val="28"/>
+              </w:rPr>
+              <w:t>Регламент тестирования и оценки качества ремонта</w:t>
+            </w:r>
+          </w:p>
+        </w:tc>
+        <w:tc>
+          <w:tcPr>
+            <w:tcW w:w="2409" w:type="dxa"/>
+            <w:tcBorders>
+              <w:top w:val="single" w:sz="4" w:space="0" w:color="auto"/>
+              <w:left w:val="single" w:sz="4" w:space="0" w:color="auto"/>
+              <w:bottom w:val="single" w:sz="4" w:space="0" w:color="auto"/>
+              <w:right w:val="single" w:sz="4" w:space="0" w:color="auto"/>
+            </w:tcBorders>
+            <w:hideMark/>
+          </w:tcPr>
+          <w:p>
+            <w:pPr>
+              <w:spacing w:after="160" w:line="256" w:lineRule="auto"/>
+              <w:ind w:firstLine="0"/>
+              <w:contextualSpacing w:val="0"/>
+              <w:rPr>
+                <w:rFonts w:ascii="Times New Roman" w:hAnsi="Times New Roman" w:cs="Times New Roman"/>
+                <w:szCs w:val="28"/>
+              </w:rPr>
+            </w:pPr>
+            <w:r>
+              <w:rPr>
+                <w:rFonts w:ascii="Times New Roman" w:hAnsi="Times New Roman" w:cs="Times New Roman"/>
+                <w:szCs w:val="28"/>
+              </w:rPr>
+              <w:t>Правила итоговой проверки.</w:t>
+            </w:r>
+          </w:p>
+        </w:tc>
+        <w:tc>
+          <w:tcPr>
+            <w:tcW w:w="2407" w:type="dxa"/>
+            <w:tcBorders>
+              <w:top w:val="single" w:sz="4" w:space="0" w:color="auto"/>
+              <w:left w:val="single" w:sz="4" w:space="0" w:color="auto"/>
+              <w:bottom w:val="single" w:sz="4" w:space="0" w:color="auto"/>
+              <w:right w:val="single" w:sz="4" w:space="0" w:color="auto"/>
+            </w:tcBorders>
+            <w:hideMark/>
+          </w:tcPr>
+          <w:p>
+            <w:pPr>
+              <w:spacing w:after="160" w:line="256" w:lineRule="auto"/>
+              <w:ind w:firstLine="0"/>
+              <w:contextualSpacing w:val="0"/>
+              <w:rPr>
+                <w:rFonts w:ascii="Times New Roman" w:hAnsi="Times New Roman" w:cs="Times New Roman"/>
+                <w:szCs w:val="28"/>
+              </w:rPr>
+            </w:pPr>
+            <w:r>
+              <w:rPr>
+                <w:rFonts w:ascii="Times New Roman" w:hAnsi="Times New Roman" w:cs="Times New Roman"/>
+                <w:szCs w:val="28"/>
+              </w:rPr>
+              <w:t>Control</w:t>
+            </w:r>
+          </w:p>
+        </w:tc>
+      </w:tr>
+      <w:tr>
+        <w:trPr>
+          <w:jc w:val="center"/>
+        </w:trPr>
+        <w:tc>
+          <w:tcPr>
+            <w:tcW w:w="2405" w:type="dxa"/>
+            <w:tcBorders>
+              <w:top w:val="single" w:sz="4" w:space="0" w:color="auto"/>
+              <w:left w:val="single" w:sz="4" w:space="0" w:color="auto"/>
+              <w:bottom w:val="single" w:sz="4" w:space="0" w:color="auto"/>
+              <w:right w:val="single" w:sz="4" w:space="0" w:color="auto"/>
+            </w:tcBorders>
+            <w:hideMark/>
+          </w:tcPr>
+          <w:p>
+            <w:pPr>
+              <w:spacing w:after="160" w:line="256" w:lineRule="auto"/>
+              <w:ind w:firstLine="0"/>
+              <w:contextualSpacing w:val="0"/>
+              <w:rPr>
+                <w:rFonts w:ascii="Times New Roman" w:hAnsi="Times New Roman" w:cs="Times New Roman"/>
+                <w:szCs w:val="28"/>
+              </w:rPr>
+            </w:pPr>
+            <w:r>
+              <w:rPr>
+                <w:rFonts w:ascii="Times New Roman" w:hAnsi="Times New Roman" w:cs="Times New Roman"/>
+                <w:szCs w:val="28"/>
+              </w:rPr>
+              <w:t>A3.7</w:t>
+            </w:r>
+          </w:p>
+        </w:tc>
+        <w:tc>
+          <w:tcPr>
+            <w:tcW w:w="2408" w:type="dxa"/>
+            <w:tcBorders>
+              <w:top w:val="single" w:sz="4" w:space="0" w:color="auto"/>
+              <w:left w:val="single" w:sz="4" w:space="0" w:color="auto"/>
+              <w:bottom w:val="single" w:sz="4" w:space="0" w:color="auto"/>
+              <w:right w:val="single" w:sz="4" w:space="0" w:color="auto"/>
+            </w:tcBorders>
+            <w:hideMark/>
+          </w:tcPr>
+          <w:p>
+            <w:pPr>
+              <w:spacing w:after="160" w:line="256" w:lineRule="auto"/>
+              <w:ind w:firstLine="0"/>
+              <w:contextualSpacing w:val="0"/>
+              <w:rPr>
+                <w:rFonts w:ascii="Times New Roman" w:hAnsi="Times New Roman" w:cs="Times New Roman"/>
+                <w:szCs w:val="28"/>
+              </w:rPr>
+            </w:pPr>
+            <w:r>
+              <w:rPr>
+                <w:rFonts w:ascii="Times New Roman" w:hAnsi="Times New Roman" w:cs="Times New Roman"/>
+                <w:szCs w:val="28"/>
+              </w:rPr>
+              <w:t>Сломанное устройство</w:t>
+            </w:r>
+          </w:p>
+        </w:tc>
+        <w:tc>
+          <w:tcPr>
+            <w:tcW w:w="2409" w:type="dxa"/>
+            <w:tcBorders>
+              <w:top w:val="single" w:sz="4" w:space="0" w:color="auto"/>
+              <w:left w:val="single" w:sz="4" w:space="0" w:color="auto"/>
+              <w:bottom w:val="single" w:sz="4" w:space="0" w:color="auto"/>
+              <w:right w:val="single" w:sz="4" w:space="0" w:color="auto"/>
+            </w:tcBorders>
+            <w:hideMark/>
+          </w:tcPr>
+          <w:p>
+            <w:pPr>
+              <w:spacing w:after="160" w:line="256" w:lineRule="auto"/>
+              <w:ind w:firstLine="0"/>
+              <w:contextualSpacing w:val="0"/>
+              <w:rPr>
+                <w:rFonts w:ascii="Times New Roman" w:hAnsi="Times New Roman" w:cs="Times New Roman"/>
+                <w:szCs w:val="28"/>
+              </w:rPr>
+            </w:pPr>
+            <w:r>
+              <w:rPr>
+                <w:rFonts w:ascii="Times New Roman" w:hAnsi="Times New Roman" w:cs="Times New Roman"/>
+                <w:szCs w:val="28"/>
+              </w:rPr>
+              <w:t>Устройство после диагностики.</w:t>
+            </w:r>
+          </w:p>
+        </w:tc>
+        <w:tc>
+          <w:tcPr>
+            <w:tcW w:w="2407" w:type="dxa"/>
+            <w:tcBorders>
+              <w:top w:val="single" w:sz="4" w:space="0" w:color="auto"/>
+              <w:left w:val="single" w:sz="4" w:space="0" w:color="auto"/>
+              <w:bottom w:val="single" w:sz="4" w:space="0" w:color="auto"/>
+              <w:right w:val="single" w:sz="4" w:space="0" w:color="auto"/>
+            </w:tcBorders>
+            <w:hideMark/>
+          </w:tcPr>
+          <w:p>
+            <w:pPr>
+              <w:spacing w:after="160" w:line="256" w:lineRule="auto"/>
+              <w:ind w:firstLine="0"/>
+              <w:contextualSpacing w:val="0"/>
+              <w:rPr>
+                <w:rFonts w:ascii="Times New Roman" w:hAnsi="Times New Roman" w:cs="Times New Roman"/>
+                <w:szCs w:val="28"/>
+              </w:rPr>
+            </w:pPr>
+            <w:r>
+              <w:rPr>
+                <w:rFonts w:ascii="Times New Roman" w:hAnsi="Times New Roman" w:cs="Times New Roman"/>
+                <w:szCs w:val="28"/>
+                <w:lang w:val="en-US"/>
+              </w:rPr>
+              <w:t xml:space="preserve">Output / </w:t>
+            </w:r>
+            <w:proofErr w:type="spellStart"/>
+            <w:r>
+              <w:rPr>
+                <w:rFonts w:ascii="Times New Roman" w:hAnsi="Times New Roman" w:cs="Times New Roman"/>
+                <w:szCs w:val="28"/>
+              </w:rPr>
+              <w:t>Input</w:t>
+            </w:r>
+            <w:proofErr w:type="spellEnd"/>
+          </w:p>
+        </w:tc>
+      </w:tr>
+      <w:tr>
+        <w:trPr>
+          <w:jc w:val="center"/>
+        </w:trPr>
+        <w:tc>
+          <w:tcPr>
+            <w:tcW w:w="2405" w:type="dxa"/>
+            <w:tcBorders>
+              <w:top w:val="single" w:sz="4" w:space="0" w:color="auto"/>
+              <w:left w:val="single" w:sz="4" w:space="0" w:color="auto"/>
+              <w:bottom w:val="single" w:sz="4" w:space="0" w:color="auto"/>
+              <w:right w:val="single" w:sz="4" w:space="0" w:color="auto"/>
+            </w:tcBorders>
+            <w:hideMark/>
+          </w:tcPr>
+          <w:p>
+            <w:pPr>
+              <w:spacing w:after="160" w:line="256" w:lineRule="auto"/>
+              <w:ind w:firstLine="0"/>
+              <w:contextualSpacing w:val="0"/>
+              <w:rPr>
+                <w:rFonts w:ascii="Times New Roman" w:hAnsi="Times New Roman" w:cs="Times New Roman"/>
+                <w:szCs w:val="28"/>
+              </w:rPr>
+            </w:pPr>
+            <w:r>
+              <w:rPr>
+                <w:rFonts w:ascii="Times New Roman" w:hAnsi="Times New Roman" w:cs="Times New Roman"/>
+                <w:szCs w:val="28"/>
+              </w:rPr>
+              <w:t>A3.8</w:t>
+            </w:r>
+          </w:p>
+        </w:tc>
+        <w:tc>
+          <w:tcPr>
+            <w:tcW w:w="2408" w:type="dxa"/>
+            <w:tcBorders>
+              <w:top w:val="single" w:sz="4" w:space="0" w:color="auto"/>
+              <w:left w:val="single" w:sz="4" w:space="0" w:color="auto"/>
+              <w:bottom w:val="single" w:sz="4" w:space="0" w:color="auto"/>
+              <w:right w:val="single" w:sz="4" w:space="0" w:color="auto"/>
+            </w:tcBorders>
+            <w:hideMark/>
+          </w:tcPr>
+          <w:p>
+            <w:pPr>
+              <w:spacing w:after="160" w:line="256" w:lineRule="auto"/>
+              <w:ind w:firstLine="0"/>
+              <w:contextualSpacing w:val="0"/>
+              <w:rPr>
+                <w:rFonts w:ascii="Times New Roman" w:hAnsi="Times New Roman" w:cs="Times New Roman"/>
+                <w:szCs w:val="28"/>
+              </w:rPr>
+            </w:pPr>
+            <w:r>
+              <w:rPr>
+                <w:rFonts w:ascii="Times New Roman" w:hAnsi="Times New Roman" w:cs="Times New Roman"/>
+                <w:szCs w:val="28"/>
+              </w:rPr>
+              <w:t>Устройство после исправлений</w:t>
+            </w:r>
+          </w:p>
+        </w:tc>
+        <w:tc>
+          <w:tcPr>
+            <w:tcW w:w="2409" w:type="dxa"/>
+            <w:tcBorders>
+              <w:top w:val="single" w:sz="4" w:space="0" w:color="auto"/>
+              <w:left w:val="single" w:sz="4" w:space="0" w:color="auto"/>
+              <w:bottom w:val="single" w:sz="4" w:space="0" w:color="auto"/>
+              <w:right w:val="single" w:sz="4" w:space="0" w:color="auto"/>
+            </w:tcBorders>
+            <w:hideMark/>
+          </w:tcPr>
+          <w:p>
+            <w:pPr>
+              <w:spacing w:after="160" w:line="256" w:lineRule="auto"/>
+              <w:ind w:firstLine="0"/>
+              <w:contextualSpacing w:val="0"/>
+              <w:rPr>
+                <w:rFonts w:ascii="Times New Roman" w:hAnsi="Times New Roman" w:cs="Times New Roman"/>
+                <w:szCs w:val="28"/>
+              </w:rPr>
+            </w:pPr>
+            <w:r>
+              <w:rPr>
+                <w:rFonts w:ascii="Times New Roman" w:hAnsi="Times New Roman" w:cs="Times New Roman"/>
+                <w:szCs w:val="28"/>
+              </w:rPr>
+              <w:t>Устройство после ремонта.</w:t>
+            </w:r>
+          </w:p>
+        </w:tc>
+        <w:tc>
+          <w:tcPr>
+            <w:tcW w:w="2407" w:type="dxa"/>
+            <w:tcBorders>
+              <w:top w:val="single" w:sz="4" w:space="0" w:color="auto"/>
+              <w:left w:val="single" w:sz="4" w:space="0" w:color="auto"/>
+              <w:bottom w:val="single" w:sz="4" w:space="0" w:color="auto"/>
+              <w:right w:val="single" w:sz="4" w:space="0" w:color="auto"/>
+            </w:tcBorders>
+            <w:hideMark/>
+          </w:tcPr>
+          <w:p>
+            <w:pPr>
+              <w:spacing w:after="160" w:line="256" w:lineRule="auto"/>
+              <w:ind w:firstLine="0"/>
+              <w:contextualSpacing w:val="0"/>
+              <w:rPr>
+                <w:rFonts w:ascii="Times New Roman" w:hAnsi="Times New Roman" w:cs="Times New Roman"/>
+                <w:szCs w:val="28"/>
+              </w:rPr>
+            </w:pPr>
+            <w:r>
+              <w:rPr>
+                <w:rFonts w:ascii="Times New Roman" w:hAnsi="Times New Roman" w:cs="Times New Roman"/>
+                <w:szCs w:val="28"/>
+                <w:lang w:val="en-US"/>
+              </w:rPr>
+              <w:t xml:space="preserve">Output / </w:t>
+            </w:r>
+            <w:proofErr w:type="spellStart"/>
+            <w:r>
+              <w:rPr>
+                <w:rFonts w:ascii="Times New Roman" w:hAnsi="Times New Roman" w:cs="Times New Roman"/>
+                <w:szCs w:val="28"/>
+              </w:rPr>
+              <w:t>Input</w:t>
+            </w:r>
+            <w:proofErr w:type="spellEnd"/>
+          </w:p>
+        </w:tc>
+      </w:tr>
+      <w:tr>
+        <w:trPr>
+          <w:jc w:val="center"/>
+        </w:trPr>
+        <w:tc>
+          <w:tcPr>
+            <w:tcW w:w="2405" w:type="dxa"/>
+            <w:tcBorders>
+              <w:top w:val="single" w:sz="4" w:space="0" w:color="auto"/>
+              <w:left w:val="single" w:sz="4" w:space="0" w:color="auto"/>
+              <w:bottom w:val="single" w:sz="4" w:space="0" w:color="auto"/>
+              <w:right w:val="single" w:sz="4" w:space="0" w:color="auto"/>
+            </w:tcBorders>
+            <w:hideMark/>
+          </w:tcPr>
+          <w:p>
+            <w:pPr>
+              <w:spacing w:after="160" w:line="256" w:lineRule="auto"/>
+              <w:ind w:firstLine="0"/>
+              <w:contextualSpacing w:val="0"/>
+              <w:rPr>
+                <w:rFonts w:ascii="Times New Roman" w:hAnsi="Times New Roman" w:cs="Times New Roman"/>
+                <w:szCs w:val="28"/>
+              </w:rPr>
+            </w:pPr>
+            <w:r>
+              <w:rPr>
+                <w:rFonts w:ascii="Times New Roman" w:hAnsi="Times New Roman" w:cs="Times New Roman"/>
+                <w:szCs w:val="28"/>
+              </w:rPr>
+              <w:t>A3.9</w:t>
+            </w:r>
+          </w:p>
+        </w:tc>
+        <w:tc>
+          <w:tcPr>
+            <w:tcW w:w="2408" w:type="dxa"/>
+            <w:tcBorders>
+              <w:top w:val="single" w:sz="4" w:space="0" w:color="auto"/>
+              <w:left w:val="single" w:sz="4" w:space="0" w:color="auto"/>
+              <w:bottom w:val="single" w:sz="4" w:space="0" w:color="auto"/>
+              <w:right w:val="single" w:sz="4" w:space="0" w:color="auto"/>
+            </w:tcBorders>
+            <w:hideMark/>
+          </w:tcPr>
+          <w:p>
+            <w:pPr>
+              <w:spacing w:after="160" w:line="256" w:lineRule="auto"/>
+              <w:ind w:firstLine="0"/>
+              <w:contextualSpacing w:val="0"/>
+              <w:rPr>
+                <w:rFonts w:ascii="Times New Roman" w:hAnsi="Times New Roman" w:cs="Times New Roman"/>
+                <w:szCs w:val="28"/>
+              </w:rPr>
+            </w:pPr>
+            <w:r>
+              <w:rPr>
+                <w:rFonts w:ascii="Times New Roman" w:hAnsi="Times New Roman" w:cs="Times New Roman"/>
+                <w:szCs w:val="28"/>
+              </w:rPr>
+              <w:t>Устройство не прошедшее проверку</w:t>
+            </w:r>
+          </w:p>
+        </w:tc>
+        <w:tc>
+          <w:tcPr>
+            <w:tcW w:w="2409" w:type="dxa"/>
+            <w:tcBorders>
+              <w:top w:val="single" w:sz="4" w:space="0" w:color="auto"/>
+              <w:left w:val="single" w:sz="4" w:space="0" w:color="auto"/>
+              <w:bottom w:val="single" w:sz="4" w:space="0" w:color="auto"/>
+              <w:right w:val="single" w:sz="4" w:space="0" w:color="auto"/>
+            </w:tcBorders>
+            <w:hideMark/>
+          </w:tcPr>
+          <w:p>
+            <w:pPr>
+              <w:spacing w:after="160" w:line="256" w:lineRule="auto"/>
+              <w:ind w:firstLine="0"/>
+              <w:contextualSpacing w:val="0"/>
+              <w:rPr>
+                <w:rFonts w:ascii="Times New Roman" w:hAnsi="Times New Roman" w:cs="Times New Roman"/>
+                <w:szCs w:val="28"/>
+              </w:rPr>
+            </w:pPr>
+            <w:r>
+              <w:rPr>
+                <w:rFonts w:ascii="Times New Roman" w:hAnsi="Times New Roman" w:cs="Times New Roman"/>
+                <w:szCs w:val="28"/>
+              </w:rPr>
+              <w:t>Устройство, возвращаемое на повторный ремонт.</w:t>
+            </w:r>
+          </w:p>
+        </w:tc>
+        <w:tc>
+          <w:tcPr>
+            <w:tcW w:w="2407" w:type="dxa"/>
+            <w:tcBorders>
+              <w:top w:val="single" w:sz="4" w:space="0" w:color="auto"/>
+              <w:left w:val="single" w:sz="4" w:space="0" w:color="auto"/>
+              <w:bottom w:val="single" w:sz="4" w:space="0" w:color="auto"/>
+              <w:right w:val="single" w:sz="4" w:space="0" w:color="auto"/>
+            </w:tcBorders>
+            <w:hideMark/>
+          </w:tcPr>
+          <w:p>
+            <w:pPr>
+              <w:spacing w:after="160" w:line="256" w:lineRule="auto"/>
+              <w:ind w:firstLine="0"/>
+              <w:contextualSpacing w:val="0"/>
+              <w:rPr>
+                <w:rFonts w:ascii="Times New Roman" w:hAnsi="Times New Roman" w:cs="Times New Roman"/>
+                <w:szCs w:val="28"/>
+              </w:rPr>
+            </w:pPr>
+            <w:r>
+              <w:rPr>
+                <w:rFonts w:ascii="Times New Roman" w:hAnsi="Times New Roman" w:cs="Times New Roman"/>
+                <w:szCs w:val="28"/>
+                <w:lang w:val="en-US"/>
+              </w:rPr>
+              <w:t xml:space="preserve">Output / </w:t>
+            </w:r>
+            <w:proofErr w:type="spellStart"/>
+            <w:r>
+              <w:rPr>
+                <w:rFonts w:ascii="Times New Roman" w:hAnsi="Times New Roman" w:cs="Times New Roman"/>
+                <w:szCs w:val="28"/>
+              </w:rPr>
+              <w:t>Input</w:t>
+            </w:r>
+            <w:proofErr w:type="spellEnd"/>
+          </w:p>
+        </w:tc>
+      </w:tr>
+      <w:tr>
+        <w:trPr>
+          <w:jc w:val="center"/>
+        </w:trPr>
+        <w:tc>
+          <w:tcPr>
+            <w:tcW w:w="2405" w:type="dxa"/>
+            <w:tcBorders>
+              <w:top w:val="single" w:sz="4" w:space="0" w:color="auto"/>
+              <w:left w:val="single" w:sz="4" w:space="0" w:color="auto"/>
+              <w:bottom w:val="single" w:sz="4" w:space="0" w:color="auto"/>
+              <w:right w:val="single" w:sz="4" w:space="0" w:color="auto"/>
+            </w:tcBorders>
+            <w:hideMark/>
+          </w:tcPr>
+          <w:p>
+            <w:pPr>
+              <w:spacing w:after="160" w:line="256" w:lineRule="auto"/>
+              <w:ind w:firstLine="0"/>
+              <w:contextualSpacing w:val="0"/>
+              <w:rPr>
+                <w:rFonts w:ascii="Times New Roman" w:hAnsi="Times New Roman" w:cs="Times New Roman"/>
+                <w:szCs w:val="28"/>
+              </w:rPr>
+            </w:pPr>
+            <w:r>
+              <w:rPr>
+                <w:rFonts w:ascii="Times New Roman" w:hAnsi="Times New Roman" w:cs="Times New Roman"/>
+                <w:szCs w:val="28"/>
+              </w:rPr>
+              <w:t>A3.10</w:t>
+            </w:r>
+          </w:p>
+        </w:tc>
+        <w:tc>
+          <w:tcPr>
+            <w:tcW w:w="2408" w:type="dxa"/>
+            <w:tcBorders>
+              <w:top w:val="single" w:sz="4" w:space="0" w:color="auto"/>
+              <w:left w:val="single" w:sz="4" w:space="0" w:color="auto"/>
+              <w:bottom w:val="single" w:sz="4" w:space="0" w:color="auto"/>
+              <w:right w:val="single" w:sz="4" w:space="0" w:color="auto"/>
+            </w:tcBorders>
+            <w:hideMark/>
+          </w:tcPr>
+          <w:p>
+            <w:pPr>
+              <w:spacing w:after="160" w:line="256" w:lineRule="auto"/>
+              <w:ind w:firstLine="0"/>
+              <w:contextualSpacing w:val="0"/>
+              <w:rPr>
+                <w:rFonts w:ascii="Times New Roman" w:hAnsi="Times New Roman" w:cs="Times New Roman"/>
+                <w:szCs w:val="28"/>
+              </w:rPr>
+            </w:pPr>
+            <w:r>
+              <w:rPr>
+                <w:rFonts w:ascii="Times New Roman" w:hAnsi="Times New Roman" w:cs="Times New Roman"/>
+                <w:szCs w:val="28"/>
+              </w:rPr>
+              <w:t>Денежные средства клиента</w:t>
+            </w:r>
+          </w:p>
+        </w:tc>
+        <w:tc>
+          <w:tcPr>
+            <w:tcW w:w="2409" w:type="dxa"/>
+            <w:tcBorders>
+              <w:top w:val="single" w:sz="4" w:space="0" w:color="auto"/>
+              <w:left w:val="single" w:sz="4" w:space="0" w:color="auto"/>
+              <w:bottom w:val="single" w:sz="4" w:space="0" w:color="auto"/>
+              <w:right w:val="single" w:sz="4" w:space="0" w:color="auto"/>
+            </w:tcBorders>
+            <w:hideMark/>
+          </w:tcPr>
+          <w:p>
+            <w:pPr>
+              <w:spacing w:after="160" w:line="256" w:lineRule="auto"/>
+              <w:ind w:firstLine="0"/>
+              <w:contextualSpacing w:val="0"/>
+              <w:rPr>
+                <w:rFonts w:ascii="Times New Roman" w:hAnsi="Times New Roman" w:cs="Times New Roman"/>
+                <w:szCs w:val="28"/>
+              </w:rPr>
+            </w:pPr>
+            <w:r>
+              <w:rPr>
+                <w:rFonts w:ascii="Times New Roman" w:hAnsi="Times New Roman" w:cs="Times New Roman"/>
+                <w:szCs w:val="28"/>
+              </w:rPr>
+              <w:t>Оплата услуг.</w:t>
+            </w:r>
+          </w:p>
+        </w:tc>
+        <w:tc>
+          <w:tcPr>
+            <w:tcW w:w="2407" w:type="dxa"/>
+            <w:tcBorders>
+              <w:top w:val="single" w:sz="4" w:space="0" w:color="auto"/>
+              <w:left w:val="single" w:sz="4" w:space="0" w:color="auto"/>
+              <w:bottom w:val="single" w:sz="4" w:space="0" w:color="auto"/>
+              <w:right w:val="single" w:sz="4" w:space="0" w:color="auto"/>
+            </w:tcBorders>
+            <w:hideMark/>
+          </w:tcPr>
+          <w:p>
+            <w:pPr>
+              <w:spacing w:after="160" w:line="256" w:lineRule="auto"/>
+              <w:ind w:firstLine="0"/>
+              <w:contextualSpacing w:val="0"/>
+              <w:rPr>
+                <w:rFonts w:ascii="Times New Roman" w:hAnsi="Times New Roman" w:cs="Times New Roman"/>
+                <w:szCs w:val="28"/>
+              </w:rPr>
+            </w:pPr>
+            <w:proofErr w:type="spellStart"/>
+            <w:r>
+              <w:rPr>
+                <w:rFonts w:ascii="Times New Roman" w:hAnsi="Times New Roman" w:cs="Times New Roman"/>
+                <w:szCs w:val="28"/>
+              </w:rPr>
+              <w:t>Output</w:t>
+            </w:r>
+            <w:proofErr w:type="spellEnd"/>
+          </w:p>
+        </w:tc>
+      </w:tr>
+      <w:tr>
+        <w:trPr>
+          <w:jc w:val="center"/>
+        </w:trPr>
+        <w:tc>
+          <w:tcPr>
+            <w:tcW w:w="2405" w:type="dxa"/>
+            <w:tcBorders>
+              <w:top w:val="single" w:sz="4" w:space="0" w:color="auto"/>
+              <w:left w:val="single" w:sz="4" w:space="0" w:color="auto"/>
+              <w:bottom w:val="single" w:sz="4" w:space="0" w:color="auto"/>
+              <w:right w:val="single" w:sz="4" w:space="0" w:color="auto"/>
+            </w:tcBorders>
+            <w:hideMark/>
+          </w:tcPr>
+          <w:p>
+            <w:pPr>
+              <w:spacing w:after="160" w:line="256" w:lineRule="auto"/>
+              <w:ind w:firstLine="0"/>
+              <w:contextualSpacing w:val="0"/>
+              <w:rPr>
+                <w:rFonts w:ascii="Times New Roman" w:hAnsi="Times New Roman" w:cs="Times New Roman"/>
+                <w:szCs w:val="28"/>
+              </w:rPr>
+            </w:pPr>
+            <w:r>
+              <w:rPr>
+                <w:rFonts w:ascii="Times New Roman" w:hAnsi="Times New Roman" w:cs="Times New Roman"/>
+                <w:szCs w:val="28"/>
+              </w:rPr>
+              <w:lastRenderedPageBreak/>
+              <w:t>A3.11</w:t>
+            </w:r>
+          </w:p>
+        </w:tc>
+        <w:tc>
+          <w:tcPr>
+            <w:tcW w:w="2408" w:type="dxa"/>
+            <w:tcBorders>
+              <w:top w:val="single" w:sz="4" w:space="0" w:color="auto"/>
+              <w:left w:val="single" w:sz="4" w:space="0" w:color="auto"/>
+              <w:bottom w:val="single" w:sz="4" w:space="0" w:color="auto"/>
+              <w:right w:val="single" w:sz="4" w:space="0" w:color="auto"/>
+            </w:tcBorders>
+            <w:hideMark/>
+          </w:tcPr>
+          <w:p>
+            <w:pPr>
+              <w:spacing w:after="160" w:line="256" w:lineRule="auto"/>
+              <w:ind w:firstLine="0"/>
+              <w:contextualSpacing w:val="0"/>
+              <w:rPr>
+                <w:rFonts w:ascii="Times New Roman" w:hAnsi="Times New Roman" w:cs="Times New Roman"/>
+                <w:szCs w:val="28"/>
+              </w:rPr>
+            </w:pPr>
+            <w:r>
+              <w:rPr>
+                <w:rFonts w:ascii="Times New Roman" w:hAnsi="Times New Roman" w:cs="Times New Roman"/>
+                <w:szCs w:val="28"/>
+              </w:rPr>
+              <w:t>Починенное устройство</w:t>
+            </w:r>
+          </w:p>
+        </w:tc>
+        <w:tc>
+          <w:tcPr>
+            <w:tcW w:w="2409" w:type="dxa"/>
+            <w:tcBorders>
+              <w:top w:val="single" w:sz="4" w:space="0" w:color="auto"/>
+              <w:left w:val="single" w:sz="4" w:space="0" w:color="auto"/>
+              <w:bottom w:val="single" w:sz="4" w:space="0" w:color="auto"/>
+              <w:right w:val="single" w:sz="4" w:space="0" w:color="auto"/>
+            </w:tcBorders>
+            <w:hideMark/>
+          </w:tcPr>
+          <w:p>
+            <w:pPr>
+              <w:spacing w:after="160" w:line="256" w:lineRule="auto"/>
+              <w:ind w:firstLine="0"/>
+              <w:contextualSpacing w:val="0"/>
+              <w:rPr>
+                <w:rFonts w:ascii="Times New Roman" w:hAnsi="Times New Roman" w:cs="Times New Roman"/>
+                <w:szCs w:val="28"/>
+              </w:rPr>
+            </w:pPr>
+            <w:r>
+              <w:rPr>
+                <w:rFonts w:ascii="Times New Roman" w:hAnsi="Times New Roman" w:cs="Times New Roman"/>
+                <w:szCs w:val="28"/>
+              </w:rPr>
+              <w:t>Исправное устройство после проверки.</w:t>
+            </w:r>
+          </w:p>
+        </w:tc>
+        <w:tc>
+          <w:tcPr>
+            <w:tcW w:w="2407" w:type="dxa"/>
+            <w:tcBorders>
+              <w:top w:val="single" w:sz="4" w:space="0" w:color="auto"/>
+              <w:left w:val="single" w:sz="4" w:space="0" w:color="auto"/>
+              <w:bottom w:val="single" w:sz="4" w:space="0" w:color="auto"/>
+              <w:right w:val="single" w:sz="4" w:space="0" w:color="auto"/>
+            </w:tcBorders>
+            <w:hideMark/>
+          </w:tcPr>
+          <w:p>
+            <w:pPr>
+              <w:spacing w:after="160" w:line="256" w:lineRule="auto"/>
+              <w:ind w:firstLine="0"/>
+              <w:contextualSpacing w:val="0"/>
+              <w:rPr>
+                <w:rFonts w:ascii="Times New Roman" w:hAnsi="Times New Roman" w:cs="Times New Roman"/>
+                <w:szCs w:val="28"/>
+              </w:rPr>
+            </w:pPr>
+            <w:proofErr w:type="spellStart"/>
+            <w:r>
+              <w:rPr>
+                <w:rFonts w:ascii="Times New Roman" w:hAnsi="Times New Roman" w:cs="Times New Roman"/>
+                <w:szCs w:val="28"/>
+              </w:rPr>
+              <w:t>Output</w:t>
+            </w:r>
+            <w:proofErr w:type="spellEnd"/>
+          </w:p>
+        </w:tc>
+      </w:tr>
+      <w:tr>
+        <w:trPr>
+          <w:jc w:val="center"/>
+        </w:trPr>
+        <w:tc>
+          <w:tcPr>
+            <w:tcW w:w="2405" w:type="dxa"/>
+            <w:tcBorders>
+              <w:top w:val="single" w:sz="4" w:space="0" w:color="auto"/>
+              <w:left w:val="single" w:sz="4" w:space="0" w:color="auto"/>
+              <w:bottom w:val="single" w:sz="4" w:space="0" w:color="auto"/>
+              <w:right w:val="single" w:sz="4" w:space="0" w:color="auto"/>
+            </w:tcBorders>
+            <w:hideMark/>
+          </w:tcPr>
+          <w:p>
+            <w:pPr>
+              <w:spacing w:after="160" w:line="256" w:lineRule="auto"/>
+              <w:ind w:firstLine="0"/>
+              <w:contextualSpacing w:val="0"/>
+              <w:rPr>
+                <w:rFonts w:ascii="Times New Roman" w:hAnsi="Times New Roman" w:cs="Times New Roman"/>
+                <w:szCs w:val="28"/>
+              </w:rPr>
+            </w:pPr>
+            <w:r>
+              <w:rPr>
+                <w:rFonts w:ascii="Times New Roman" w:hAnsi="Times New Roman" w:cs="Times New Roman"/>
+                <w:szCs w:val="28"/>
+              </w:rPr>
+              <w:t>A3.12</w:t>
+            </w:r>
+          </w:p>
+        </w:tc>
+        <w:tc>
+          <w:tcPr>
+            <w:tcW w:w="2408" w:type="dxa"/>
+            <w:tcBorders>
+              <w:top w:val="single" w:sz="4" w:space="0" w:color="auto"/>
+              <w:left w:val="single" w:sz="4" w:space="0" w:color="auto"/>
+              <w:bottom w:val="single" w:sz="4" w:space="0" w:color="auto"/>
+              <w:right w:val="single" w:sz="4" w:space="0" w:color="auto"/>
+            </w:tcBorders>
+            <w:hideMark/>
+          </w:tcPr>
+          <w:p>
+            <w:pPr>
+              <w:spacing w:after="160" w:line="256" w:lineRule="auto"/>
+              <w:ind w:firstLine="0"/>
+              <w:contextualSpacing w:val="0"/>
+              <w:rPr>
+                <w:rFonts w:ascii="Times New Roman" w:hAnsi="Times New Roman" w:cs="Times New Roman"/>
+                <w:szCs w:val="28"/>
+              </w:rPr>
+            </w:pPr>
+            <w:r>
+              <w:rPr>
+                <w:rFonts w:ascii="Times New Roman" w:hAnsi="Times New Roman" w:cs="Times New Roman"/>
+                <w:szCs w:val="28"/>
+              </w:rPr>
+              <w:t>Персонал</w:t>
+            </w:r>
+          </w:p>
+        </w:tc>
+        <w:tc>
+          <w:tcPr>
+            <w:tcW w:w="2409" w:type="dxa"/>
+            <w:tcBorders>
+              <w:top w:val="single" w:sz="4" w:space="0" w:color="auto"/>
+              <w:left w:val="single" w:sz="4" w:space="0" w:color="auto"/>
+              <w:bottom w:val="single" w:sz="4" w:space="0" w:color="auto"/>
+              <w:right w:val="single" w:sz="4" w:space="0" w:color="auto"/>
+            </w:tcBorders>
+            <w:hideMark/>
+          </w:tcPr>
+          <w:p>
+            <w:pPr>
+              <w:spacing w:after="160" w:line="256" w:lineRule="auto"/>
+              <w:ind w:firstLine="0"/>
+              <w:contextualSpacing w:val="0"/>
+              <w:rPr>
+                <w:rFonts w:ascii="Times New Roman" w:hAnsi="Times New Roman" w:cs="Times New Roman"/>
+                <w:szCs w:val="28"/>
+              </w:rPr>
+            </w:pPr>
+            <w:r>
+              <w:rPr>
+                <w:rFonts w:ascii="Times New Roman" w:hAnsi="Times New Roman" w:cs="Times New Roman"/>
+                <w:szCs w:val="28"/>
+              </w:rPr>
+              <w:t>Исполнители ремонта.</w:t>
+            </w:r>
+          </w:p>
+        </w:tc>
+        <w:tc>
+          <w:tcPr>
+            <w:tcW w:w="2407" w:type="dxa"/>
+            <w:tcBorders>
+              <w:top w:val="single" w:sz="4" w:space="0" w:color="auto"/>
+              <w:left w:val="single" w:sz="4" w:space="0" w:color="auto"/>
+              <w:bottom w:val="single" w:sz="4" w:space="0" w:color="auto"/>
+              <w:right w:val="single" w:sz="4" w:space="0" w:color="auto"/>
+            </w:tcBorders>
+            <w:hideMark/>
+          </w:tcPr>
+          <w:p>
+            <w:pPr>
+              <w:spacing w:after="160" w:line="256" w:lineRule="auto"/>
+              <w:ind w:firstLine="0"/>
+              <w:contextualSpacing w:val="0"/>
+              <w:rPr>
+                <w:rFonts w:ascii="Times New Roman" w:hAnsi="Times New Roman" w:cs="Times New Roman"/>
+                <w:szCs w:val="28"/>
+              </w:rPr>
+            </w:pPr>
+            <w:proofErr w:type="spellStart"/>
+            <w:r>
+              <w:rPr>
+                <w:rFonts w:ascii="Times New Roman" w:hAnsi="Times New Roman" w:cs="Times New Roman"/>
+                <w:szCs w:val="28"/>
+              </w:rPr>
+              <w:t>Mechanism</w:t>
+            </w:r>
+            <w:proofErr w:type="spellEnd"/>
+          </w:p>
+        </w:tc>
+      </w:tr>
+      <w:tr>
+        <w:trPr>
+          <w:jc w:val="center"/>
+        </w:trPr>
+        <w:tc>
+          <w:tcPr>
+            <w:tcW w:w="2405" w:type="dxa"/>
+            <w:tcBorders>
+              <w:top w:val="single" w:sz="4" w:space="0" w:color="auto"/>
+              <w:left w:val="single" w:sz="4" w:space="0" w:color="auto"/>
+              <w:bottom w:val="single" w:sz="4" w:space="0" w:color="auto"/>
+              <w:right w:val="single" w:sz="4" w:space="0" w:color="auto"/>
+            </w:tcBorders>
+            <w:hideMark/>
+          </w:tcPr>
+          <w:p>
+            <w:pPr>
+              <w:spacing w:after="160" w:line="256" w:lineRule="auto"/>
+              <w:ind w:firstLine="0"/>
+              <w:contextualSpacing w:val="0"/>
+              <w:rPr>
+                <w:rFonts w:ascii="Times New Roman" w:hAnsi="Times New Roman" w:cs="Times New Roman"/>
+                <w:szCs w:val="28"/>
+              </w:rPr>
+            </w:pPr>
+            <w:r>
+              <w:rPr>
+                <w:rFonts w:ascii="Times New Roman" w:hAnsi="Times New Roman" w:cs="Times New Roman"/>
+                <w:szCs w:val="28"/>
+              </w:rPr>
+              <w:t>A3.13</w:t>
+            </w:r>
+          </w:p>
+        </w:tc>
+        <w:tc>
+          <w:tcPr>
+            <w:tcW w:w="2408" w:type="dxa"/>
+            <w:tcBorders>
+              <w:top w:val="single" w:sz="4" w:space="0" w:color="auto"/>
+              <w:left w:val="single" w:sz="4" w:space="0" w:color="auto"/>
+              <w:bottom w:val="single" w:sz="4" w:space="0" w:color="auto"/>
+              <w:right w:val="single" w:sz="4" w:space="0" w:color="auto"/>
+            </w:tcBorders>
+            <w:hideMark/>
+          </w:tcPr>
+          <w:p>
+            <w:pPr>
+              <w:spacing w:after="160" w:line="256" w:lineRule="auto"/>
+              <w:ind w:firstLine="0"/>
+              <w:contextualSpacing w:val="0"/>
+              <w:rPr>
+                <w:rFonts w:ascii="Times New Roman" w:hAnsi="Times New Roman" w:cs="Times New Roman"/>
+                <w:szCs w:val="28"/>
+              </w:rPr>
+            </w:pPr>
+            <w:r>
+              <w:rPr>
+                <w:rFonts w:ascii="Times New Roman" w:hAnsi="Times New Roman" w:cs="Times New Roman"/>
+                <w:szCs w:val="28"/>
+              </w:rPr>
+              <w:t>Склад и оборудование</w:t>
+            </w:r>
+          </w:p>
+        </w:tc>
+        <w:tc>
+          <w:tcPr>
+            <w:tcW w:w="2409" w:type="dxa"/>
+            <w:tcBorders>
+              <w:top w:val="single" w:sz="4" w:space="0" w:color="auto"/>
+              <w:left w:val="single" w:sz="4" w:space="0" w:color="auto"/>
+              <w:bottom w:val="single" w:sz="4" w:space="0" w:color="auto"/>
+              <w:right w:val="single" w:sz="4" w:space="0" w:color="auto"/>
+            </w:tcBorders>
+            <w:hideMark/>
+          </w:tcPr>
+          <w:p>
+            <w:pPr>
+              <w:spacing w:after="160" w:line="256" w:lineRule="auto"/>
+              <w:ind w:firstLine="0"/>
+              <w:contextualSpacing w:val="0"/>
+              <w:rPr>
+                <w:rFonts w:ascii="Times New Roman" w:hAnsi="Times New Roman" w:cs="Times New Roman"/>
+                <w:szCs w:val="28"/>
+              </w:rPr>
+            </w:pPr>
+            <w:r>
+              <w:rPr>
+                <w:rFonts w:ascii="Times New Roman" w:hAnsi="Times New Roman" w:cs="Times New Roman"/>
+                <w:szCs w:val="28"/>
+              </w:rPr>
+              <w:t>Запчасти, инструменты и оборудование.</w:t>
+            </w:r>
+          </w:p>
+        </w:tc>
+        <w:tc>
+          <w:tcPr>
+            <w:tcW w:w="2407" w:type="dxa"/>
+            <w:tcBorders>
+              <w:top w:val="single" w:sz="4" w:space="0" w:color="auto"/>
+              <w:left w:val="single" w:sz="4" w:space="0" w:color="auto"/>
+              <w:bottom w:val="single" w:sz="4" w:space="0" w:color="auto"/>
+              <w:right w:val="single" w:sz="4" w:space="0" w:color="auto"/>
+            </w:tcBorders>
+            <w:hideMark/>
+          </w:tcPr>
+          <w:p>
+            <w:pPr>
+              <w:spacing w:after="160" w:line="256" w:lineRule="auto"/>
+              <w:ind w:firstLine="0"/>
+              <w:contextualSpacing w:val="0"/>
+              <w:rPr>
+                <w:rFonts w:ascii="Times New Roman" w:hAnsi="Times New Roman" w:cs="Times New Roman"/>
+                <w:szCs w:val="28"/>
+              </w:rPr>
+            </w:pPr>
+            <w:proofErr w:type="spellStart"/>
+            <w:r>
+              <w:rPr>
+                <w:rFonts w:ascii="Times New Roman" w:hAnsi="Times New Roman" w:cs="Times New Roman"/>
+                <w:szCs w:val="28"/>
+              </w:rPr>
+              <w:t>Mechanism</w:t>
+            </w:r>
+            <w:proofErr w:type="spellEnd"/>
+          </w:p>
+        </w:tc>
+      </w:tr>
+    </w:tbl>
     <w:p>
       <w:pPr>
-        <w:pStyle w:val="1"/>
+        <w:suppressAutoHyphens/>
+        <w:spacing w:after="160" w:line="256" w:lineRule="auto"/>
+        <w:ind w:firstLine="0"/>
+        <w:contextualSpacing w:val="0"/>
+        <w:rPr>
+          <w:rFonts w:eastAsia="MS Mincho"/>
+          <w:szCs w:val="28"/>
+          <w:lang w:eastAsia="en-US"/>
+        </w:rPr>
       </w:pPr>
-      <w:r>
-        <w:t>6. Заключение</w:t>
-      </w:r>
-    </w:p>
-    <w:p>
-      <w:r>
-        <w:t xml:space="preserve">В ходе выполнения домашней работы была построена многоуровневая функциональная модель деятельности компьютерной компании с использованием методологии </w:t>
-      </w:r>
-      <w:r>
-        <w:rPr>
-          <w:lang w:val="en-US"/>
-        </w:rPr>
-        <w:t>IDEF</w:t>
-      </w:r>
-      <w:r>
-        <w:t>0. Модель охватывает иерархию процессов: от общей контекстной диаграммы до детальной декомпозиции выездной диагностики техники.</w:t>
-      </w:r>
-    </w:p>
-    <w:p>
-      <w:r>
-        <w:t>Результаты:</w:t>
-      </w:r>
-    </w:p>
-    <w:p>
-      <w:r>
-        <w:t>Сформирована полная структура бизнес-процессов компании (продажа, сборка, ремонт, монтаж сетей, управление).</w:t>
-      </w:r>
-    </w:p>
-    <w:p>
-      <w:r>
-        <w:t>Детально проработаны процессы ремонта и диагностики, учтены варианты выездного и стационарного обслуживания.</w:t>
-      </w:r>
-    </w:p>
-    <w:p>
-      <w:r>
-        <w:t xml:space="preserve">Корректно распределены потоки данных, материальных ресурсов, управляющих воздействий и механизмов между функциональными блоками согласно правилам синтаксиса </w:t>
-      </w:r>
-      <w:r>
-        <w:rPr>
-          <w:lang w:val="en-US"/>
-        </w:rPr>
-        <w:t>IDEF</w:t>
-      </w:r>
-      <w:r>
-        <w:t>0.</w:t>
-      </w:r>
-    </w:p>
-    <w:p>
-      <w:r>
-        <w:t>Освоенные навыки:</w:t>
-      </w:r>
-    </w:p>
-    <w:p>
-      <w:r>
-        <w:lastRenderedPageBreak/>
-        <w:t xml:space="preserve">Применение методологии функционального моделирования </w:t>
-      </w:r>
-      <w:r>
-        <w:rPr>
-          <w:lang w:val="en-US"/>
-        </w:rPr>
-        <w:t>IDEF</w:t>
-      </w:r>
-      <w:r>
-        <w:t>0 на практике.</w:t>
-      </w:r>
-    </w:p>
-    <w:p>
-      <w:r>
-        <w:t>Выявление и классификация входов, выходов, механизмов и элементов управления бизнес-процессов.</w:t>
-      </w:r>
-    </w:p>
-    <w:p>
-      <w:r>
-        <w:t>Построение иерархических моделей с использованием метода декомпозиции.</w:t>
-      </w:r>
-    </w:p>
-    <w:p>
-      <w:r>
-        <w:t>Структурирование информации о деятельности предприятия для целей анализа, реинжиниринга и дальнейшей автоматизации корпоративной информационной системы.</w:t>
-      </w:r>
-    </w:p>
-    <w:p>
-      <w:pPr>
-        <w:pStyle w:val="1"/>
-      </w:pPr>
-      <w:r>
-        <w:t>7. Литература</w:t>
-      </w:r>
-    </w:p>
-    <w:p>
-      <w:proofErr w:type="spellStart"/>
-      <w:r>
-        <w:t>Вендров</w:t>
-      </w:r>
-      <w:proofErr w:type="spellEnd"/>
-      <w:r>
-        <w:t xml:space="preserve"> А.А. Проектирование программного обеспечения экономических информационных систем: Учебник. — 2-е изд., </w:t>
-      </w:r>
-      <w:proofErr w:type="spellStart"/>
-      <w:r>
-        <w:t>перераб</w:t>
-      </w:r>
-      <w:proofErr w:type="spellEnd"/>
-      <w:r>
-        <w:t>. и доп. — М.: Финансы и статистика, 2006. — 544 с.</w:t>
-      </w:r>
-    </w:p>
-    <w:p>
-      <w:proofErr w:type="spellStart"/>
-      <w:r>
-        <w:t>Калянов</w:t>
-      </w:r>
-      <w:proofErr w:type="spellEnd"/>
-      <w:r>
-        <w:t xml:space="preserve"> Г.Н. Структура и организация моделей в методологии </w:t>
-      </w:r>
-      <w:r>
-        <w:rPr>
-          <w:lang w:val="en-US"/>
-        </w:rPr>
-        <w:t>IDEF</w:t>
-      </w:r>
-      <w:r>
-        <w:t>. — М.: СИНТЕГ, 2000. — 244 с.</w:t>
-      </w:r>
-    </w:p>
-    <w:p>
-      <w:proofErr w:type="spellStart"/>
-      <w:r>
-        <w:t>Елиферов</w:t>
-      </w:r>
-      <w:proofErr w:type="spellEnd"/>
-      <w:r>
-        <w:t xml:space="preserve"> В.Г., Репин В.В. Бизнес-процессы: Регламентация и управление. — М.: ИНФРА-М, 2004. — 319 с.</w:t>
-      </w:r>
     </w:p>
     <w:p>
       <w:pPr>
@@ -8132,45 +10122,152 @@
           <w:lang w:val="en-US"/>
         </w:rPr>
       </w:pPr>
+    </w:p>
+    <w:p>
+      <w:pPr>
+        <w:pStyle w:val="21"/>
+      </w:pPr>
+      <w:r>
+        <w:t>5.4. Декомпозиция диагностирования проблемы (</w:t>
+      </w:r>
       <w:r>
         <w:rPr>
           <w:lang w:val="en-US"/>
         </w:rPr>
-        <w:t>FIPS PUB 183. Integration Definition for Function Modeling (IDEF0). — National Institute of Standards and Technology (NIST), 1993.</w:t>
+        <w:t>A</w:t>
+      </w:r>
+      <w:r>
+        <w:t>3.1)</w:t>
       </w:r>
     </w:p>
     <w:p>
       <w:r>
-        <w:t xml:space="preserve">ГОСТ </w:t>
-      </w:r>
-      <w:proofErr w:type="gramStart"/>
-      <w:r>
-        <w:t>34.601-90</w:t>
-      </w:r>
-      <w:proofErr w:type="gramEnd"/>
-      <w:r>
-        <w:t>. Информационная технология. Комплекс стандартов на автоматизированные системы. Автоматизированные системы. Стадии создания. — М.: Изд-во стандартов, 1991.</w:t>
+        <w:t>Процесс диагностики разделен на три блока (Таблицы 11 и 12):</w:t>
       </w:r>
     </w:p>
     <w:p>
       <w:r>
-        <w:t xml:space="preserve">ГОСТ Р ИСО </w:t>
-      </w:r>
-      <w:proofErr w:type="gramStart"/>
-      <w:r>
-        <w:t>9001-2015</w:t>
-      </w:r>
-      <w:proofErr w:type="gramEnd"/>
-      <w:r>
-        <w:t xml:space="preserve">. Системы менеджмента качества. Требования. — М.: </w:t>
-      </w:r>
-      <w:proofErr w:type="spellStart"/>
-      <w:r>
-        <w:t>Стандартинформ</w:t>
-      </w:r>
-      <w:proofErr w:type="spellEnd"/>
-      <w:r>
-        <w:t>, 2015. — 32 с.</w:t>
+        <w:t>Определение запроса клиента (</w:t>
+      </w:r>
+      <w:r>
+        <w:rPr>
+          <w:lang w:val="en-US"/>
+        </w:rPr>
+        <w:t>A</w:t>
+      </w:r>
+      <w:r>
+        <w:t>3.1.1) – анализ необходимого формата диагностики (выездная или локальная).</w:t>
+      </w:r>
+    </w:p>
+    <w:p>
+      <w:r>
+        <w:t>Диагностика на дом клиента (</w:t>
+      </w:r>
+      <w:r>
+        <w:rPr>
+          <w:lang w:val="en-US"/>
+        </w:rPr>
+        <w:t>A</w:t>
+      </w:r>
+      <w:r>
+        <w:t>3.1.2) – проведение выездных работ.</w:t>
+      </w:r>
+    </w:p>
+    <w:p>
+      <w:r>
+        <w:t>Диагностика внутри центра (</w:t>
+      </w:r>
+      <w:r>
+        <w:rPr>
+          <w:lang w:val="en-US"/>
+        </w:rPr>
+        <w:t>A</w:t>
+      </w:r>
+      <w:r>
+        <w:t>3.1.3) – проведение работ в условиях сервисного центра.</w:t>
+      </w:r>
+    </w:p>
+    <w:p>
+      <w:pPr>
+        <w:pStyle w:val="21"/>
+      </w:pPr>
+      <w:r>
+        <w:t>5.5. Моделирование выездной диагностики (</w:t>
+      </w:r>
+      <w:r>
+        <w:rPr>
+          <w:lang w:val="en-US"/>
+        </w:rPr>
+        <w:t>A</w:t>
+      </w:r>
+      <w:r>
+        <w:t>3.1.2)</w:t>
+      </w:r>
+    </w:p>
+    <w:p>
+      <w:r>
+        <w:t>Детализация процесса диагностики на дому (Таблицы 13 и 14) включает следующие шаги:</w:t>
+      </w:r>
+    </w:p>
+    <w:p>
+      <w:r>
+        <w:t>Выезд к клиенту (</w:t>
+      </w:r>
+      <w:r>
+        <w:rPr>
+          <w:lang w:val="en-US"/>
+        </w:rPr>
+        <w:t>A</w:t>
+      </w:r>
+      <w:r>
+        <w:t>3.1.1.1) – прибытие специалиста.</w:t>
+      </w:r>
+    </w:p>
+    <w:p>
+      <w:r>
+        <w:t>Первичное тестирование (</w:t>
+      </w:r>
+      <w:r>
+        <w:rPr>
+          <w:lang w:val="en-US"/>
+        </w:rPr>
+        <w:t>A</w:t>
+      </w:r>
+      <w:r>
+        <w:t>3.1.1.2) – оценка возможности ремонта на месте.</w:t>
+      </w:r>
+    </w:p>
+    <w:p>
+      <w:r>
+        <w:t>Ремонт на месте (</w:t>
+      </w:r>
+      <w:r>
+        <w:rPr>
+          <w:lang w:val="en-US"/>
+        </w:rPr>
+        <w:t>A</w:t>
+      </w:r>
+      <w:r>
+        <w:t>3.1.1.3) – устранение неисправности у клиента.</w:t>
+      </w:r>
+    </w:p>
+    <w:p>
+      <w:r>
+        <w:t>Транспортировка устройства (</w:t>
+      </w:r>
+      <w:r>
+        <w:rPr>
+          <w:lang w:val="en-US"/>
+        </w:rPr>
+        <w:t>A</w:t>
+      </w:r>
+      <w:r>
+        <w:t>3.1.1.4) – доставка в сервис, если ремонт на месте невозможен или не удался.</w:t>
+      </w:r>
+    </w:p>
+    <w:p>
+      <w:r>
+        <w:t>Данный уровень учитывает правила оповещения клиента, ограничения выездного ремонта и требования к упаковке устройств при транспортировке.</w:t>
       </w:r>
     </w:p>
     <w:p>
@@ -8178,6 +10275,198 @@
         <w:pStyle w:val="1"/>
       </w:pPr>
       <w:r>
+        <w:t>6. Заключение</w:t>
+      </w:r>
+    </w:p>
+    <w:p>
+      <w:r>
+        <w:t xml:space="preserve">В ходе выполнения домашней работы была построена многоуровневая функциональная модель деятельности компьютерной компании с </w:t>
+      </w:r>
+      <w:r>
+        <w:lastRenderedPageBreak/>
+        <w:t xml:space="preserve">использованием методологии </w:t>
+      </w:r>
+      <w:r>
+        <w:rPr>
+          <w:lang w:val="en-US"/>
+        </w:rPr>
+        <w:t>IDEF</w:t>
+      </w:r>
+      <w:r>
+        <w:t>0. Модель охватывает иерархию процессов: от общей контекстной диаграммы до детальной декомпозиции выездной диагностики техники.</w:t>
+      </w:r>
+    </w:p>
+    <w:p>
+      <w:r>
+        <w:t>Результаты:</w:t>
+      </w:r>
+    </w:p>
+    <w:p>
+      <w:r>
+        <w:t>Сформирована полная структура бизнес-процессов компании (продажа, сборка, ремонт, монтаж сетей, управление).</w:t>
+      </w:r>
+    </w:p>
+    <w:p>
+      <w:r>
+        <w:t>Детально проработаны процессы ремонта и диагностики, учтены варианты выездного и стационарного обслуживания.</w:t>
+      </w:r>
+    </w:p>
+    <w:p>
+      <w:r>
+        <w:t xml:space="preserve">Корректно распределены потоки данных, материальных ресурсов, управляющих воздействий и механизмов между функциональными блоками согласно правилам синтаксиса </w:t>
+      </w:r>
+      <w:r>
+        <w:rPr>
+          <w:lang w:val="en-US"/>
+        </w:rPr>
+        <w:t>IDEF</w:t>
+      </w:r>
+      <w:r>
+        <w:t>0.</w:t>
+      </w:r>
+    </w:p>
+    <w:p>
+      <w:r>
+        <w:t>Освоенные навыки:</w:t>
+      </w:r>
+    </w:p>
+    <w:p>
+      <w:r>
+        <w:t xml:space="preserve">Применение методологии функционального моделирования </w:t>
+      </w:r>
+      <w:r>
+        <w:rPr>
+          <w:lang w:val="en-US"/>
+        </w:rPr>
+        <w:t>IDEF</w:t>
+      </w:r>
+      <w:r>
+        <w:t>0 на практике.</w:t>
+      </w:r>
+    </w:p>
+    <w:p>
+      <w:r>
+        <w:t>Выявление и классификация входов, выходов, механизмов и элементов управления бизнес-процессов.</w:t>
+      </w:r>
+    </w:p>
+    <w:p>
+      <w:r>
+        <w:t>Построение иерархических моделей с использованием метода декомпозиции.</w:t>
+      </w:r>
+    </w:p>
+    <w:p>
+      <w:r>
+        <w:t>Структурирование информации о деятельности предприятия для целей анализа, реинжиниринга и дальнейшей автоматизации корпоративной информационной системы.</w:t>
+      </w:r>
+    </w:p>
+    <w:p>
+      <w:pPr>
+        <w:pStyle w:val="1"/>
+      </w:pPr>
+      <w:r>
+        <w:t>7. Литература</w:t>
+      </w:r>
+    </w:p>
+    <w:p>
+      <w:proofErr w:type="spellStart"/>
+      <w:r>
+        <w:t>Вендров</w:t>
+      </w:r>
+      <w:proofErr w:type="spellEnd"/>
+      <w:r>
+        <w:t xml:space="preserve"> А.А. Проектирование программного обеспечения экономических информационных систем: Учебник. — 2-е изд., </w:t>
+      </w:r>
+      <w:proofErr w:type="spellStart"/>
+      <w:r>
+        <w:t>перераб</w:t>
+      </w:r>
+      <w:proofErr w:type="spellEnd"/>
+      <w:r>
+        <w:t>. и доп. — М.: Финансы и статистика, 2006. — 544 с.</w:t>
+      </w:r>
+    </w:p>
+    <w:p>
+      <w:proofErr w:type="spellStart"/>
+      <w:r>
+        <w:t>Калянов</w:t>
+      </w:r>
+      <w:proofErr w:type="spellEnd"/>
+      <w:r>
+        <w:t xml:space="preserve"> Г.Н. Структура и организация моделей в методологии </w:t>
+      </w:r>
+      <w:r>
+        <w:rPr>
+          <w:lang w:val="en-US"/>
+        </w:rPr>
+        <w:t>IDEF</w:t>
+      </w:r>
+      <w:r>
+        <w:t>. — М.: СИНТЕГ, 2000. — 244 с.</w:t>
+      </w:r>
+    </w:p>
+    <w:p>
+      <w:proofErr w:type="spellStart"/>
+      <w:r>
+        <w:t>Елиферов</w:t>
+      </w:r>
+      <w:proofErr w:type="spellEnd"/>
+      <w:r>
+        <w:t xml:space="preserve"> В.Г., Репин В.В. Бизнес-процессы: Регламентация и управление. — М.: ИНФРА-М, 2004. — 319 с.</w:t>
+      </w:r>
+    </w:p>
+    <w:p>
+      <w:pPr>
+        <w:rPr>
+          <w:lang w:val="en-US"/>
+        </w:rPr>
+      </w:pPr>
+      <w:r>
+        <w:rPr>
+          <w:lang w:val="en-US"/>
+        </w:rPr>
+        <w:lastRenderedPageBreak/>
+        <w:t>FIPS PUB 183. Integration Definition for Function Modeling (IDEF0). — National Institute of Standards and Technology (NIST), 1993.</w:t>
+      </w:r>
+    </w:p>
+    <w:p>
+      <w:r>
+        <w:t xml:space="preserve">ГОСТ </w:t>
+      </w:r>
+      <w:proofErr w:type="gramStart"/>
+      <w:r>
+        <w:t>34.601-90</w:t>
+      </w:r>
+      <w:proofErr w:type="gramEnd"/>
+      <w:r>
+        <w:t>. Информационная технология. Комплекс стандартов на автоматизированные системы. Автоматизированные системы. Стадии создания. — М.: Изд-во стандартов, 1991.</w:t>
+      </w:r>
+    </w:p>
+    <w:p>
+      <w:r>
+        <w:t xml:space="preserve">ГОСТ Р ИСО </w:t>
+      </w:r>
+      <w:proofErr w:type="gramStart"/>
+      <w:r>
+        <w:t>9001-2015</w:t>
+      </w:r>
+      <w:proofErr w:type="gramEnd"/>
+      <w:r>
+        <w:t xml:space="preserve">. Системы менеджмента качества. Требования. — М.: </w:t>
+      </w:r>
+      <w:proofErr w:type="spellStart"/>
+      <w:r>
+        <w:t>Стандартинформ</w:t>
+      </w:r>
+      <w:proofErr w:type="spellEnd"/>
+      <w:r>
+        <w:t>, 2015. — 32 с.</w:t>
+      </w:r>
+    </w:p>
+    <w:p>
+      <w:pPr>
+        <w:pStyle w:val="1"/>
+      </w:pPr>
+      <w:r>
         <w:t>8. Приложения</w:t>
       </w:r>
     </w:p>
@@ -8211,7 +10500,6 @@
     </w:p>
     <w:p>
       <w:r>
-        <w:lastRenderedPageBreak/>
         <w:t>Приложение В. Диаграмма декомпозиции процесса «Ремонт» (</w:t>
       </w:r>
       <w:r>
@@ -9165,6 +11453,33 @@
       </w:tblBorders>
     </w:tblPr>
   </w:style>
+  <w:style w:type="table" w:customStyle="1" w:styleId="22">
+    <w:name w:val="Сетка таблицы2"/>
+    <w:basedOn w:val="a1"/>
+    <w:next w:val="aa"/>
+    <w:uiPriority w:val="59"/>
+    <w:rsid w:val="00A75C4A"/>
+    <w:pPr>
+      <w:suppressAutoHyphens/>
+    </w:pPr>
+    <w:rPr>
+      <w:rFonts w:ascii="Calibri" w:eastAsia="MS Mincho" w:hAnsi="Calibri" w:cs="Calibri"/>
+      <w:sz w:val="22"/>
+      <w:szCs w:val="22"/>
+      <w:lang w:eastAsia="en-US"/>
+    </w:rPr>
+    <w:tblPr>
+      <w:tblInd w:w="0" w:type="nil"/>
+      <w:tblBorders>
+        <w:top w:val="single" w:sz="4" w:space="0" w:color="auto"/>
+        <w:left w:val="single" w:sz="4" w:space="0" w:color="auto"/>
+        <w:bottom w:val="single" w:sz="4" w:space="0" w:color="auto"/>
+        <w:right w:val="single" w:sz="4" w:space="0" w:color="auto"/>
+        <w:insideH w:val="single" w:sz="4" w:space="0" w:color="auto"/>
+        <w:insideV w:val="single" w:sz="4" w:space="0" w:color="auto"/>
+      </w:tblBorders>
+    </w:tblPr>
+  </w:style>
 </w:styles>
 </file>
 

</xml_diff>

<commit_message>
vault backup: 2026-10-13 14:12:30
</commit_message>
<xml_diff>
--- a/ПРЕДМЕТЫ/Архитектура предприятий и корпоративных информационных систем/Лабы/Лаба 1/Поповкин. Лабораторная работа 1.docx
+++ b/ПРЕДМЕТЫ/Архитектура предприятий и корпоративных информационных систем/Лабы/Лаба 1/Поповкин. Лабораторная работа 1.docx
@@ -630,10 +630,80 @@
     </w:p>
     <w:p>
       <w:pPr>
+        <w:pStyle w:val="af0"/>
+      </w:pPr>
+      <w:r>
         <w:rPr>
+          <w:noProof/>
           <w:lang w:val="en-US"/>
         </w:rPr>
-      </w:pPr>
+        <w:lastRenderedPageBreak/>
+        <w:drawing>
+          <wp:anchor distT="0" distB="0" distL="114300" distR="114300" simplePos="0" relativeHeight="251656192" behindDoc="0" locked="0" layoutInCell="1" allowOverlap="1" wp14:anchorId="3F00D65B" wp14:editId="7A205CA2">
+            <wp:simplePos x="0" y="0"/>
+            <wp:positionH relativeFrom="column">
+              <wp:posOffset>0</wp:posOffset>
+            </wp:positionH>
+            <wp:positionV relativeFrom="paragraph">
+              <wp:posOffset>0</wp:posOffset>
+            </wp:positionV>
+            <wp:extent cx="6119495" cy="4324350"/>
+            <wp:effectExtent l="0" t="0" r="0" b="0"/>
+            <wp:wrapTopAndBottom/>
+            <wp:docPr id="911194116" name="Рисунок 2"/>
+            <wp:cNvGraphicFramePr>
+              <a:graphicFrameLocks xmlns:a="http://schemas.openxmlformats.org/drawingml/2006/main" noChangeAspect="1"/>
+            </wp:cNvGraphicFramePr>
+            <a:graphic xmlns:a="http://schemas.openxmlformats.org/drawingml/2006/main">
+              <a:graphicData uri="http://schemas.openxmlformats.org/drawingml/2006/picture">
+                <pic:pic xmlns:pic="http://schemas.openxmlformats.org/drawingml/2006/picture">
+                  <pic:nvPicPr>
+                    <pic:cNvPr id="0" name="Picture 3"/>
+                    <pic:cNvPicPr>
+                      <a:picLocks noChangeAspect="1" noChangeArrowheads="1"/>
+                    </pic:cNvPicPr>
+                  </pic:nvPicPr>
+                  <pic:blipFill>
+                    <a:blip r:embed="rId8">
+                      <a:extLst>
+                        <a:ext uri="{28A0092B-C50C-407E-A947-70E740481C1C}">
+                          <a14:useLocalDpi xmlns:a14="http://schemas.microsoft.com/office/drawing/2010/main" val="0"/>
+                        </a:ext>
+                      </a:extLst>
+                    </a:blip>
+                    <a:srcRect/>
+                    <a:stretch>
+                      <a:fillRect/>
+                    </a:stretch>
+                  </pic:blipFill>
+                  <pic:spPr bwMode="auto">
+                    <a:xfrm>
+                      <a:off x="0" y="0"/>
+                      <a:ext cx="6119495" cy="4324350"/>
+                    </a:xfrm>
+                    <a:prstGeom prst="rect">
+                      <a:avLst/>
+                    </a:prstGeom>
+                    <a:noFill/>
+                    <a:ln>
+                      <a:noFill/>
+                    </a:ln>
+                  </pic:spPr>
+                </pic:pic>
+              </a:graphicData>
+            </a:graphic>
+            <wp14:sizeRelH relativeFrom="page">
+              <wp14:pctWidth>0</wp14:pctWidth>
+            </wp14:sizeRelH>
+            <wp14:sizeRelV relativeFrom="page">
+              <wp14:pctHeight>0</wp14:pctHeight>
+            </wp14:sizeRelV>
+          </wp:anchor>
+        </w:drawing>
+      </w:r>
+      <w:r>
+        <w:t>Рисунок 1 – Контекстная диаграмма деятельности компьютерной компании</w:t>
+      </w:r>
     </w:p>
     <w:p>
       <w:pPr>
@@ -644,7 +714,6 @@
         </w:rPr>
       </w:pPr>
       <w:r>
-        <w:lastRenderedPageBreak/>
         <w:t>Таблица 1 – Процессы диаграммы A-0</w:t>
       </w:r>
     </w:p>
@@ -1031,6 +1100,7 @@
               <w:pStyle w:val="ac"/>
             </w:pPr>
             <w:r>
+              <w:lastRenderedPageBreak/>
               <w:t>A0.4</w:t>
             </w:r>
           </w:p>
@@ -1533,11 +1603,7 @@
               <w:pStyle w:val="ac"/>
             </w:pPr>
             <w:r>
-              <w:t xml:space="preserve">Исполнитель </w:t>
-            </w:r>
-            <w:r>
-              <w:lastRenderedPageBreak/>
-              <w:t>финансового учета.</w:t>
+              <w:t>Исполнитель финансового учета.</w:t>
             </w:r>
           </w:p>
         </w:tc>
@@ -1552,7 +1618,6 @@
             </w:pPr>
             <w:proofErr w:type="spellStart"/>
             <w:r>
-              <w:lastRenderedPageBreak/>
               <w:t>Mechanism</w:t>
             </w:r>
             <w:proofErr w:type="spellEnd"/>
@@ -2110,6 +2175,7 @@
               <w:pStyle w:val="ac"/>
             </w:pPr>
             <w:r>
+              <w:lastRenderedPageBreak/>
               <w:t>A0.22</w:t>
             </w:r>
           </w:p>
@@ -2413,7 +2479,6 @@
         <w:pStyle w:val="21"/>
       </w:pPr>
       <w:r>
-        <w:lastRenderedPageBreak/>
         <w:t>5.2. Декомпозиция деятельности компьютерной компании (</w:t>
       </w:r>
       <w:r>
@@ -2430,7 +2495,6 @@
       <w:pPr>
         <w:rPr>
           <w:szCs w:val="28"/>
-          <w:lang w:val="en-US"/>
         </w:rPr>
       </w:pPr>
       <w:r>
@@ -2442,6 +2506,131 @@
         </w:rPr>
         <w:t>передается из процессов сборки и ремонта в процесс «Управление»).</w:t>
       </w:r>
+    </w:p>
+    <w:p>
+      <w:pPr>
+        <w:rPr>
+          <w:szCs w:val="28"/>
+        </w:rPr>
+      </w:pPr>
+    </w:p>
+    <w:p>
+      <w:pPr>
+        <w:rPr>
+          <w:szCs w:val="28"/>
+        </w:rPr>
+      </w:pPr>
+    </w:p>
+    <w:p>
+      <w:pPr>
+        <w:rPr>
+          <w:szCs w:val="28"/>
+        </w:rPr>
+      </w:pPr>
+    </w:p>
+    <w:p>
+      <w:pPr>
+        <w:rPr>
+          <w:szCs w:val="28"/>
+        </w:rPr>
+      </w:pPr>
+    </w:p>
+    <w:p>
+      <w:pPr>
+        <w:rPr>
+          <w:szCs w:val="28"/>
+        </w:rPr>
+      </w:pPr>
+    </w:p>
+    <w:p>
+      <w:pPr>
+        <w:rPr>
+          <w:szCs w:val="28"/>
+        </w:rPr>
+      </w:pPr>
+    </w:p>
+    <w:p>
+      <w:pPr>
+        <w:pStyle w:val="af0"/>
+      </w:pPr>
+      <w:r>
+        <w:rPr>
+          <w:noProof/>
+          <w:szCs w:val="28"/>
+          <w:lang w:val="en-US"/>
+        </w:rPr>
+        <w:lastRenderedPageBreak/>
+        <w:drawing>
+          <wp:anchor distT="0" distB="0" distL="114300" distR="114300" simplePos="0" relativeHeight="251657216" behindDoc="0" locked="0" layoutInCell="1" allowOverlap="1" wp14:anchorId="37BEC60F" wp14:editId="0381F012">
+            <wp:simplePos x="0" y="0"/>
+            <wp:positionH relativeFrom="column">
+              <wp:posOffset>0</wp:posOffset>
+            </wp:positionH>
+            <wp:positionV relativeFrom="paragraph">
+              <wp:posOffset>-263951</wp:posOffset>
+            </wp:positionV>
+            <wp:extent cx="6119495" cy="4324350"/>
+            <wp:effectExtent l="0" t="0" r="0" b="0"/>
+            <wp:wrapTopAndBottom/>
+            <wp:docPr id="81708121" name="Рисунок 3"/>
+            <wp:cNvGraphicFramePr>
+              <a:graphicFrameLocks xmlns:a="http://schemas.openxmlformats.org/drawingml/2006/main" noChangeAspect="1"/>
+            </wp:cNvGraphicFramePr>
+            <a:graphic xmlns:a="http://schemas.openxmlformats.org/drawingml/2006/main">
+              <a:graphicData uri="http://schemas.openxmlformats.org/drawingml/2006/picture">
+                <pic:pic xmlns:pic="http://schemas.openxmlformats.org/drawingml/2006/picture">
+                  <pic:nvPicPr>
+                    <pic:cNvPr id="0" name="Picture 4"/>
+                    <pic:cNvPicPr>
+                      <a:picLocks noChangeAspect="1" noChangeArrowheads="1"/>
+                    </pic:cNvPicPr>
+                  </pic:nvPicPr>
+                  <pic:blipFill>
+                    <a:blip r:embed="rId9">
+                      <a:extLst>
+                        <a:ext uri="{28A0092B-C50C-407E-A947-70E740481C1C}">
+                          <a14:useLocalDpi xmlns:a14="http://schemas.microsoft.com/office/drawing/2010/main" val="0"/>
+                        </a:ext>
+                      </a:extLst>
+                    </a:blip>
+                    <a:srcRect/>
+                    <a:stretch>
+                      <a:fillRect/>
+                    </a:stretch>
+                  </pic:blipFill>
+                  <pic:spPr bwMode="auto">
+                    <a:xfrm>
+                      <a:off x="0" y="0"/>
+                      <a:ext cx="6119495" cy="4324350"/>
+                    </a:xfrm>
+                    <a:prstGeom prst="rect">
+                      <a:avLst/>
+                    </a:prstGeom>
+                    <a:noFill/>
+                    <a:ln>
+                      <a:noFill/>
+                    </a:ln>
+                  </pic:spPr>
+                </pic:pic>
+              </a:graphicData>
+            </a:graphic>
+            <wp14:sizeRelH relativeFrom="page">
+              <wp14:pctWidth>0</wp14:pctWidth>
+            </wp14:sizeRelH>
+            <wp14:sizeRelV relativeFrom="page">
+              <wp14:pctHeight>0</wp14:pctHeight>
+            </wp14:sizeRelV>
+          </wp:anchor>
+        </w:drawing>
+      </w:r>
+      <w:r>
+        <w:t>Рисунок 2 – Декомпозиция деятельности компьютерной компании</w:t>
+      </w:r>
+    </w:p>
+    <w:p>
+      <w:pPr>
+        <w:pStyle w:val="ae"/>
+      </w:pPr>
     </w:p>
     <w:p>
       <w:pPr>
@@ -3060,6 +3249,7 @@
         </w:rPr>
       </w:pPr>
       <w:r>
+        <w:lastRenderedPageBreak/>
         <w:t>Таблица 4 – Стрелки диаграммы A0</w:t>
       </w:r>
     </w:p>
@@ -3554,15 +3744,7 @@
                 <w:rFonts w:ascii="Times New Roman" w:hAnsi="Times New Roman" w:cs="Times New Roman"/>
                 <w:szCs w:val="28"/>
               </w:rPr>
-              <w:t xml:space="preserve">Оплата товаров и </w:t>
-            </w:r>
-            <w:r>
-              <w:rPr>
-                <w:rFonts w:ascii="Times New Roman" w:hAnsi="Times New Roman" w:cs="Times New Roman"/>
-                <w:szCs w:val="28"/>
-              </w:rPr>
-              <w:lastRenderedPageBreak/>
-              <w:t>услуг.</w:t>
+              <w:t>Оплата товаров и услуг.</w:t>
             </w:r>
           </w:p>
         </w:tc>
@@ -3593,7 +3775,6 @@
                 <w:rFonts w:ascii="Times New Roman" w:hAnsi="Times New Roman" w:cs="Times New Roman"/>
                 <w:szCs w:val="28"/>
               </w:rPr>
-              <w:lastRenderedPageBreak/>
               <w:t>Input</w:t>
             </w:r>
             <w:proofErr w:type="spellEnd"/>
@@ -4783,6 +4964,7 @@
                 <w:rFonts w:ascii="Times New Roman" w:hAnsi="Times New Roman" w:cs="Times New Roman"/>
                 <w:szCs w:val="28"/>
               </w:rPr>
+              <w:lastRenderedPageBreak/>
               <w:t>A0.13</w:t>
             </w:r>
           </w:p>
@@ -5308,7 +5490,6 @@
                 <w:rFonts w:ascii="Times New Roman" w:hAnsi="Times New Roman" w:cs="Times New Roman"/>
                 <w:szCs w:val="28"/>
               </w:rPr>
-              <w:lastRenderedPageBreak/>
               <w:t>A0.17</w:t>
             </w:r>
           </w:p>
@@ -6627,7 +6808,15 @@
                 <w:rFonts w:ascii="Times New Roman" w:hAnsi="Times New Roman" w:cs="Times New Roman"/>
                 <w:szCs w:val="28"/>
               </w:rPr>
-              <w:t>Мастер сборки ПК</w:t>
+              <w:t xml:space="preserve">Мастер сборки </w:t>
+            </w:r>
+            <w:r>
+              <w:rPr>
+                <w:rFonts w:ascii="Times New Roman" w:hAnsi="Times New Roman" w:cs="Times New Roman"/>
+                <w:szCs w:val="28"/>
+              </w:rPr>
+              <w:lastRenderedPageBreak/>
+              <w:t>ПК</w:t>
             </w:r>
           </w:p>
         </w:tc>
@@ -6657,7 +6846,16 @@
                 <w:rFonts w:ascii="Times New Roman" w:hAnsi="Times New Roman" w:cs="Times New Roman"/>
                 <w:szCs w:val="28"/>
               </w:rPr>
-              <w:t>Сборка компьютеров.</w:t>
+              <w:lastRenderedPageBreak/>
+              <w:t xml:space="preserve">Сборка </w:t>
+            </w:r>
+            <w:r>
+              <w:rPr>
+                <w:rFonts w:ascii="Times New Roman" w:hAnsi="Times New Roman" w:cs="Times New Roman"/>
+                <w:szCs w:val="28"/>
+              </w:rPr>
+              <w:lastRenderedPageBreak/>
+              <w:t>компьютеров.</w:t>
             </w:r>
           </w:p>
         </w:tc>
@@ -6688,6 +6886,7 @@
                 <w:rFonts w:ascii="Times New Roman" w:hAnsi="Times New Roman" w:cs="Times New Roman"/>
                 <w:szCs w:val="28"/>
               </w:rPr>
+              <w:lastRenderedPageBreak/>
               <w:t>Mechanism</w:t>
             </w:r>
             <w:proofErr w:type="spellEnd"/>
@@ -7135,15 +7334,7 @@
                 <w:rFonts w:ascii="Times New Roman" w:hAnsi="Times New Roman" w:cs="Times New Roman"/>
                 <w:szCs w:val="28"/>
               </w:rPr>
-              <w:t xml:space="preserve">Специалист по </w:t>
-            </w:r>
-            <w:r>
-              <w:rPr>
-                <w:rFonts w:ascii="Times New Roman" w:hAnsi="Times New Roman" w:cs="Times New Roman"/>
-                <w:szCs w:val="28"/>
-              </w:rPr>
-              <w:lastRenderedPageBreak/>
-              <w:t>сетям</w:t>
+              <w:t>Специалист по сетям</w:t>
             </w:r>
           </w:p>
         </w:tc>
@@ -7173,7 +7364,6 @@
                 <w:rFonts w:ascii="Times New Roman" w:hAnsi="Times New Roman" w:cs="Times New Roman"/>
                 <w:szCs w:val="28"/>
               </w:rPr>
-              <w:lastRenderedPageBreak/>
               <w:t>Работы по ЛВС.</w:t>
             </w:r>
           </w:p>
@@ -7836,9 +8026,77 @@
       <w:pPr>
         <w:rPr>
           <w:szCs w:val="28"/>
-          <w:lang w:val="en-US"/>
         </w:rPr>
       </w:pPr>
+      <w:r>
+        <w:rPr>
+          <w:noProof/>
+          <w:szCs w:val="28"/>
+        </w:rPr>
+        <w:lastRenderedPageBreak/>
+        <w:drawing>
+          <wp:anchor distT="0" distB="0" distL="114300" distR="114300" simplePos="0" relativeHeight="251658240" behindDoc="0" locked="0" layoutInCell="1" allowOverlap="1" wp14:anchorId="2EA7CA7F" wp14:editId="19293C42">
+            <wp:simplePos x="0" y="0"/>
+            <wp:positionH relativeFrom="column">
+              <wp:posOffset>0</wp:posOffset>
+            </wp:positionH>
+            <wp:positionV relativeFrom="paragraph">
+              <wp:posOffset>656832</wp:posOffset>
+            </wp:positionV>
+            <wp:extent cx="6119495" cy="4324350"/>
+            <wp:effectExtent l="0" t="0" r="0" b="0"/>
+            <wp:wrapTopAndBottom/>
+            <wp:docPr id="62943369" name="Рисунок 4"/>
+            <wp:cNvGraphicFramePr>
+              <a:graphicFrameLocks xmlns:a="http://schemas.openxmlformats.org/drawingml/2006/main" noChangeAspect="1"/>
+            </wp:cNvGraphicFramePr>
+            <a:graphic xmlns:a="http://schemas.openxmlformats.org/drawingml/2006/main">
+              <a:graphicData uri="http://schemas.openxmlformats.org/drawingml/2006/picture">
+                <pic:pic xmlns:pic="http://schemas.openxmlformats.org/drawingml/2006/picture">
+                  <pic:nvPicPr>
+                    <pic:cNvPr id="0" name="Picture 5"/>
+                    <pic:cNvPicPr>
+                      <a:picLocks noChangeAspect="1" noChangeArrowheads="1"/>
+                    </pic:cNvPicPr>
+                  </pic:nvPicPr>
+                  <pic:blipFill>
+                    <a:blip r:embed="rId10">
+                      <a:extLst>
+                        <a:ext uri="{28A0092B-C50C-407E-A947-70E740481C1C}">
+                          <a14:useLocalDpi xmlns:a14="http://schemas.microsoft.com/office/drawing/2010/main" val="0"/>
+                        </a:ext>
+                      </a:extLst>
+                    </a:blip>
+                    <a:srcRect/>
+                    <a:stretch>
+                      <a:fillRect/>
+                    </a:stretch>
+                  </pic:blipFill>
+                  <pic:spPr bwMode="auto">
+                    <a:xfrm>
+                      <a:off x="0" y="0"/>
+                      <a:ext cx="6119495" cy="4324350"/>
+                    </a:xfrm>
+                    <a:prstGeom prst="rect">
+                      <a:avLst/>
+                    </a:prstGeom>
+                    <a:noFill/>
+                    <a:ln>
+                      <a:noFill/>
+                    </a:ln>
+                  </pic:spPr>
+                </pic:pic>
+              </a:graphicData>
+            </a:graphic>
+            <wp14:sizeRelH relativeFrom="page">
+              <wp14:pctWidth>0</wp14:pctWidth>
+            </wp14:sizeRelH>
+            <wp14:sizeRelV relativeFrom="page">
+              <wp14:pctHeight>0</wp14:pctHeight>
+            </wp14:sizeRelV>
+          </wp:anchor>
+        </w:drawing>
+      </w:r>
       <w:r>
         <w:t>Управляющими воздействиями выступают внутренние регламенты д</w:t>
       </w:r>
@@ -7848,6 +8106,28 @@
         </w:rPr>
         <w:t>иагностики, проведения ремонта в мастерской и оценки качества.</w:t>
       </w:r>
+    </w:p>
+    <w:p>
+      <w:pPr>
+        <w:pStyle w:val="af0"/>
+      </w:pPr>
+      <w:r>
+        <w:t xml:space="preserve">Рисунок </w:t>
+      </w:r>
+      <w:r>
+        <w:t>3</w:t>
+      </w:r>
+      <w:r>
+        <w:t xml:space="preserve"> – Декомпозиция процесса «Ремонт»</w:t>
+      </w:r>
+    </w:p>
+    <w:p>
+      <w:pPr>
+        <w:rPr>
+          <w:szCs w:val="28"/>
+          <w:lang w:val="en-US"/>
+        </w:rPr>
+      </w:pPr>
     </w:p>
     <w:p>
       <w:pPr>
@@ -8105,7 +8385,6 @@
                 <w:rFonts w:ascii="Times New Roman" w:hAnsi="Times New Roman" w:cs="Times New Roman"/>
                 <w:szCs w:val="28"/>
               </w:rPr>
-              <w:lastRenderedPageBreak/>
               <w:t>A3.2</w:t>
             </w:r>
           </w:p>
@@ -8474,6 +8753,7 @@
                 <w:rFonts w:ascii="Times New Roman" w:hAnsi="Times New Roman" w:cs="Times New Roman"/>
                 <w:szCs w:val="28"/>
               </w:rPr>
+              <w:lastRenderedPageBreak/>
               <w:t>A3.1</w:t>
             </w:r>
           </w:p>
@@ -9762,7 +10042,6 @@
                 <w:rFonts w:ascii="Times New Roman" w:hAnsi="Times New Roman" w:cs="Times New Roman"/>
                 <w:szCs w:val="28"/>
               </w:rPr>
-              <w:lastRenderedPageBreak/>
               <w:t>A3.11</w:t>
             </w:r>
           </w:p>
@@ -10077,7 +10356,15 @@
                 <w:rFonts w:ascii="Times New Roman" w:hAnsi="Times New Roman" w:cs="Times New Roman"/>
                 <w:szCs w:val="28"/>
               </w:rPr>
-              <w:t>Запчасти, инструменты и оборудование.</w:t>
+              <w:t xml:space="preserve">Запчасти, инструменты и </w:t>
+            </w:r>
+            <w:r>
+              <w:rPr>
+                <w:rFonts w:ascii="Times New Roman" w:hAnsi="Times New Roman" w:cs="Times New Roman"/>
+                <w:szCs w:val="28"/>
+              </w:rPr>
+              <w:lastRenderedPageBreak/>
+              <w:t>оборудование.</w:t>
             </w:r>
           </w:p>
         </w:tc>
@@ -10108,6 +10395,7 @@
                 <w:rFonts w:ascii="Times New Roman" w:hAnsi="Times New Roman" w:cs="Times New Roman"/>
                 <w:szCs w:val="28"/>
               </w:rPr>
+              <w:lastRenderedPageBreak/>
               <w:t>Mechanism</w:t>
             </w:r>
             <w:proofErr w:type="spellEnd"/>
@@ -10189,7 +10477,6 @@
       <w:pPr>
         <w:rPr>
           <w:szCs w:val="28"/>
-          <w:lang w:val="en-US"/>
         </w:rPr>
       </w:pPr>
       <w:r>
@@ -10211,6 +10498,89 @@
         <w:t>го центра.</w:t>
       </w:r>
     </w:p>
+    <w:p>
+      <w:pPr>
+        <w:pStyle w:val="af0"/>
+      </w:pPr>
+      <w:r>
+        <w:rPr>
+          <w:noProof/>
+          <w:szCs w:val="28"/>
+        </w:rPr>
+        <w:drawing>
+          <wp:anchor distT="0" distB="0" distL="114300" distR="114300" simplePos="0" relativeHeight="251660288" behindDoc="0" locked="0" layoutInCell="1" allowOverlap="1" wp14:anchorId="77F7BBE3" wp14:editId="54032F13">
+            <wp:simplePos x="0" y="0"/>
+            <wp:positionH relativeFrom="column">
+              <wp:posOffset>0</wp:posOffset>
+            </wp:positionH>
+            <wp:positionV relativeFrom="paragraph">
+              <wp:posOffset>0</wp:posOffset>
+            </wp:positionV>
+            <wp:extent cx="6119495" cy="4324350"/>
+            <wp:effectExtent l="0" t="0" r="0" b="0"/>
+            <wp:wrapTopAndBottom/>
+            <wp:docPr id="1599646631" name="Рисунок 6"/>
+            <wp:cNvGraphicFramePr>
+              <a:graphicFrameLocks xmlns:a="http://schemas.openxmlformats.org/drawingml/2006/main" noChangeAspect="1"/>
+            </wp:cNvGraphicFramePr>
+            <a:graphic xmlns:a="http://schemas.openxmlformats.org/drawingml/2006/main">
+              <a:graphicData uri="http://schemas.openxmlformats.org/drawingml/2006/picture">
+                <pic:pic xmlns:pic="http://schemas.openxmlformats.org/drawingml/2006/picture">
+                  <pic:nvPicPr>
+                    <pic:cNvPr id="0" name="Picture 7"/>
+                    <pic:cNvPicPr>
+                      <a:picLocks noChangeAspect="1" noChangeArrowheads="1"/>
+                    </pic:cNvPicPr>
+                  </pic:nvPicPr>
+                  <pic:blipFill>
+                    <a:blip r:embed="rId11">
+                      <a:extLst>
+                        <a:ext uri="{28A0092B-C50C-407E-A947-70E740481C1C}">
+                          <a14:useLocalDpi xmlns:a14="http://schemas.microsoft.com/office/drawing/2010/main" val="0"/>
+                        </a:ext>
+                      </a:extLst>
+                    </a:blip>
+                    <a:srcRect/>
+                    <a:stretch>
+                      <a:fillRect/>
+                    </a:stretch>
+                  </pic:blipFill>
+                  <pic:spPr bwMode="auto">
+                    <a:xfrm>
+                      <a:off x="0" y="0"/>
+                      <a:ext cx="6119495" cy="4324350"/>
+                    </a:xfrm>
+                    <a:prstGeom prst="rect">
+                      <a:avLst/>
+                    </a:prstGeom>
+                    <a:noFill/>
+                    <a:ln>
+                      <a:noFill/>
+                    </a:ln>
+                  </pic:spPr>
+                </pic:pic>
+              </a:graphicData>
+            </a:graphic>
+            <wp14:sizeRelH relativeFrom="page">
+              <wp14:pctWidth>0</wp14:pctWidth>
+            </wp14:sizeRelH>
+            <wp14:sizeRelV relativeFrom="page">
+              <wp14:pctHeight>0</wp14:pctHeight>
+            </wp14:sizeRelV>
+          </wp:anchor>
+        </w:drawing>
+      </w:r>
+      <w:r>
+        <w:t xml:space="preserve">Рисунок </w:t>
+      </w:r>
+      <w:r>
+        <w:t>4</w:t>
+      </w:r>
+      <w:r>
+        <w:t xml:space="preserve"> – Декомпозиция процесса «Диагностирование проблемы»</w:t>
+      </w:r>
+    </w:p>
+    <w:p/>
     <w:p>
       <w:pPr>
         <w:pStyle w:val="ae"/>
@@ -10402,7 +10772,15 @@
                 <w:rFonts w:ascii="Times New Roman" w:hAnsi="Times New Roman" w:cs="Times New Roman"/>
                 <w:szCs w:val="28"/>
               </w:rPr>
-              <w:t>Определение запроса клиента</w:t>
+              <w:t xml:space="preserve">Определение запроса </w:t>
+            </w:r>
+            <w:r>
+              <w:rPr>
+                <w:rFonts w:ascii="Times New Roman" w:hAnsi="Times New Roman" w:cs="Times New Roman"/>
+                <w:szCs w:val="28"/>
+              </w:rPr>
+              <w:lastRenderedPageBreak/>
+              <w:t>клиента</w:t>
             </w:r>
           </w:p>
         </w:tc>
@@ -10432,7 +10810,16 @@
                 <w:rFonts w:ascii="Times New Roman" w:hAnsi="Times New Roman" w:cs="Times New Roman"/>
                 <w:szCs w:val="28"/>
               </w:rPr>
-              <w:t>Определить требуемый формат диагностики.</w:t>
+              <w:lastRenderedPageBreak/>
+              <w:t xml:space="preserve">Определить требуемый </w:t>
+            </w:r>
+            <w:r>
+              <w:rPr>
+                <w:rFonts w:ascii="Times New Roman" w:hAnsi="Times New Roman" w:cs="Times New Roman"/>
+                <w:szCs w:val="28"/>
+              </w:rPr>
+              <w:lastRenderedPageBreak/>
+              <w:t>формат диагностики.</w:t>
             </w:r>
           </w:p>
         </w:tc>
@@ -10467,6 +10854,7 @@
                 <w:rFonts w:ascii="Times New Roman" w:hAnsi="Times New Roman" w:cs="Times New Roman"/>
                 <w:szCs w:val="28"/>
               </w:rPr>
+              <w:lastRenderedPageBreak/>
               <w:t>A3.1.2</w:t>
             </w:r>
           </w:p>
@@ -11022,15 +11410,7 @@
                 <w:rFonts w:ascii="Times New Roman" w:hAnsi="Times New Roman" w:cs="Times New Roman"/>
                 <w:szCs w:val="28"/>
               </w:rPr>
-              <w:t xml:space="preserve">Оплата диагностических </w:t>
-            </w:r>
-            <w:r>
-              <w:rPr>
-                <w:rFonts w:ascii="Times New Roman" w:hAnsi="Times New Roman" w:cs="Times New Roman"/>
-                <w:szCs w:val="28"/>
-              </w:rPr>
-              <w:lastRenderedPageBreak/>
-              <w:t>работ.</w:t>
+              <w:t>Оплата диагностических работ.</w:t>
             </w:r>
           </w:p>
         </w:tc>
@@ -11061,7 +11441,6 @@
                 <w:rFonts w:ascii="Times New Roman" w:hAnsi="Times New Roman" w:cs="Times New Roman"/>
                 <w:szCs w:val="28"/>
               </w:rPr>
-              <w:lastRenderedPageBreak/>
               <w:t>Input</w:t>
             </w:r>
             <w:proofErr w:type="spellEnd"/>
@@ -12025,7 +12404,15 @@
                 <w:rFonts w:ascii="Times New Roman" w:hAnsi="Times New Roman" w:cs="Times New Roman"/>
                 <w:szCs w:val="28"/>
               </w:rPr>
-              <w:t>Денежные средства клиента</w:t>
+              <w:t xml:space="preserve">Денежные </w:t>
+            </w:r>
+            <w:r>
+              <w:rPr>
+                <w:rFonts w:ascii="Times New Roman" w:hAnsi="Times New Roman" w:cs="Times New Roman"/>
+                <w:szCs w:val="28"/>
+              </w:rPr>
+              <w:lastRenderedPageBreak/>
+              <w:t>средства клиента</w:t>
             </w:r>
           </w:p>
         </w:tc>
@@ -12055,7 +12442,16 @@
                 <w:rFonts w:ascii="Times New Roman" w:hAnsi="Times New Roman" w:cs="Times New Roman"/>
                 <w:szCs w:val="28"/>
               </w:rPr>
-              <w:t>Оплата диагностических услуг.</w:t>
+              <w:lastRenderedPageBreak/>
+              <w:t xml:space="preserve">Оплата диагностических </w:t>
+            </w:r>
+            <w:r>
+              <w:rPr>
+                <w:rFonts w:ascii="Times New Roman" w:hAnsi="Times New Roman" w:cs="Times New Roman"/>
+                <w:szCs w:val="28"/>
+              </w:rPr>
+              <w:lastRenderedPageBreak/>
+              <w:t>услуг.</w:t>
             </w:r>
           </w:p>
         </w:tc>
@@ -12086,6 +12482,7 @@
                 <w:rFonts w:ascii="Times New Roman" w:hAnsi="Times New Roman" w:cs="Times New Roman"/>
                 <w:szCs w:val="28"/>
               </w:rPr>
+              <w:lastRenderedPageBreak/>
               <w:t>Output</w:t>
             </w:r>
             <w:proofErr w:type="spellEnd"/>
@@ -12405,7 +12802,6 @@
     </w:p>
     <w:p>
       <w:r>
-        <w:lastRenderedPageBreak/>
         <w:t>Первичное тестирование (</w:t>
       </w:r>
       <w:r>
@@ -12450,7 +12846,6 @@
       <w:pPr>
         <w:rPr>
           <w:szCs w:val="28"/>
-          <w:lang w:val="en-US"/>
         </w:rPr>
       </w:pPr>
       <w:r>
@@ -12461,6 +12856,88 @@
           <w:szCs w:val="28"/>
         </w:rPr>
         <w:t>монта и требования к упаковке устройств при транспортировке.</w:t>
+      </w:r>
+    </w:p>
+    <w:p>
+      <w:pPr>
+        <w:pStyle w:val="af0"/>
+      </w:pPr>
+      <w:r>
+        <w:rPr>
+          <w:noProof/>
+        </w:rPr>
+        <w:lastRenderedPageBreak/>
+        <w:drawing>
+          <wp:anchor distT="0" distB="0" distL="114300" distR="114300" simplePos="0" relativeHeight="251661312" behindDoc="0" locked="0" layoutInCell="1" allowOverlap="1" wp14:anchorId="7CC4D1C0" wp14:editId="307BCA0A">
+            <wp:simplePos x="0" y="0"/>
+            <wp:positionH relativeFrom="column">
+              <wp:posOffset>0</wp:posOffset>
+            </wp:positionH>
+            <wp:positionV relativeFrom="paragraph">
+              <wp:posOffset>0</wp:posOffset>
+            </wp:positionV>
+            <wp:extent cx="6119495" cy="4324350"/>
+            <wp:effectExtent l="0" t="0" r="0" b="0"/>
+            <wp:wrapTopAndBottom/>
+            <wp:docPr id="1334483540" name="Рисунок 8"/>
+            <wp:cNvGraphicFramePr>
+              <a:graphicFrameLocks xmlns:a="http://schemas.openxmlformats.org/drawingml/2006/main" noChangeAspect="1"/>
+            </wp:cNvGraphicFramePr>
+            <a:graphic xmlns:a="http://schemas.openxmlformats.org/drawingml/2006/main">
+              <a:graphicData uri="http://schemas.openxmlformats.org/drawingml/2006/picture">
+                <pic:pic xmlns:pic="http://schemas.openxmlformats.org/drawingml/2006/picture">
+                  <pic:nvPicPr>
+                    <pic:cNvPr id="0" name="Picture 9"/>
+                    <pic:cNvPicPr>
+                      <a:picLocks noChangeAspect="1" noChangeArrowheads="1"/>
+                    </pic:cNvPicPr>
+                  </pic:nvPicPr>
+                  <pic:blipFill>
+                    <a:blip r:embed="rId12">
+                      <a:extLst>
+                        <a:ext uri="{28A0092B-C50C-407E-A947-70E740481C1C}">
+                          <a14:useLocalDpi xmlns:a14="http://schemas.microsoft.com/office/drawing/2010/main" val="0"/>
+                        </a:ext>
+                      </a:extLst>
+                    </a:blip>
+                    <a:srcRect/>
+                    <a:stretch>
+                      <a:fillRect/>
+                    </a:stretch>
+                  </pic:blipFill>
+                  <pic:spPr bwMode="auto">
+                    <a:xfrm>
+                      <a:off x="0" y="0"/>
+                      <a:ext cx="6119495" cy="4324350"/>
+                    </a:xfrm>
+                    <a:prstGeom prst="rect">
+                      <a:avLst/>
+                    </a:prstGeom>
+                    <a:noFill/>
+                    <a:ln>
+                      <a:noFill/>
+                    </a:ln>
+                  </pic:spPr>
+                </pic:pic>
+              </a:graphicData>
+            </a:graphic>
+            <wp14:sizeRelH relativeFrom="page">
+              <wp14:pctWidth>0</wp14:pctWidth>
+            </wp14:sizeRelH>
+            <wp14:sizeRelV relativeFrom="page">
+              <wp14:pctHeight>0</wp14:pctHeight>
+            </wp14:sizeRelV>
+          </wp:anchor>
+        </w:drawing>
+      </w:r>
+      <w:r>
+        <w:t xml:space="preserve">Рисунок </w:t>
+      </w:r>
+      <w:r>
+        <w:t>5</w:t>
+      </w:r>
+      <w:r>
+        <w:t xml:space="preserve"> – Декомпозиция процесса «Диагностика на дому клиента»</w:t>
       </w:r>
     </w:p>
     <w:p>
@@ -12471,7 +12948,13 @@
         </w:rPr>
       </w:pPr>
       <w:r>
-        <w:t>Таблица 13 – Процессы диаграммы A3.1.2 «Диагностика на дому клиента»</w:t>
+        <w:t xml:space="preserve">Таблица </w:t>
+      </w:r>
+      <w:r>
+        <w:t>9</w:t>
+      </w:r>
+      <w:r>
+        <w:t xml:space="preserve"> – Процессы диаграммы A3.1.2 «Диагностика на дому клиента»</w:t>
       </w:r>
     </w:p>
     <w:tbl>
@@ -12969,6 +13452,45 @@
         </w:tc>
       </w:tr>
     </w:tbl>
+    <w:p>
+      <w:pPr>
+        <w:suppressAutoHyphens/>
+        <w:spacing w:after="160" w:line="256" w:lineRule="auto"/>
+        <w:ind w:firstLine="0"/>
+        <w:contextualSpacing w:val="0"/>
+        <w:rPr>
+          <w:rFonts w:eastAsia="MS Mincho"/>
+          <w:szCs w:val="28"/>
+          <w:lang w:eastAsia="en-US"/>
+        </w:rPr>
+      </w:pPr>
+    </w:p>
+    <w:p>
+      <w:pPr>
+        <w:suppressAutoHyphens/>
+        <w:spacing w:after="160" w:line="256" w:lineRule="auto"/>
+        <w:ind w:firstLine="0"/>
+        <w:contextualSpacing w:val="0"/>
+        <w:rPr>
+          <w:rFonts w:eastAsia="MS Mincho"/>
+          <w:szCs w:val="28"/>
+          <w:lang w:eastAsia="en-US"/>
+        </w:rPr>
+      </w:pPr>
+    </w:p>
+    <w:p>
+      <w:pPr>
+        <w:suppressAutoHyphens/>
+        <w:spacing w:after="160" w:line="256" w:lineRule="auto"/>
+        <w:ind w:firstLine="0"/>
+        <w:contextualSpacing w:val="0"/>
+        <w:rPr>
+          <w:rFonts w:eastAsia="MS Mincho"/>
+          <w:szCs w:val="28"/>
+          <w:lang w:eastAsia="en-US"/>
+        </w:rPr>
+      </w:pPr>
+    </w:p>
     <w:p>
       <w:pPr>
         <w:suppressAutoHyphens/>
@@ -12990,7 +13512,16 @@
         </w:rPr>
       </w:pPr>
       <w:r>
-        <w:t>Таблица 14 – Стрелки диаграммы A3.1.2 «Диагностика на дому клиента»</w:t>
+        <w:t xml:space="preserve"> </w:t>
+      </w:r>
+      <w:r>
+        <w:t xml:space="preserve">Таблица </w:t>
+      </w:r>
+      <w:r>
+        <w:t>10</w:t>
+      </w:r>
+      <w:r>
+        <w:t xml:space="preserve"> – Стрелки диаграммы A3.1.2 «Диагностика на дому клиента»</w:t>
       </w:r>
     </w:p>
     <w:tbl>
@@ -13674,7 +14205,6 @@
                 <w:rFonts w:ascii="Times New Roman" w:hAnsi="Times New Roman" w:cs="Times New Roman"/>
                 <w:szCs w:val="28"/>
               </w:rPr>
-              <w:lastRenderedPageBreak/>
               <w:t>A3.1.1.5</w:t>
             </w:r>
           </w:p>
@@ -14495,7 +15025,15 @@
                 <w:rFonts w:ascii="Times New Roman" w:hAnsi="Times New Roman" w:cs="Times New Roman"/>
                 <w:szCs w:val="28"/>
               </w:rPr>
-              <w:t>Денежные средства клиента</w:t>
+              <w:t xml:space="preserve">Денежные </w:t>
+            </w:r>
+            <w:r>
+              <w:rPr>
+                <w:rFonts w:ascii="Times New Roman" w:hAnsi="Times New Roman" w:cs="Times New Roman"/>
+                <w:szCs w:val="28"/>
+              </w:rPr>
+              <w:lastRenderedPageBreak/>
+              <w:t>средства клиента</w:t>
             </w:r>
           </w:p>
         </w:tc>
@@ -14525,7 +15063,16 @@
                 <w:rFonts w:ascii="Times New Roman" w:hAnsi="Times New Roman" w:cs="Times New Roman"/>
                 <w:szCs w:val="28"/>
               </w:rPr>
-              <w:t>Оплата оказанных услуг.</w:t>
+              <w:lastRenderedPageBreak/>
+              <w:t xml:space="preserve">Оплата </w:t>
+            </w:r>
+            <w:r>
+              <w:rPr>
+                <w:rFonts w:ascii="Times New Roman" w:hAnsi="Times New Roman" w:cs="Times New Roman"/>
+                <w:szCs w:val="28"/>
+              </w:rPr>
+              <w:lastRenderedPageBreak/>
+              <w:t>оказанных услуг.</w:t>
             </w:r>
           </w:p>
         </w:tc>
@@ -14556,6 +15103,7 @@
                 <w:rFonts w:ascii="Times New Roman" w:hAnsi="Times New Roman" w:cs="Times New Roman"/>
                 <w:szCs w:val="28"/>
               </w:rPr>
+              <w:lastRenderedPageBreak/>
               <w:t>Output</w:t>
             </w:r>
             <w:proofErr w:type="spellEnd"/>
@@ -14969,7 +15517,6 @@
         <w:pStyle w:val="1"/>
       </w:pPr>
       <w:r>
-        <w:lastRenderedPageBreak/>
         <w:t>6. Заключение</w:t>
       </w:r>
     </w:p>
@@ -15042,6 +15589,7 @@
     </w:p>
     <w:p>
       <w:r>
+        <w:lastRenderedPageBreak/>
         <w:t>Построение иерархических моделей с использованием метода декомпозиции.</w:t>
       </w:r>
     </w:p>
@@ -15079,7 +15627,6 @@
     <w:p>
       <w:proofErr w:type="spellStart"/>
       <w:r>
-        <w:lastRenderedPageBreak/>
         <w:t>Калянов</w:t>
       </w:r>
       <w:proofErr w:type="spellEnd"/>
@@ -15121,28 +15668,12 @@
     </w:p>
     <w:p>
       <w:r>
-        <w:t xml:space="preserve">ГОСТ </w:t>
-      </w:r>
-      <w:proofErr w:type="gramStart"/>
-      <w:r>
-        <w:t>34.601-90</w:t>
-      </w:r>
-      <w:proofErr w:type="gramEnd"/>
-      <w:r>
-        <w:t>. Информационная технология. Комплекс стандартов на автоматизированные системы. Автоматизированные системы. Стадии создания. — М.: Изд-во стандартов, 1991.</w:t>
+        <w:t>ГОСТ 34.601-90. Информационная технология. Комплекс стандартов на автоматизированные системы. Автоматизированные системы. Стадии создания. — М.: Изд-во стандартов, 1991.</w:t>
       </w:r>
     </w:p>
     <w:p>
       <w:r>
-        <w:t xml:space="preserve">ГОСТ Р ИСО </w:t>
-      </w:r>
-      <w:proofErr w:type="gramStart"/>
-      <w:r>
-        <w:t>9001-2015</w:t>
-      </w:r>
-      <w:proofErr w:type="gramEnd"/>
-      <w:r>
-        <w:t xml:space="preserve">. Системы менеджмента качества. Требования. — М.: </w:t>
+        <w:t xml:space="preserve">ГОСТ Р ИСО 9001-2015. Системы менеджмента качества. Требования. — М.: </w:t>
       </w:r>
       <w:proofErr w:type="spellStart"/>
       <w:r>
@@ -15219,6 +15750,7 @@
     </w:p>
     <w:p>
       <w:r>
+        <w:lastRenderedPageBreak/>
         <w:t>Приложение Д. Диаграмма декомпозиции «Диагностика на дому клиента» (</w:t>
       </w:r>
       <w:r>
@@ -15237,7 +15769,7 @@
       </w:r>
     </w:p>
     <w:sectPr>
-      <w:footerReference w:type="default" r:id="rId8"/>
+      <w:footerReference w:type="default" r:id="rId13"/>
       <w:pgSz w:w="11907" w:h="16840" w:code="9"/>
       <w:pgMar w:top="1134" w:right="851" w:bottom="1134" w:left="1418" w:header="720" w:footer="720" w:gutter="0"/>
       <w:cols w:space="708"/>
@@ -16225,6 +16757,38 @@
       </w:tblBorders>
     </w:tblPr>
   </w:style>
+  <w:style w:type="paragraph" w:customStyle="1" w:styleId="af0">
+    <w:name w:val="Подпись к картинке"/>
+    <w:basedOn w:val="a"/>
+    <w:link w:val="af1"/>
+    <w:qFormat/>
+    <w:rsid w:val="002F0E18"/>
+    <w:pPr>
+      <w:suppressAutoHyphens/>
+      <w:spacing w:before="120" w:after="120" w:line="256" w:lineRule="auto"/>
+      <w:ind w:firstLine="0"/>
+      <w:contextualSpacing w:val="0"/>
+      <w:jc w:val="center"/>
+    </w:pPr>
+    <w:rPr>
+      <w:rFonts w:cs="Calibri"/>
+      <w:sz w:val="24"/>
+      <w:szCs w:val="22"/>
+      <w:lang w:eastAsia="en-US"/>
+    </w:rPr>
+  </w:style>
+  <w:style w:type="character" w:customStyle="1" w:styleId="af1">
+    <w:name w:val="Подпись к картинке Знак"/>
+    <w:basedOn w:val="a0"/>
+    <w:link w:val="af0"/>
+    <w:rsid w:val="002F0E18"/>
+    <w:rPr>
+      <w:rFonts w:cs="Calibri"/>
+      <w:sz w:val="24"/>
+      <w:szCs w:val="22"/>
+      <w:lang w:eastAsia="en-US"/>
+    </w:rPr>
+  </w:style>
 </w:styles>
 </file>
 

</xml_diff>

<commit_message>
vault backup: 2026-10-13 14:19:58
</commit_message>
<xml_diff>
--- a/ПРЕДМЕТЫ/Архитектура предприятий и корпоративных информационных систем/Лабы/Лаба 1/Поповкин. Лабораторная работа 1.docx
+++ b/ПРЕДМЕТЫ/Архитектура предприятий и корпоративных информационных систем/Лабы/Лаба 1/Поповкин. Лабораторная работа 1.docx
@@ -139,13 +139,10 @@
     </w:p>
     <w:p>
       <w:r>
-        <w:t xml:space="preserve">ГОСТ </w:t>
-      </w:r>
-      <w:r>
-        <w:t xml:space="preserve">34.601–90 </w:t>
-      </w:r>
-      <w:r>
-        <w:t xml:space="preserve"> «Информационная технология. Комплекс стандартов на автоматизированные системы. Автоматизированные системы. Стадии создания».</w:t>
+        <w:t xml:space="preserve">ГОСТ Р ИСО 15704–2008. </w:t>
+      </w:r>
+      <w:r>
+        <w:t>«Информационная технология. Комплекс стандартов на автоматизированные системы. Автоматизированные системы. Стадии создания».</w:t>
       </w:r>
     </w:p>
     <w:p>
@@ -225,47 +222,122 @@
         <w:t>Modeling</w:t>
       </w:r>
       <w:r>
-        <w:t xml:space="preserve">) – методология и нотация функционального моделирования, предназначенная для описания бизнес-процессов в виде иерархической системы взаимосвязанных функций и потоков. (Источник: </w:t>
-      </w:r>
-      <w:proofErr w:type="spellStart"/>
-      <w:r>
-        <w:t>Вендров</w:t>
-      </w:r>
-      <w:proofErr w:type="spellEnd"/>
-      <w:r>
-        <w:t xml:space="preserve"> А.А. Проектирование программного обеспечения экономических информационных систем; </w:t>
+        <w:t>) – методология и нотация функционального моделирования, предназначенная для описания бизнес-процессов в виде иерархической системы взаимосвязанных функций и потоков.</w:t>
+      </w:r>
+      <w:r>
+        <w:t>[1]</w:t>
+      </w:r>
+    </w:p>
+    <w:p>
+      <w:r>
+        <w:lastRenderedPageBreak/>
+        <w:t>Контекстная диаграмма – диаграмма верхнего уровня модели, представляющая систему как единый блок с определенными внешними входами, выходами, механизмами и управляющими воздействиями.</w:t>
+      </w:r>
+      <w:r>
+        <w:t>[2]</w:t>
+      </w:r>
+    </w:p>
+    <w:p>
+      <w:r>
+        <w:t>Декомпозиция – методология разбиения сложной системы или процесса на более простые, детализированные подпроцессы для лучшего понимания их внутренней структуры.</w:t>
+      </w:r>
+      <w:r>
+        <w:t>[1]</w:t>
+      </w:r>
+    </w:p>
+    <w:p>
+      <w:r>
+        <w:t>Бизнес-процесс – логически взаимосвязанная и последовательная совокупность мероприятий, которые потребляют ресурсы для создания ценности и результата для клиента.</w:t>
+      </w:r>
+      <w:r>
+        <w:t>[3]</w:t>
+      </w:r>
+    </w:p>
+    <w:p>
+      <w:r>
+        <w:t>Вход (</w:t>
       </w:r>
       <w:r>
         <w:rPr>
           <w:lang w:val="en-US"/>
         </w:rPr>
-        <w:t>FIPS</w:t>
-      </w:r>
-      <w:r>
-        <w:t xml:space="preserve"> </w:t>
+        <w:t>Input</w:t>
+      </w:r>
+      <w:r>
+        <w:t>) – материальные объекты или информация, которые преобразуются, потребляются или используются функцией для получения результата.</w:t>
+      </w:r>
+      <w:r>
+        <w:t>[4]</w:t>
+      </w:r>
+    </w:p>
+    <w:p>
+      <w:r>
+        <w:t>Управление (</w:t>
       </w:r>
       <w:r>
         <w:rPr>
           <w:lang w:val="en-US"/>
         </w:rPr>
-        <w:t>PUB</w:t>
-      </w:r>
-      <w:r>
-        <w:t xml:space="preserve"> 183).</w:t>
+        <w:t>Control</w:t>
+      </w:r>
+      <w:r>
+        <w:t>) – правила, инструкции, стандарты, законодательные акты и регламенты, которые направляют выполнение функции, но не преобразуются в процессе.</w:t>
+      </w:r>
+      <w:r>
+        <w:t>[1]</w:t>
       </w:r>
     </w:p>
     <w:p>
       <w:r>
-        <w:lastRenderedPageBreak/>
-        <w:t xml:space="preserve">Контекстная диаграмма – диаграмма верхнего уровня модели, представляющая систему как единый блок с определенными внешними входами, выходами, механизмами и управляющими воздействиями. (Источник: </w:t>
-      </w:r>
-      <w:proofErr w:type="spellStart"/>
-      <w:r>
-        <w:t>Калянов</w:t>
-      </w:r>
-      <w:proofErr w:type="spellEnd"/>
-      <w:r>
-        <w:t xml:space="preserve"> Г.Н. Структура и организация моделей в методологии </w:t>
+        <w:t>Выход (</w:t>
+      </w:r>
+      <w:r>
+        <w:rPr>
+          <w:lang w:val="en-US"/>
+        </w:rPr>
+        <w:t>Output</w:t>
+      </w:r>
+      <w:r>
+        <w:t xml:space="preserve">) – материальные объекты или информация, которые являются результатом выполнения функции. </w:t>
+      </w:r>
+      <w:r>
+        <w:t>[4]</w:t>
+      </w:r>
+    </w:p>
+    <w:p>
+      <w:pPr>
+        <w:rPr>
+          <w:lang w:val="en-US"/>
+        </w:rPr>
+      </w:pPr>
+      <w:r>
+        <w:t>Механизм (</w:t>
+      </w:r>
+      <w:r>
+        <w:rPr>
+          <w:lang w:val="en-US"/>
+        </w:rPr>
+        <w:t>Mechanism</w:t>
+      </w:r>
+      <w:r>
+        <w:t>) – ресурсы (персонал, оборудование, программное обеспечение, инфраструктура), которые выполняют функцию или способствуют ее выполнению.</w:t>
+      </w:r>
+      <w:r>
+        <w:t>[2]</w:t>
+      </w:r>
+    </w:p>
+    <w:p>
+      <w:r>
+        <w:t>Стрелка (</w:t>
+      </w:r>
+      <w:r>
+        <w:rPr>
+          <w:lang w:val="en-US"/>
+        </w:rPr>
+        <w:t>Arrow</w:t>
+      </w:r>
+      <w:r>
+        <w:t xml:space="preserve">) – графический элемент диаграммы </w:t>
       </w:r>
       <w:r>
         <w:rPr>
@@ -274,141 +346,15 @@
         <w:t>IDEF</w:t>
       </w:r>
       <w:r>
-        <w:t>).</w:t>
+        <w:t>0, представляющий потоки данных, материальные ресурсы или управляющие воздействия, связывающие блоки между собой и с внешней средой.</w:t>
+      </w:r>
+      <w:r>
+        <w:t>[4]</w:t>
       </w:r>
     </w:p>
     <w:p>
       <w:r>
-        <w:t xml:space="preserve">Декомпозиция – методология разбиения сложной системы или процесса на более простые, детализированные подпроцессы для лучшего понимания их внутренней структуры. (Источник: </w:t>
-      </w:r>
-      <w:proofErr w:type="spellStart"/>
-      <w:r>
-        <w:t>Вендров</w:t>
-      </w:r>
-      <w:proofErr w:type="spellEnd"/>
-      <w:r>
-        <w:t xml:space="preserve"> А.А. Проектирование программного обеспечения).</w:t>
-      </w:r>
-    </w:p>
-    <w:p>
-      <w:r>
-        <w:t xml:space="preserve">Бизнес-процесс – логически взаимосвязанная и последовательная совокупность мероприятий, которые потребляют ресурсы для создания ценности и результата для клиента. (Источник: </w:t>
-      </w:r>
-      <w:proofErr w:type="spellStart"/>
-      <w:r>
-        <w:t>Елиферов</w:t>
-      </w:r>
-      <w:proofErr w:type="spellEnd"/>
-      <w:r>
-        <w:t xml:space="preserve"> В.Г., Репин В.В. Бизнес-процессы: Регламентация и управление).</w:t>
-      </w:r>
-    </w:p>
-    <w:p>
-      <w:r>
-        <w:t>Вход (</w:t>
-      </w:r>
-      <w:r>
-        <w:rPr>
-          <w:lang w:val="en-US"/>
-        </w:rPr>
-        <w:t>Input</w:t>
-      </w:r>
-      <w:r>
-        <w:t xml:space="preserve">) – материальные объекты или информация, которые преобразуются, потребляются или используются функцией для получения результата. (Источник: </w:t>
-      </w:r>
-      <w:r>
-        <w:rPr>
-          <w:lang w:val="en-US"/>
-        </w:rPr>
-        <w:t>FIPS</w:t>
-      </w:r>
-      <w:r>
-        <w:t xml:space="preserve"> </w:t>
-      </w:r>
-      <w:r>
-        <w:rPr>
-          <w:lang w:val="en-US"/>
-        </w:rPr>
-        <w:t>PUB</w:t>
-      </w:r>
-      <w:r>
-        <w:t xml:space="preserve"> 183).</w:t>
-      </w:r>
-    </w:p>
-    <w:p>
-      <w:r>
-        <w:t>Управление (</w:t>
-      </w:r>
-      <w:r>
-        <w:rPr>
-          <w:lang w:val="en-US"/>
-        </w:rPr>
-        <w:t>Control</w:t>
-      </w:r>
-      <w:r>
-        <w:t xml:space="preserve">) – правила, инструкции, стандарты, законодательные акты и регламенты, которые направляют выполнение функции, но не преобразуются в процессе. (Источник: </w:t>
-      </w:r>
-      <w:proofErr w:type="spellStart"/>
-      <w:r>
-        <w:t>Вендров</w:t>
-      </w:r>
-      <w:proofErr w:type="spellEnd"/>
-      <w:r>
-        <w:t xml:space="preserve"> А.А. Проектирование программного обеспечения).</w:t>
-      </w:r>
-    </w:p>
-    <w:p>
-      <w:r>
-        <w:t>Выход (</w:t>
-      </w:r>
-      <w:r>
-        <w:rPr>
-          <w:lang w:val="en-US"/>
-        </w:rPr>
-        <w:t>Output</w:t>
-      </w:r>
-      <w:r>
-        <w:t xml:space="preserve">) – материальные объекты или информация, которые являются результатом выполнения функции. (Источник: </w:t>
-      </w:r>
-      <w:r>
-        <w:rPr>
-          <w:lang w:val="en-US"/>
-        </w:rPr>
-        <w:t>FIPS</w:t>
-      </w:r>
-      <w:r>
-        <w:t xml:space="preserve"> </w:t>
-      </w:r>
-      <w:r>
-        <w:rPr>
-          <w:lang w:val="en-US"/>
-        </w:rPr>
-        <w:t>PUB</w:t>
-      </w:r>
-      <w:r>
-        <w:t xml:space="preserve"> 183).</w:t>
-      </w:r>
-    </w:p>
-    <w:p>
-      <w:r>
-        <w:t>Механизм (</w:t>
-      </w:r>
-      <w:r>
-        <w:rPr>
-          <w:lang w:val="en-US"/>
-        </w:rPr>
-        <w:t>Mechanism</w:t>
-      </w:r>
-      <w:r>
-        <w:t xml:space="preserve">) – ресурсы (персонал, оборудование, программное обеспечение, инфраструктура), которые выполняют функцию или способствуют ее выполнению. (Источник: </w:t>
-      </w:r>
-      <w:proofErr w:type="spellStart"/>
-      <w:r>
-        <w:t>Калянов</w:t>
-      </w:r>
-      <w:proofErr w:type="spellEnd"/>
-      <w:r>
-        <w:t xml:space="preserve"> Г.Н. Структура и организация моделей в методологии </w:t>
+        <w:t xml:space="preserve">Функциональный блок – прямоугольный элемент на диаграмме </w:t>
       </w:r>
       <w:r>
         <w:rPr>
@@ -417,71 +363,10 @@
         <w:t>IDEF</w:t>
       </w:r>
       <w:r>
-        <w:t>).</w:t>
-      </w:r>
-    </w:p>
-    <w:p>
-      <w:r>
-        <w:t>Стрелка (</w:t>
-      </w:r>
-      <w:r>
-        <w:rPr>
-          <w:lang w:val="en-US"/>
-        </w:rPr>
-        <w:t>Arrow</w:t>
-      </w:r>
-      <w:r>
-        <w:t xml:space="preserve">) – графический элемент диаграммы </w:t>
-      </w:r>
-      <w:r>
-        <w:rPr>
-          <w:lang w:val="en-US"/>
-        </w:rPr>
-        <w:t>IDEF</w:t>
-      </w:r>
-      <w:r>
-        <w:t xml:space="preserve">0, представляющий потоки данных, материальные ресурсы или управляющие воздействия, связывающие блоки между собой и с внешней средой. (Источник: </w:t>
-      </w:r>
-      <w:r>
-        <w:rPr>
-          <w:lang w:val="en-US"/>
-        </w:rPr>
-        <w:t>FIPS</w:t>
-      </w:r>
-      <w:r>
-        <w:t xml:space="preserve"> </w:t>
-      </w:r>
-      <w:r>
-        <w:rPr>
-          <w:lang w:val="en-US"/>
-        </w:rPr>
-        <w:t>PUB</w:t>
-      </w:r>
-      <w:r>
-        <w:t xml:space="preserve"> 183).</w:t>
-      </w:r>
-    </w:p>
-    <w:p>
-      <w:r>
-        <w:lastRenderedPageBreak/>
-        <w:t xml:space="preserve">Функциональный блок – прямоугольный элемент на диаграмме </w:t>
-      </w:r>
-      <w:r>
-        <w:rPr>
-          <w:lang w:val="en-US"/>
-        </w:rPr>
-        <w:t>IDEF</w:t>
-      </w:r>
-      <w:r>
-        <w:t xml:space="preserve">0, обозначающий конкретную функцию, процесс или вид деятельности, который имеет наименование и уникальный идентификационный номер. (Источник: </w:t>
-      </w:r>
-      <w:proofErr w:type="spellStart"/>
-      <w:r>
-        <w:t>Вендров</w:t>
-      </w:r>
-      <w:proofErr w:type="spellEnd"/>
-      <w:r>
-        <w:t xml:space="preserve"> А.А. Проектирование программного обеспечения).</w:t>
+        <w:t>0, обозначающий конкретную функцию, процесс или вид деятельности, который имеет наименование и уникальный идентификационный номер.</w:t>
+      </w:r>
+      <w:r>
+        <w:t>[1]</w:t>
       </w:r>
     </w:p>
     <w:p>
@@ -508,6 +393,7 @@
     </w:p>
     <w:p>
       <w:r>
+        <w:lastRenderedPageBreak/>
         <w:t>Продажа компьютерной техники (</w:t>
       </w:r>
       <w:r>
@@ -8035,7 +7921,7 @@
         </w:rPr>
         <w:lastRenderedPageBreak/>
         <w:drawing>
-          <wp:anchor distT="0" distB="0" distL="114300" distR="114300" simplePos="0" relativeHeight="251658240" behindDoc="0" locked="0" layoutInCell="1" allowOverlap="1" wp14:anchorId="2EA7CA7F" wp14:editId="19293C42">
+          <wp:anchor distT="0" distB="0" distL="114300" distR="114300" simplePos="0" relativeHeight="251659264" behindDoc="0" locked="0" layoutInCell="1" allowOverlap="1" wp14:anchorId="2EA7CA7F" wp14:editId="19293C42">
             <wp:simplePos x="0" y="0"/>
             <wp:positionH relativeFrom="column">
               <wp:posOffset>0</wp:posOffset>
@@ -15607,6 +15493,13 @@
       </w:r>
     </w:p>
     <w:p>
+      <w:pPr>
+        <w:pStyle w:val="af2"/>
+        <w:numPr>
+          <w:ilvl w:val="0"/>
+          <w:numId w:val="2"/>
+        </w:numPr>
+      </w:pPr>
       <w:proofErr w:type="spellStart"/>
       <w:r>
         <w:t>Вендров</w:t>
@@ -15625,6 +15518,13 @@
       </w:r>
     </w:p>
     <w:p>
+      <w:pPr>
+        <w:pStyle w:val="af2"/>
+        <w:numPr>
+          <w:ilvl w:val="0"/>
+          <w:numId w:val="2"/>
+        </w:numPr>
+      </w:pPr>
       <w:proofErr w:type="spellStart"/>
       <w:r>
         <w:t>Калянов</w:t>
@@ -15644,6 +15544,13 @@
       </w:r>
     </w:p>
     <w:p>
+      <w:pPr>
+        <w:pStyle w:val="af2"/>
+        <w:numPr>
+          <w:ilvl w:val="0"/>
+          <w:numId w:val="2"/>
+        </w:numPr>
+      </w:pPr>
       <w:proofErr w:type="spellStart"/>
       <w:r>
         <w:t>Елиферов</w:t>
@@ -15655,6 +15562,11 @@
     </w:p>
     <w:p>
       <w:pPr>
+        <w:pStyle w:val="af2"/>
+        <w:numPr>
+          <w:ilvl w:val="0"/>
+          <w:numId w:val="2"/>
+        </w:numPr>
         <w:rPr>
           <w:lang w:val="en-US"/>
         </w:rPr>
@@ -15667,13 +15579,15 @@
       </w:r>
     </w:p>
     <w:p>
-      <w:r>
-        <w:t>ГОСТ 34.601-90. Информационная технология. Комплекс стандартов на автоматизированные системы. Автоматизированные системы. Стадии создания. — М.: Изд-во стандартов, 1991.</w:t>
-      </w:r>
-    </w:p>
-    <w:p>
-      <w:r>
-        <w:t xml:space="preserve">ГОСТ Р ИСО 9001-2015. Системы менеджмента качества. Требования. — М.: </w:t>
+      <w:pPr>
+        <w:pStyle w:val="af2"/>
+        <w:numPr>
+          <w:ilvl w:val="0"/>
+          <w:numId w:val="2"/>
+        </w:numPr>
+      </w:pPr>
+      <w:r>
+        <w:t xml:space="preserve">ГОСТ Р ИСО 15704–2008. Требования к стандартным архитектурам и методологиям предприятия. - М.: </w:t>
       </w:r>
       <w:proofErr w:type="spellStart"/>
       <w:r>
@@ -15681,91 +15595,33 @@
       </w:r>
       <w:proofErr w:type="spellEnd"/>
       <w:r>
-        <w:t>, 2015. — 32 с.</w:t>
+        <w:t>, 2010.</w:t>
       </w:r>
     </w:p>
     <w:p>
       <w:pPr>
-        <w:pStyle w:val="1"/>
+        <w:pStyle w:val="af2"/>
+        <w:numPr>
+          <w:ilvl w:val="0"/>
+          <w:numId w:val="2"/>
+        </w:numPr>
       </w:pPr>
       <w:r>
-        <w:t>8. Приложения</w:t>
-      </w:r>
-    </w:p>
-    <w:p>
-      <w:r>
-        <w:t xml:space="preserve">Приложение А. Контекстная диаграмма </w:t>
-      </w:r>
-      <w:r>
-        <w:rPr>
-          <w:lang w:val="en-US"/>
-        </w:rPr>
-        <w:t>A</w:t>
-      </w:r>
-      <w:r>
-        <w:t>-0 «Деятельность компьютерной компании».</w:t>
-      </w:r>
-    </w:p>
-    <w:p>
-      <w:r>
-        <w:t xml:space="preserve">Приложение Б. Диаграмма декомпозиции </w:t>
-      </w:r>
-      <w:r>
-        <w:rPr>
-          <w:lang w:val="en-US"/>
-        </w:rPr>
-        <w:t>A</w:t>
-      </w:r>
-      <w:r>
-        <w:t>0 «Бизнес-процессы компании».</w:t>
-      </w:r>
-    </w:p>
-    <w:p>
-      <w:r>
-        <w:t>Приложение В. Диаграмма декомпозиции процесса «Ремонт» (</w:t>
-      </w:r>
-      <w:r>
-        <w:rPr>
-          <w:lang w:val="en-US"/>
-        </w:rPr>
-        <w:t>A</w:t>
-      </w:r>
-      <w:r>
-        <w:t>3).</w:t>
-      </w:r>
-    </w:p>
-    <w:p>
-      <w:r>
-        <w:t>Приложение Г. Диаграмма декомпозиции «Диагностирование проблемы» (</w:t>
-      </w:r>
-      <w:r>
-        <w:rPr>
-          <w:lang w:val="en-US"/>
-        </w:rPr>
-        <w:t>A</w:t>
-      </w:r>
-      <w:r>
-        <w:t>3.1).</w:t>
-      </w:r>
-    </w:p>
-    <w:p>
-      <w:r>
-        <w:lastRenderedPageBreak/>
-        <w:t>Приложение Д. Диаграмма декомпозиции «Диагностика на дому клиента» (</w:t>
-      </w:r>
-      <w:r>
-        <w:rPr>
-          <w:lang w:val="en-US"/>
-        </w:rPr>
-        <w:t>A</w:t>
-      </w:r>
-      <w:r>
-        <w:t>3.1.2).</w:t>
-      </w:r>
-    </w:p>
-    <w:p>
-      <w:r>
-        <w:t>(Примечание: В данном отчете графические изображения диаграмм представлены в виде текстовых таблиц описания процессов и стрелок согласно требованиям к оформлению).</w:t>
+        <w:t xml:space="preserve">ГОСТ Р ИСО </w:t>
+      </w:r>
+      <w:r>
+        <w:t>9001–2015</w:t>
+      </w:r>
+      <w:r>
+        <w:t xml:space="preserve">. Системы менеджмента качества. Требования. — М.: </w:t>
+      </w:r>
+      <w:proofErr w:type="spellStart"/>
+      <w:r>
+        <w:t>Стандартинформ</w:t>
+      </w:r>
+      <w:proofErr w:type="spellEnd"/>
+      <w:r>
+        <w:t>, 2015. — 32 с.</w:t>
       </w:r>
     </w:p>
     <w:sectPr>
@@ -15935,8 +15791,97 @@
       </w:pPr>
     </w:lvl>
   </w:abstractNum>
+  <w:abstractNum w:abstractNumId="1" w15:restartNumberingAfterBreak="0">
+    <w:nsid w:val="517D628D"/>
+    <w:multiLevelType w:val="hybridMultilevel"/>
+    <w:tmpl w:val="31E2F792"/>
+    <w:lvl w:ilvl="0" w:tplc="0419000F">
+      <w:start w:val="1"/>
+      <w:numFmt w:val="decimal"/>
+      <w:lvlText w:val="%1."/>
+      <w:lvlJc w:val="left"/>
+      <w:pPr>
+        <w:ind w:left="360" w:hanging="360"/>
+      </w:pPr>
+    </w:lvl>
+    <w:lvl w:ilvl="1" w:tplc="04190019" w:tentative="1">
+      <w:start w:val="1"/>
+      <w:numFmt w:val="lowerLetter"/>
+      <w:lvlText w:val="%2."/>
+      <w:lvlJc w:val="left"/>
+      <w:pPr>
+        <w:ind w:left="1080" w:hanging="360"/>
+      </w:pPr>
+    </w:lvl>
+    <w:lvl w:ilvl="2" w:tplc="0419001B" w:tentative="1">
+      <w:start w:val="1"/>
+      <w:numFmt w:val="lowerRoman"/>
+      <w:lvlText w:val="%3."/>
+      <w:lvlJc w:val="right"/>
+      <w:pPr>
+        <w:ind w:left="1800" w:hanging="180"/>
+      </w:pPr>
+    </w:lvl>
+    <w:lvl w:ilvl="3" w:tplc="0419000F" w:tentative="1">
+      <w:start w:val="1"/>
+      <w:numFmt w:val="decimal"/>
+      <w:lvlText w:val="%4."/>
+      <w:lvlJc w:val="left"/>
+      <w:pPr>
+        <w:ind w:left="2520" w:hanging="360"/>
+      </w:pPr>
+    </w:lvl>
+    <w:lvl w:ilvl="4" w:tplc="04190019" w:tentative="1">
+      <w:start w:val="1"/>
+      <w:numFmt w:val="lowerLetter"/>
+      <w:lvlText w:val="%5."/>
+      <w:lvlJc w:val="left"/>
+      <w:pPr>
+        <w:ind w:left="3240" w:hanging="360"/>
+      </w:pPr>
+    </w:lvl>
+    <w:lvl w:ilvl="5" w:tplc="0419001B" w:tentative="1">
+      <w:start w:val="1"/>
+      <w:numFmt w:val="lowerRoman"/>
+      <w:lvlText w:val="%6."/>
+      <w:lvlJc w:val="right"/>
+      <w:pPr>
+        <w:ind w:left="3960" w:hanging="180"/>
+      </w:pPr>
+    </w:lvl>
+    <w:lvl w:ilvl="6" w:tplc="0419000F" w:tentative="1">
+      <w:start w:val="1"/>
+      <w:numFmt w:val="decimal"/>
+      <w:lvlText w:val="%7."/>
+      <w:lvlJc w:val="left"/>
+      <w:pPr>
+        <w:ind w:left="4680" w:hanging="360"/>
+      </w:pPr>
+    </w:lvl>
+    <w:lvl w:ilvl="7" w:tplc="04190019" w:tentative="1">
+      <w:start w:val="1"/>
+      <w:numFmt w:val="lowerLetter"/>
+      <w:lvlText w:val="%8."/>
+      <w:lvlJc w:val="left"/>
+      <w:pPr>
+        <w:ind w:left="5400" w:hanging="360"/>
+      </w:pPr>
+    </w:lvl>
+    <w:lvl w:ilvl="8" w:tplc="0419001B" w:tentative="1">
+      <w:start w:val="1"/>
+      <w:numFmt w:val="lowerRoman"/>
+      <w:lvlText w:val="%9."/>
+      <w:lvlJc w:val="right"/>
+      <w:pPr>
+        <w:ind w:left="6120" w:hanging="180"/>
+      </w:pPr>
+    </w:lvl>
+  </w:abstractNum>
   <w:num w:numId="1" w16cid:durableId="969823799">
     <w:abstractNumId w:val="0"/>
+  </w:num>
+  <w:num w:numId="2" w16cid:durableId="2049329622">
+    <w:abstractNumId w:val="1"/>
   </w:num>
 </w:numbering>
 </file>
@@ -16789,6 +16734,16 @@
       <w:lang w:eastAsia="en-US"/>
     </w:rPr>
   </w:style>
+  <w:style w:type="paragraph" w:styleId="af2">
+    <w:name w:val="List Paragraph"/>
+    <w:basedOn w:val="a"/>
+    <w:uiPriority w:val="34"/>
+    <w:qFormat/>
+    <w:rsid w:val="00785DF5"/>
+    <w:pPr>
+      <w:ind w:left="720"/>
+    </w:pPr>
+  </w:style>
 </w:styles>
 </file>
 

</xml_diff>

<commit_message>
vault backup: 2026-10-13 14:29:42
</commit_message>
<xml_diff>
--- a/ПРЕДМЕТЫ/Архитектура предприятий и корпоративных информационных систем/Лабы/Лаба 1/Поповкин. Лабораторная работа 1.docx
+++ b/ПРЕДМЕТЫ/Архитектура предприятий и корпоративных информационных систем/Лабы/Лаба 1/Поповкин. Лабораторная работа 1.docx
@@ -142,23 +142,24 @@
         <w:t xml:space="preserve">ГОСТ Р ИСО 15704–2008. </w:t>
       </w:r>
       <w:r>
-        <w:t>«Информационная технология. Комплекс стандартов на автоматизированные системы. Автоматизированные системы. Стадии создания».</w:t>
+        <w:t>«</w:t>
+      </w:r>
+      <w:r>
+        <w:t>Требования к стандартным архитектурам и методологиям предприятия.</w:t>
+      </w:r>
+      <w:r>
+        <w:t>».</w:t>
       </w:r>
     </w:p>
     <w:p>
       <w:r>
-        <w:t xml:space="preserve">ГОСТ Р ИСО </w:t>
-      </w:r>
-      <w:r>
-        <w:t xml:space="preserve">9001–2015 </w:t>
-      </w:r>
-      <w:r>
-        <w:t xml:space="preserve"> «Системы менеджмента качества. Требования» (в части реализации процессного подхода к управлению предприятием).</w:t>
-      </w:r>
-    </w:p>
-    <w:p>
-      <w:r>
-        <w:t>ГОСТ Р ИСО/МЭК 10746-2-99 «Информационная технология. Взаимосвязь открытых систем. Эталонная модель архитектуры».</w:t>
+        <w:t xml:space="preserve">ГОСТ Р ИСО/МЭК 10746-2-99 «Информационная технология. Взаимосвязь открытых систем. </w:t>
+      </w:r>
+      <w:r>
+        <w:t>Управление данными и открытая распределенная обработка</w:t>
+      </w:r>
+      <w:r>
+        <w:t>».</w:t>
       </w:r>
     </w:p>
     <w:p>
@@ -226,82 +227,6 @@
       </w:r>
       <w:r>
         <w:t>[1]</w:t>
-      </w:r>
-    </w:p>
-    <w:p>
-      <w:r>
-        <w:lastRenderedPageBreak/>
-        <w:t>Контекстная диаграмма – диаграмма верхнего уровня модели, представляющая систему как единый блок с определенными внешними входами, выходами, механизмами и управляющими воздействиями.</w:t>
-      </w:r>
-      <w:r>
-        <w:t>[2]</w:t>
-      </w:r>
-    </w:p>
-    <w:p>
-      <w:r>
-        <w:t>Декомпозиция – методология разбиения сложной системы или процесса на более простые, детализированные подпроцессы для лучшего понимания их внутренней структуры.</w:t>
-      </w:r>
-      <w:r>
-        <w:t>[1]</w:t>
-      </w:r>
-    </w:p>
-    <w:p>
-      <w:r>
-        <w:t>Бизнес-процесс – логически взаимосвязанная и последовательная совокупность мероприятий, которые потребляют ресурсы для создания ценности и результата для клиента.</w:t>
-      </w:r>
-      <w:r>
-        <w:t>[3]</w:t>
-      </w:r>
-    </w:p>
-    <w:p>
-      <w:r>
-        <w:t>Вход (</w:t>
-      </w:r>
-      <w:r>
-        <w:rPr>
-          <w:lang w:val="en-US"/>
-        </w:rPr>
-        <w:t>Input</w:t>
-      </w:r>
-      <w:r>
-        <w:t>) – материальные объекты или информация, которые преобразуются, потребляются или используются функцией для получения результата.</w:t>
-      </w:r>
-      <w:r>
-        <w:t>[4]</w:t>
-      </w:r>
-    </w:p>
-    <w:p>
-      <w:r>
-        <w:t>Управление (</w:t>
-      </w:r>
-      <w:r>
-        <w:rPr>
-          <w:lang w:val="en-US"/>
-        </w:rPr>
-        <w:t>Control</w:t>
-      </w:r>
-      <w:r>
-        <w:t>) – правила, инструкции, стандарты, законодательные акты и регламенты, которые направляют выполнение функции, но не преобразуются в процессе.</w:t>
-      </w:r>
-      <w:r>
-        <w:t>[1]</w:t>
-      </w:r>
-    </w:p>
-    <w:p>
-      <w:r>
-        <w:t>Выход (</w:t>
-      </w:r>
-      <w:r>
-        <w:rPr>
-          <w:lang w:val="en-US"/>
-        </w:rPr>
-        <w:t>Output</w:t>
-      </w:r>
-      <w:r>
-        <w:t xml:space="preserve">) – материальные объекты или информация, которые являются результатом выполнения функции. </w:t>
-      </w:r>
-      <w:r>
-        <w:t>[4]</w:t>
       </w:r>
     </w:p>
     <w:p>
@@ -311,6 +236,101 @@
         </w:rPr>
       </w:pPr>
       <w:r>
+        <w:t>Контекстная диаграмма – диаграмма верхнего уровня модели, представляющая систему как единый блок с определенными внешними входами, выходами, механизмами и управляющими воздействиями.</w:t>
+      </w:r>
+    </w:p>
+    <w:p>
+      <w:r>
+        <w:lastRenderedPageBreak/>
+        <w:t>Декомпозиция – методология разбиения сложной системы или процесса на более простые, детализированные подпроцессы для лучшего понимания их внутренней структуры.</w:t>
+      </w:r>
+      <w:r>
+        <w:t>[1]</w:t>
+      </w:r>
+    </w:p>
+    <w:p>
+      <w:pPr>
+        <w:rPr>
+          <w:lang w:val="en-US"/>
+        </w:rPr>
+      </w:pPr>
+      <w:r>
+        <w:t>Бизнес-процесс – логически взаимосвязанная и последовательная совокупность мероприятий, которые потребляют ресурсы для создания ценности и результата для клиента.</w:t>
+      </w:r>
+    </w:p>
+    <w:p>
+      <w:r>
+        <w:t>Вход (</w:t>
+      </w:r>
+      <w:r>
+        <w:rPr>
+          <w:lang w:val="en-US"/>
+        </w:rPr>
+        <w:t>Input</w:t>
+      </w:r>
+      <w:r>
+        <w:t>) – материальные объекты или информация, которые преобразуются, потребляются или используются функцией для получения результата.</w:t>
+      </w:r>
+      <w:r>
+        <w:t>[</w:t>
+      </w:r>
+      <w:r>
+        <w:t>3</w:t>
+      </w:r>
+      <w:r>
+        <w:t>]</w:t>
+      </w:r>
+    </w:p>
+    <w:p>
+      <w:r>
+        <w:t>Управление (</w:t>
+      </w:r>
+      <w:r>
+        <w:rPr>
+          <w:lang w:val="en-US"/>
+        </w:rPr>
+        <w:t>Control</w:t>
+      </w:r>
+      <w:r>
+        <w:t>) – правила, инструкции, стандарты, законодательные акты и регламенты, которые направляют выполнение функции, но не преобразуются в процессе.</w:t>
+      </w:r>
+      <w:r>
+        <w:t>[1]</w:t>
+      </w:r>
+    </w:p>
+    <w:p>
+      <w:r>
+        <w:t>Выход (</w:t>
+      </w:r>
+      <w:r>
+        <w:rPr>
+          <w:lang w:val="en-US"/>
+        </w:rPr>
+        <w:t>Output</w:t>
+      </w:r>
+      <w:r>
+        <w:t xml:space="preserve">) – материальные объекты или информация, которые являются результатом выполнения функции. </w:t>
+      </w:r>
+      <w:r>
+        <w:t>[</w:t>
+      </w:r>
+      <w:r>
+        <w:rPr>
+          <w:lang w:val="en-US"/>
+        </w:rPr>
+        <w:t>3</w:t>
+      </w:r>
+      <w:r>
+        <w:t>]</w:t>
+      </w:r>
+    </w:p>
+    <w:p>
+      <w:pPr>
+        <w:rPr>
+          <w:lang w:val="en-US"/>
+        </w:rPr>
+      </w:pPr>
+      <w:r>
         <w:t>Механизм (</w:t>
       </w:r>
       <w:r>
@@ -322,9 +342,6 @@
       <w:r>
         <w:t>) – ресурсы (персонал, оборудование, программное обеспечение, инфраструктура), которые выполняют функцию или способствуют ее выполнению.</w:t>
       </w:r>
-      <w:r>
-        <w:t>[2]</w:t>
-      </w:r>
     </w:p>
     <w:p>
       <w:r>
@@ -349,7 +366,13 @@
         <w:t>0, представляющий потоки данных, материальные ресурсы или управляющие воздействия, связывающие блоки между собой и с внешней средой.</w:t>
       </w:r>
       <w:r>
-        <w:t>[4]</w:t>
+        <w:t>[</w:t>
+      </w:r>
+      <w:r>
+        <w:t>3</w:t>
+      </w:r>
+      <w:r>
+        <w:t>]</w:t>
       </w:r>
     </w:p>
     <w:p>
@@ -393,7 +416,6 @@
     </w:p>
     <w:p>
       <w:r>
-        <w:lastRenderedPageBreak/>
         <w:t>Продажа компьютерной техники (</w:t>
       </w:r>
       <w:r>
@@ -408,6 +430,7 @@
     </w:p>
     <w:p>
       <w:r>
+        <w:lastRenderedPageBreak/>
         <w:t>Сборка компьютера по заказу (</w:t>
       </w:r>
       <w:r>
@@ -7921,7 +7944,7 @@
         </w:rPr>
         <w:lastRenderedPageBreak/>
         <w:drawing>
-          <wp:anchor distT="0" distB="0" distL="114300" distR="114300" simplePos="0" relativeHeight="251659264" behindDoc="0" locked="0" layoutInCell="1" allowOverlap="1" wp14:anchorId="2EA7CA7F" wp14:editId="19293C42">
+          <wp:anchor distT="0" distB="0" distL="114300" distR="114300" simplePos="0" relativeHeight="251658240" behindDoc="0" locked="0" layoutInCell="1" allowOverlap="1" wp14:anchorId="2EA7CA7F" wp14:editId="19293C42">
             <wp:simplePos x="0" y="0"/>
             <wp:positionH relativeFrom="column">
               <wp:posOffset>0</wp:posOffset>
@@ -15506,7 +15529,13 @@
       </w:r>
       <w:proofErr w:type="spellEnd"/>
       <w:r>
-        <w:t xml:space="preserve"> А.А. Проектирование программного обеспечения экономических информационных систем: Учебник. — 2-е изд., </w:t>
+        <w:t xml:space="preserve"> А.</w:t>
+      </w:r>
+      <w:r>
+        <w:t>М</w:t>
+      </w:r>
+      <w:r>
+        <w:t xml:space="preserve">. Проектирование программного обеспечения экономических информационных систем: Учебник. — 2-е изд., </w:t>
       </w:r>
       <w:proofErr w:type="spellStart"/>
       <w:r>
@@ -15515,32 +15544,6 @@
       <w:proofErr w:type="spellEnd"/>
       <w:r>
         <w:t>. и доп. — М.: Финансы и статистика, 2006. — 544 с.</w:t>
-      </w:r>
-    </w:p>
-    <w:p>
-      <w:pPr>
-        <w:pStyle w:val="af2"/>
-        <w:numPr>
-          <w:ilvl w:val="0"/>
-          <w:numId w:val="2"/>
-        </w:numPr>
-      </w:pPr>
-      <w:proofErr w:type="spellStart"/>
-      <w:r>
-        <w:t>Калянов</w:t>
-      </w:r>
-      <w:proofErr w:type="spellEnd"/>
-      <w:r>
-        <w:t xml:space="preserve"> Г.Н. Структура и организация моделей в методологии </w:t>
-      </w:r>
-      <w:r>
-        <w:rPr>
-          <w:lang w:val="en-US"/>
-        </w:rPr>
-        <w:t>IDEF</w:t>
-      </w:r>
-      <w:r>
-        <w:t>. — М.: СИНТЕГ, 2000. — 244 с.</w:t>
       </w:r>
     </w:p>
     <w:p>

</xml_diff>

<commit_message>
vault backup: 2026-10-13 19:24:18
</commit_message>
<xml_diff>
--- a/ПРЕДМЕТЫ/Архитектура предприятий и корпоративных информационных систем/Лабы/Лаба 1/Поповкин. Лабораторная работа 1.docx
+++ b/ПРЕДМЕТЫ/Архитектура предприятий и корпоративных информационных систем/Лабы/Лаба 1/Поповкин. Лабораторная работа 1.docx
@@ -1015,10 +1015,21 @@
         <w:t>Modeling</w:t>
       </w:r>
       <w:r>
-        <w:t>) – методология и нотация функционального моделирования, предназначенная для описания бизнес-процессов в виде иерархической системы взаимосвязанных функций и потоков.</w:t>
-      </w:r>
-      <w:r>
-        <w:t>[1]</w:t>
+        <w:t xml:space="preserve">) – методология и нотация функционального моделирования, предназначенная для описания бизнес-процессов в виде иерархической системы взаимосвязанных функций и </w:t>
+      </w:r>
+      <w:proofErr w:type="gramStart"/>
+      <w:r>
+        <w:t>потоков</w:t>
+      </w:r>
+      <w:r>
+        <w:t>[</w:t>
+      </w:r>
+      <w:proofErr w:type="gramEnd"/>
+      <w:r>
+        <w:t>1]</w:t>
+      </w:r>
+      <w:r>
+        <w:t>.</w:t>
       </w:r>
     </w:p>
     <w:p>
@@ -1029,10 +1040,13 @@
     <w:p>
       <w:r>
         <w:lastRenderedPageBreak/>
-        <w:t>Декомпозиция – методология разбиения сложной системы или процесса на более простые, детализированные подпроцессы для лучшего понимания их внутренней структуры.</w:t>
+        <w:t>Декомпозиция – методология разбиения сложной системы или процесса на более простые, детализированные подпроцессы для лучшего понимания их внутренней структуры</w:t>
       </w:r>
       <w:r>
         <w:t>[1]</w:t>
+      </w:r>
+      <w:r>
+        <w:t>.</w:t>
       </w:r>
     </w:p>
     <w:p>
@@ -1051,7 +1065,7 @@
         <w:t>Input</w:t>
       </w:r>
       <w:r>
-        <w:t>) – материальные объекты или информация, которые преобразуются, потребляются или используются функцией для получения результата.</w:t>
+        <w:t>) – материальные объекты или информация, которые преобразуются, потребляются или используются функцией для получения результата</w:t>
       </w:r>
       <w:r>
         <w:t>[</w:t>
@@ -1061,6 +1075,9 @@
       </w:r>
       <w:r>
         <w:t>]</w:t>
+      </w:r>
+      <w:r>
+        <w:t>.</w:t>
       </w:r>
     </w:p>
     <w:p>
@@ -1074,10 +1091,13 @@
         <w:t>Control</w:t>
       </w:r>
       <w:r>
-        <w:t>) – правила, инструкции, стандарты, законодательные акты и регламенты, которые направляют выполнение функции, но не преобразуются в процессе.</w:t>
+        <w:t>) – правила, инструкции, стандарты, законодательные акты и регламенты, которые направляют выполнение функции, но не преобразуются в процессе</w:t>
       </w:r>
       <w:r>
         <w:t>[1]</w:t>
+      </w:r>
+      <w:r>
+        <w:t>.</w:t>
       </w:r>
     </w:p>
     <w:p>
@@ -1091,7 +1111,7 @@
         <w:t>Output</w:t>
       </w:r>
       <w:r>
-        <w:t xml:space="preserve">) – материальные объекты или информация, которые являются результатом выполнения функции. </w:t>
+        <w:t>) – материальные объекты или информация, которые являются результатом выполнения функции</w:t>
       </w:r>
       <w:r>
         <w:t>[</w:t>
@@ -1101,6 +1121,9 @@
       </w:r>
       <w:r>
         <w:t>]</w:t>
+      </w:r>
+      <w:r>
+        <w:t>.</w:t>
       </w:r>
     </w:p>
     <w:p>
@@ -1137,7 +1160,7 @@
         <w:t>IDEF</w:t>
       </w:r>
       <w:r>
-        <w:t>0, представляющий потоки данных, материальные ресурсы или управляющие воздействия, связывающие блоки между собой и с внешней средой.</w:t>
+        <w:t>0, представляющий потоки данных, материальные ресурсы или управляющие воздействия, связывающие блоки между собой и с внешней средой</w:t>
       </w:r>
       <w:r>
         <w:t>[</w:t>
@@ -1147,6 +1170,9 @@
       </w:r>
       <w:r>
         <w:t>]</w:t>
+      </w:r>
+      <w:r>
+        <w:t>.</w:t>
       </w:r>
     </w:p>
     <w:p>
@@ -1160,10 +1186,13 @@
         <w:t>IDEF</w:t>
       </w:r>
       <w:r>
-        <w:t>0, обозначающий конкретную функцию, процесс или вид деятельности, который имеет наименование и уникальный идентификационный номер.</w:t>
+        <w:t>0, обозначающий конкретную функцию, процесс или вид деятельности, который имеет наименование и уникальный идентификационный номер</w:t>
       </w:r>
       <w:r>
         <w:t>[1]</w:t>
+      </w:r>
+      <w:r>
+        <w:t>.</w:t>
       </w:r>
     </w:p>
     <w:p>
@@ -9217,7 +9246,33 @@
         <w:rPr>
           <w:rFonts w:eastAsia="MS Mincho"/>
           <w:szCs w:val="28"/>
-          <w:lang w:eastAsia="en-US"/>
+          <w:lang w:val="en-US" w:eastAsia="en-US"/>
+        </w:rPr>
+      </w:pPr>
+    </w:p>
+    <w:p>
+      <w:pPr>
+        <w:suppressAutoHyphens/>
+        <w:spacing w:after="160" w:line="256" w:lineRule="auto"/>
+        <w:ind w:firstLine="0"/>
+        <w:contextualSpacing w:val="0"/>
+        <w:rPr>
+          <w:rFonts w:eastAsia="MS Mincho"/>
+          <w:szCs w:val="28"/>
+          <w:lang w:val="en-US" w:eastAsia="en-US"/>
+        </w:rPr>
+      </w:pPr>
+    </w:p>
+    <w:p>
+      <w:pPr>
+        <w:suppressAutoHyphens/>
+        <w:spacing w:after="160" w:line="256" w:lineRule="auto"/>
+        <w:ind w:firstLine="0"/>
+        <w:contextualSpacing w:val="0"/>
+        <w:rPr>
+          <w:rFonts w:eastAsia="MS Mincho"/>
+          <w:szCs w:val="28"/>
+          <w:lang w:val="en-US" w:eastAsia="en-US"/>
         </w:rPr>
       </w:pPr>
     </w:p>
@@ -9229,6 +9284,7 @@
         </w:rPr>
       </w:pPr>
       <w:r>
+        <w:lastRenderedPageBreak/>
         <w:t xml:space="preserve">Таблица </w:t>
       </w:r>
       <w:r>
@@ -9415,7 +9471,6 @@
                 <w:rFonts w:ascii="Times New Roman" w:hAnsi="Times New Roman" w:cs="Times New Roman"/>
                 <w:szCs w:val="28"/>
               </w:rPr>
-              <w:lastRenderedPageBreak/>
               <w:t>A3.1</w:t>
             </w:r>
           </w:p>
@@ -10958,6 +11013,7 @@
                 <w:rFonts w:ascii="Times New Roman" w:hAnsi="Times New Roman" w:cs="Times New Roman"/>
                 <w:szCs w:val="28"/>
               </w:rPr>
+              <w:lastRenderedPageBreak/>
               <w:t>A3.13</w:t>
             </w:r>
           </w:p>
@@ -11018,15 +11074,7 @@
                 <w:rFonts w:ascii="Times New Roman" w:hAnsi="Times New Roman" w:cs="Times New Roman"/>
                 <w:szCs w:val="28"/>
               </w:rPr>
-              <w:t xml:space="preserve">Запчасти, инструменты и </w:t>
-            </w:r>
-            <w:r>
-              <w:rPr>
-                <w:rFonts w:ascii="Times New Roman" w:hAnsi="Times New Roman" w:cs="Times New Roman"/>
-                <w:szCs w:val="28"/>
-              </w:rPr>
-              <w:lastRenderedPageBreak/>
-              <w:t>оборудование.</w:t>
+              <w:t>Запчасти, инструменты и оборудование.</w:t>
             </w:r>
           </w:p>
         </w:tc>
@@ -11057,7 +11105,6 @@
                 <w:rFonts w:ascii="Times New Roman" w:hAnsi="Times New Roman" w:cs="Times New Roman"/>
                 <w:szCs w:val="28"/>
               </w:rPr>
-              <w:lastRenderedPageBreak/>
               <w:t>Mechanism</w:t>
             </w:r>
             <w:proofErr w:type="spellEnd"/>
@@ -11142,41 +11189,18 @@
         </w:rPr>
       </w:pPr>
       <w:r>
-        <w:t>Диагностика внутри центра (</w:t>
-      </w:r>
-      <w:r>
-        <w:rPr>
-          <w:lang w:val="en-US"/>
-        </w:rPr>
-        <w:t>A</w:t>
-      </w:r>
-      <w:r>
-        <w:t>3.1.3) – проведение работ в условиях сервисно</w:t>
-      </w:r>
-      <w:r>
-        <w:rPr>
-          <w:szCs w:val="28"/>
-        </w:rPr>
-        <w:t>го центра.</w:t>
-      </w:r>
-    </w:p>
-    <w:p>
-      <w:pPr>
-        <w:pStyle w:val="af0"/>
-      </w:pPr>
-      <w:r>
         <w:rPr>
           <w:noProof/>
           <w:szCs w:val="28"/>
         </w:rPr>
         <w:drawing>
-          <wp:anchor distT="0" distB="0" distL="114300" distR="114300" simplePos="0" relativeHeight="251660288" behindDoc="0" locked="0" layoutInCell="1" allowOverlap="1" wp14:anchorId="77F7BBE3" wp14:editId="54032F13">
+          <wp:anchor distT="0" distB="0" distL="114300" distR="114300" simplePos="0" relativeHeight="251658240" behindDoc="0" locked="0" layoutInCell="1" allowOverlap="1" wp14:anchorId="77F7BBE3" wp14:editId="336D4D10">
             <wp:simplePos x="0" y="0"/>
             <wp:positionH relativeFrom="column">
               <wp:posOffset>0</wp:posOffset>
             </wp:positionH>
             <wp:positionV relativeFrom="paragraph">
-              <wp:posOffset>0</wp:posOffset>
+              <wp:posOffset>640623</wp:posOffset>
             </wp:positionV>
             <wp:extent cx="6119495" cy="4324350"/>
             <wp:effectExtent l="0" t="0" r="0" b="0"/>
@@ -11233,6 +11257,29 @@
         </w:drawing>
       </w:r>
       <w:r>
+        <w:t>Диагностика внутри центра (</w:t>
+      </w:r>
+      <w:r>
+        <w:rPr>
+          <w:lang w:val="en-US"/>
+        </w:rPr>
+        <w:t>A</w:t>
+      </w:r>
+      <w:r>
+        <w:t>3.1.3) – проведение работ в условиях сервисно</w:t>
+      </w:r>
+      <w:r>
+        <w:rPr>
+          <w:szCs w:val="28"/>
+        </w:rPr>
+        <w:t>го центра.</w:t>
+      </w:r>
+    </w:p>
+    <w:p>
+      <w:pPr>
+        <w:pStyle w:val="af0"/>
+      </w:pPr>
+      <w:r>
         <w:t xml:space="preserve">Рисунок </w:t>
       </w:r>
       <w:r>
@@ -11241,6 +11288,20 @@
       <w:r>
         <w:t xml:space="preserve"> – Декомпозиция процесса «Диагностирование проблемы»</w:t>
       </w:r>
+    </w:p>
+    <w:p>
+      <w:pPr>
+        <w:rPr>
+          <w:lang w:val="en-US"/>
+        </w:rPr>
+      </w:pPr>
+    </w:p>
+    <w:p>
+      <w:pPr>
+        <w:rPr>
+          <w:lang w:val="en-US"/>
+        </w:rPr>
+      </w:pPr>
     </w:p>
     <w:p/>
     <w:p>
@@ -11251,6 +11312,7 @@
         </w:rPr>
       </w:pPr>
       <w:r>
+        <w:lastRenderedPageBreak/>
         <w:t>Таблица 7 – Процессы диаграммы A3.1 «Диагностирование»</w:t>
       </w:r>
     </w:p>
@@ -11428,15 +11490,7 @@
                 <w:rFonts w:ascii="Times New Roman" w:hAnsi="Times New Roman" w:cs="Times New Roman"/>
                 <w:szCs w:val="28"/>
               </w:rPr>
-              <w:t xml:space="preserve">Определение запроса </w:t>
-            </w:r>
-            <w:r>
-              <w:rPr>
-                <w:rFonts w:ascii="Times New Roman" w:hAnsi="Times New Roman" w:cs="Times New Roman"/>
-                <w:szCs w:val="28"/>
-              </w:rPr>
-              <w:lastRenderedPageBreak/>
-              <w:t>клиента</w:t>
+              <w:t>Определение запроса клиента</w:t>
             </w:r>
           </w:p>
         </w:tc>
@@ -11466,16 +11520,7 @@
                 <w:rFonts w:ascii="Times New Roman" w:hAnsi="Times New Roman" w:cs="Times New Roman"/>
                 <w:szCs w:val="28"/>
               </w:rPr>
-              <w:lastRenderedPageBreak/>
-              <w:t xml:space="preserve">Определить требуемый </w:t>
-            </w:r>
-            <w:r>
-              <w:rPr>
-                <w:rFonts w:ascii="Times New Roman" w:hAnsi="Times New Roman" w:cs="Times New Roman"/>
-                <w:szCs w:val="28"/>
-              </w:rPr>
-              <w:lastRenderedPageBreak/>
-              <w:t>формат диагностики.</w:t>
+              <w:t>Определить требуемый формат диагностики.</w:t>
             </w:r>
           </w:p>
         </w:tc>
@@ -11510,7 +11555,6 @@
                 <w:rFonts w:ascii="Times New Roman" w:hAnsi="Times New Roman" w:cs="Times New Roman"/>
                 <w:szCs w:val="28"/>
               </w:rPr>
-              <w:lastRenderedPageBreak/>
               <w:t>A3.1.2</w:t>
             </w:r>
           </w:p>
@@ -12927,7 +12971,15 @@
                 <w:rFonts w:ascii="Times New Roman" w:hAnsi="Times New Roman" w:cs="Times New Roman"/>
                 <w:szCs w:val="28"/>
               </w:rPr>
-              <w:t>Сломанное устройство</w:t>
+              <w:t xml:space="preserve">Сломанное </w:t>
+            </w:r>
+            <w:r>
+              <w:rPr>
+                <w:rFonts w:ascii="Times New Roman" w:hAnsi="Times New Roman" w:cs="Times New Roman"/>
+                <w:szCs w:val="28"/>
+              </w:rPr>
+              <w:lastRenderedPageBreak/>
+              <w:t>устройство</w:t>
             </w:r>
           </w:p>
         </w:tc>
@@ -12957,7 +13009,16 @@
                 <w:rFonts w:ascii="Times New Roman" w:hAnsi="Times New Roman" w:cs="Times New Roman"/>
                 <w:szCs w:val="28"/>
               </w:rPr>
-              <w:t>Устройство с выявленной неисправностью.</w:t>
+              <w:lastRenderedPageBreak/>
+              <w:t xml:space="preserve">Устройство с выявленной </w:t>
+            </w:r>
+            <w:r>
+              <w:rPr>
+                <w:rFonts w:ascii="Times New Roman" w:hAnsi="Times New Roman" w:cs="Times New Roman"/>
+                <w:szCs w:val="28"/>
+              </w:rPr>
+              <w:lastRenderedPageBreak/>
+              <w:t>неисправностью.</w:t>
             </w:r>
           </w:p>
         </w:tc>
@@ -12988,6 +13049,7 @@
                 <w:rFonts w:ascii="Times New Roman" w:hAnsi="Times New Roman" w:cs="Times New Roman"/>
                 <w:szCs w:val="28"/>
               </w:rPr>
+              <w:lastRenderedPageBreak/>
               <w:t>Output</w:t>
             </w:r>
             <w:proofErr w:type="spellEnd"/>
@@ -13054,15 +13116,7 @@
                 <w:rFonts w:ascii="Times New Roman" w:hAnsi="Times New Roman" w:cs="Times New Roman"/>
                 <w:szCs w:val="28"/>
               </w:rPr>
-              <w:t xml:space="preserve">Денежные </w:t>
-            </w:r>
-            <w:r>
-              <w:rPr>
-                <w:rFonts w:ascii="Times New Roman" w:hAnsi="Times New Roman" w:cs="Times New Roman"/>
-                <w:szCs w:val="28"/>
-              </w:rPr>
-              <w:lastRenderedPageBreak/>
-              <w:t>средства клиента</w:t>
+              <w:t>Денежные средства клиента</w:t>
             </w:r>
           </w:p>
         </w:tc>
@@ -13092,16 +13146,7 @@
                 <w:rFonts w:ascii="Times New Roman" w:hAnsi="Times New Roman" w:cs="Times New Roman"/>
                 <w:szCs w:val="28"/>
               </w:rPr>
-              <w:lastRenderedPageBreak/>
-              <w:t xml:space="preserve">Оплата диагностических </w:t>
-            </w:r>
-            <w:r>
-              <w:rPr>
-                <w:rFonts w:ascii="Times New Roman" w:hAnsi="Times New Roman" w:cs="Times New Roman"/>
-                <w:szCs w:val="28"/>
-              </w:rPr>
-              <w:lastRenderedPageBreak/>
-              <w:t>услуг.</w:t>
+              <w:t>Оплата диагностических услуг.</w:t>
             </w:r>
           </w:p>
         </w:tc>
@@ -13132,7 +13177,6 @@
                 <w:rFonts w:ascii="Times New Roman" w:hAnsi="Times New Roman" w:cs="Times New Roman"/>
                 <w:szCs w:val="28"/>
               </w:rPr>
-              <w:lastRenderedPageBreak/>
               <w:t>Output</w:t>
             </w:r>
             <w:proofErr w:type="spellEnd"/>
@@ -17314,13 +17358,12 @@
     <w:basedOn w:val="a"/>
     <w:link w:val="af"/>
     <w:qFormat/>
-    <w:rsid w:val="00797098"/>
+    <w:rsid w:val="00A23B52"/>
     <w:pPr>
       <w:suppressAutoHyphens/>
       <w:spacing w:before="120" w:after="60" w:line="256" w:lineRule="auto"/>
       <w:ind w:firstLine="0"/>
       <w:contextualSpacing w:val="0"/>
-      <w:jc w:val="right"/>
     </w:pPr>
     <w:rPr>
       <w:rFonts w:cs="Calibri"/>
@@ -17333,7 +17376,7 @@
     <w:name w:val="Заголовок таблицы Знак"/>
     <w:basedOn w:val="a0"/>
     <w:link w:val="ae"/>
-    <w:rsid w:val="00797098"/>
+    <w:rsid w:val="00A23B52"/>
     <w:rPr>
       <w:rFonts w:cs="Calibri"/>
       <w:sz w:val="24"/>

</xml_diff>

<commit_message>
vault backup: 2026-10-13 19:29:59
</commit_message>
<xml_diff>
--- a/ПРЕДМЕТЫ/Архитектура предприятий и корпоративных информационных систем/Лабы/Лаба 1/Поповкин. Лабораторная работа 1.docx
+++ b/ПРЕДМЕТЫ/Архитектура предприятий и корпоративных информационных систем/Лабы/Лаба 1/Поповкин. Лабораторная работа 1.docx
@@ -29,7 +29,7 @@
               <w:noProof/>
             </w:rPr>
             <w:drawing>
-              <wp:anchor distT="0" distB="0" distL="114300" distR="114300" simplePos="0" relativeHeight="251656704" behindDoc="0" locked="0" layoutInCell="1" allowOverlap="1" wp14:anchorId="3CC735B9" wp14:editId="4164C56F">
+              <wp:anchor distT="0" distB="0" distL="114300" distR="114300" simplePos="0" relativeHeight="251655680" behindDoc="0" locked="0" layoutInCell="1" allowOverlap="1" wp14:anchorId="3CC735B9" wp14:editId="3BF215B2">
                 <wp:simplePos x="0" y="0"/>
                 <wp:positionH relativeFrom="column">
                   <wp:posOffset>2764790</wp:posOffset>
@@ -97,7 +97,7 @@
               <w:sz w:val="24"/>
             </w:rPr>
             <w:drawing>
-              <wp:anchor distT="0" distB="0" distL="114300" distR="114300" simplePos="0" relativeHeight="251658752" behindDoc="0" locked="0" layoutInCell="1" allowOverlap="1" wp14:anchorId="388BA482" wp14:editId="6032D07D">
+              <wp:anchor distT="0" distB="0" distL="114300" distR="114300" simplePos="0" relativeHeight="251659776" behindDoc="0" locked="0" layoutInCell="1" allowOverlap="1" wp14:anchorId="388BA482" wp14:editId="0A06B000">
                 <wp:simplePos x="0" y="0"/>
                 <wp:positionH relativeFrom="column">
                   <wp:posOffset>2764790</wp:posOffset>
@@ -1334,7 +1334,7 @@
         </w:rPr>
         <w:lastRenderedPageBreak/>
         <w:drawing>
-          <wp:anchor distT="0" distB="0" distL="114300" distR="114300" simplePos="0" relativeHeight="251656192" behindDoc="0" locked="0" layoutInCell="1" allowOverlap="1" wp14:anchorId="3F00D65B" wp14:editId="7A205CA2">
+          <wp:anchor distT="0" distB="0" distL="114300" distR="114300" simplePos="0" relativeHeight="251654656" behindDoc="0" locked="0" layoutInCell="1" allowOverlap="1" wp14:anchorId="3F00D65B" wp14:editId="47059356">
             <wp:simplePos x="0" y="0"/>
             <wp:positionH relativeFrom="column">
               <wp:posOffset>0</wp:posOffset>
@@ -3256,16 +3256,16 @@
         </w:rPr>
         <w:lastRenderedPageBreak/>
         <w:drawing>
-          <wp:anchor distT="0" distB="0" distL="114300" distR="114300" simplePos="0" relativeHeight="251657216" behindDoc="0" locked="0" layoutInCell="1" allowOverlap="1" wp14:anchorId="37BEC60F" wp14:editId="0381F012">
+          <wp:anchor distT="0" distB="0" distL="114300" distR="114300" simplePos="0" relativeHeight="251656704" behindDoc="0" locked="0" layoutInCell="1" allowOverlap="1" wp14:anchorId="37BEC60F" wp14:editId="51372421">
             <wp:simplePos x="0" y="0"/>
             <wp:positionH relativeFrom="column">
-              <wp:posOffset>0</wp:posOffset>
+              <wp:posOffset>4445</wp:posOffset>
             </wp:positionH>
             <wp:positionV relativeFrom="paragraph">
-              <wp:posOffset>-263951</wp:posOffset>
+              <wp:posOffset>-267970</wp:posOffset>
             </wp:positionV>
-            <wp:extent cx="6119495" cy="4324350"/>
-            <wp:effectExtent l="0" t="0" r="0" b="0"/>
+            <wp:extent cx="6119495" cy="4323715"/>
+            <wp:effectExtent l="0" t="0" r="0" b="635"/>
             <wp:wrapTopAndBottom/>
             <wp:docPr id="81708121" name="Рисунок 3"/>
             <wp:cNvGraphicFramePr>
@@ -3275,7 +3275,7 @@
               <a:graphicData uri="http://schemas.openxmlformats.org/drawingml/2006/picture">
                 <pic:pic xmlns:pic="http://schemas.openxmlformats.org/drawingml/2006/picture">
                   <pic:nvPicPr>
-                    <pic:cNvPr id="0" name="Picture 4"/>
+                    <pic:cNvPr id="81708121" name="Рисунок 3"/>
                     <pic:cNvPicPr>
                       <a:picLocks noChangeAspect="1" noChangeArrowheads="1"/>
                     </pic:cNvPicPr>
@@ -3288,7 +3288,6 @@
                         </a:ext>
                       </a:extLst>
                     </a:blip>
-                    <a:srcRect/>
                     <a:stretch>
                       <a:fillRect/>
                     </a:stretch>
@@ -3296,7 +3295,7 @@
                   <pic:spPr bwMode="auto">
                     <a:xfrm>
                       <a:off x="0" y="0"/>
-                      <a:ext cx="6119495" cy="4324350"/>
+                      <a:ext cx="6119495" cy="4323715"/>
                     </a:xfrm>
                     <a:prstGeom prst="rect">
                       <a:avLst/>
@@ -8727,7 +8726,7 @@
         </w:rPr>
         <w:lastRenderedPageBreak/>
         <w:drawing>
-          <wp:anchor distT="0" distB="0" distL="114300" distR="114300" simplePos="0" relativeHeight="251658240" behindDoc="0" locked="0" layoutInCell="1" allowOverlap="1" wp14:anchorId="2EA7CA7F" wp14:editId="19293C42">
+          <wp:anchor distT="0" distB="0" distL="114300" distR="114300" simplePos="0" relativeHeight="251657728" behindDoc="0" locked="0" layoutInCell="1" allowOverlap="1" wp14:anchorId="2EA7CA7F" wp14:editId="4B71F75B">
             <wp:simplePos x="0" y="0"/>
             <wp:positionH relativeFrom="column">
               <wp:posOffset>0</wp:posOffset>
@@ -11194,7 +11193,7 @@
           <w:szCs w:val="28"/>
         </w:rPr>
         <w:drawing>
-          <wp:anchor distT="0" distB="0" distL="114300" distR="114300" simplePos="0" relativeHeight="251658240" behindDoc="0" locked="0" layoutInCell="1" allowOverlap="1" wp14:anchorId="77F7BBE3" wp14:editId="336D4D10">
+          <wp:anchor distT="0" distB="0" distL="114300" distR="114300" simplePos="0" relativeHeight="251658240" behindDoc="0" locked="0" layoutInCell="1" allowOverlap="1" wp14:anchorId="77F7BBE3" wp14:editId="6E2B3114">
             <wp:simplePos x="0" y="0"/>
             <wp:positionH relativeFrom="column">
               <wp:posOffset>0</wp:posOffset>
@@ -13562,7 +13561,7 @@
         </w:rPr>
         <w:lastRenderedPageBreak/>
         <w:drawing>
-          <wp:anchor distT="0" distB="0" distL="114300" distR="114300" simplePos="0" relativeHeight="251661312" behindDoc="0" locked="0" layoutInCell="1" allowOverlap="1" wp14:anchorId="7CC4D1C0" wp14:editId="307BCA0A">
+          <wp:anchor distT="0" distB="0" distL="114300" distR="114300" simplePos="0" relativeHeight="251660800" behindDoc="0" locked="0" layoutInCell="1" allowOverlap="1" wp14:anchorId="7CC4D1C0" wp14:editId="3D9A9A7C">
             <wp:simplePos x="0" y="0"/>
             <wp:positionH relativeFrom="column">
               <wp:posOffset>0</wp:posOffset>

</xml_diff>

<commit_message>
vault backup: 2026-10-13 19:33:17
</commit_message>
<xml_diff>
--- a/ПРЕДМЕТЫ/Архитектура предприятий и корпоративных информационных систем/Лабы/Лаба 1/Поповкин. Лабораторная работа 1.docx
+++ b/ПРЕДМЕТЫ/Архитектура предприятий и корпоративных информационных систем/Лабы/Лаба 1/Поповкин. Лабораторная работа 1.docx
@@ -712,7 +712,6 @@
         <w:ind w:right="-1" w:firstLine="0"/>
         <w:contextualSpacing w:val="0"/>
         <w:jc w:val="center"/>
-        <w:outlineLvl w:val="3"/>
         <w:rPr>
           <w:szCs w:val="28"/>
         </w:rPr>
@@ -725,7 +724,6 @@
         <w:ind w:right="-1" w:firstLine="0"/>
         <w:contextualSpacing w:val="0"/>
         <w:jc w:val="center"/>
-        <w:outlineLvl w:val="3"/>
         <w:rPr>
           <w:szCs w:val="28"/>
         </w:rPr>
@@ -738,7 +736,6 @@
         <w:ind w:right="-1" w:firstLine="0"/>
         <w:contextualSpacing w:val="0"/>
         <w:jc w:val="center"/>
-        <w:outlineLvl w:val="3"/>
         <w:rPr>
           <w:szCs w:val="28"/>
         </w:rPr>
@@ -751,7 +748,6 @@
         <w:ind w:right="-1" w:firstLine="0"/>
         <w:contextualSpacing w:val="0"/>
         <w:jc w:val="center"/>
-        <w:outlineLvl w:val="3"/>
         <w:rPr>
           <w:szCs w:val="28"/>
         </w:rPr>
@@ -11288,20 +11284,8 @@
         <w:t xml:space="preserve"> – Декомпозиция процесса «Диагностирование проблемы»</w:t>
       </w:r>
     </w:p>
-    <w:p>
-      <w:pPr>
-        <w:rPr>
-          <w:lang w:val="en-US"/>
-        </w:rPr>
-      </w:pPr>
-    </w:p>
-    <w:p>
-      <w:pPr>
-        <w:rPr>
-          <w:lang w:val="en-US"/>
-        </w:rPr>
-      </w:pPr>
-    </w:p>
+    <w:p/>
+    <w:p/>
     <w:p/>
     <w:p>
       <w:pPr>

</xml_diff>

<commit_message>
vault backup: 2026-10-13 19:43:15
</commit_message>
<xml_diff>
--- a/ПРЕДМЕТЫ/Архитектура предприятий и корпоративных информационных систем/Лабы/Лаба 1/Поповкин. Лабораторная работа 1.docx
+++ b/ПРЕДМЕТЫ/Архитектура предприятий и корпоративных информационных систем/Лабы/Лаба 1/Поповкин. Лабораторная работа 1.docx
@@ -3252,7 +3252,7 @@
         </w:rPr>
         <w:lastRenderedPageBreak/>
         <w:drawing>
-          <wp:anchor distT="0" distB="0" distL="114300" distR="114300" simplePos="0" relativeHeight="251656704" behindDoc="0" locked="0" layoutInCell="1" allowOverlap="1" wp14:anchorId="37BEC60F" wp14:editId="51372421">
+          <wp:anchor distT="0" distB="0" distL="114300" distR="114300" simplePos="0" relativeHeight="251656704" behindDoc="0" locked="0" layoutInCell="1" allowOverlap="1" wp14:anchorId="37BEC60F" wp14:editId="566C5274">
             <wp:simplePos x="0" y="0"/>
             <wp:positionH relativeFrom="column">
               <wp:posOffset>4445</wp:posOffset>
@@ -3260,7 +3260,7 @@
             <wp:positionV relativeFrom="paragraph">
               <wp:posOffset>-267970</wp:posOffset>
             </wp:positionV>
-            <wp:extent cx="6119495" cy="4323715"/>
+            <wp:extent cx="6118225" cy="4323715"/>
             <wp:effectExtent l="0" t="0" r="0" b="635"/>
             <wp:wrapTopAndBottom/>
             <wp:docPr id="81708121" name="Рисунок 3"/>
@@ -3291,7 +3291,7 @@
                   <pic:spPr bwMode="auto">
                     <a:xfrm>
                       <a:off x="0" y="0"/>
-                      <a:ext cx="6119495" cy="4323715"/>
+                      <a:ext cx="6118225" cy="4323715"/>
                     </a:xfrm>
                     <a:prstGeom prst="rect">
                       <a:avLst/>

</xml_diff>